<commit_message>
proposal v0.13: add plain-language and advisor brief editions
</commit_message>
<xml_diff>
--- a/deliverables/DeepAlign-Bench_正式研究Proposal.docx
+++ b/deliverables/DeepAlign-Bench_正式研究Proposal.docx
@@ -131,7 +131,7 @@
                 <w:color w:val="5B6B7A"/>
                 <w:sz w:val="21"/>
               </w:rPr>
-              <w:t>v0.12 · 组内讨论稿</w:t>
+              <w:t>v0.13 · 组内讨论稿</w:t>
             </w:r>
           </w:p>
         </w:tc>
@@ -189,7 +189,7 @@
                 <w:color w:val="5B6B7A"/>
                 <w:sz w:val="21"/>
               </w:rPr>
-              <w:t>2026 年 8 月 1 日</w:t>
+              <w:t>2026 年 8 月 2 日</w:t>
             </w:r>
           </w:p>
         </w:tc>
@@ -4829,8 +4829,9 @@
     </w:p>
     <w:p>
       <w:pPr>
-        <w:spacing w:before="80" w:after="160"/>
+        <w:spacing w:before="80" w:after="160" w:line="240" w:lineRule="auto"/>
         <w:ind w:left="360" w:right="216"/>
+        <w:jc w:val="left"/>
         <w:shd w:fill="EEF2F5"/>
       </w:pPr>
       <w:r>
@@ -7394,8 +7395,9 @@
     </w:p>
     <w:p>
       <w:pPr>
-        <w:spacing w:before="80" w:after="160"/>
+        <w:spacing w:before="80" w:after="160" w:line="240" w:lineRule="auto"/>
         <w:ind w:left="360" w:right="216"/>
+        <w:jc w:val="left"/>
         <w:shd w:fill="EEF2F5"/>
       </w:pPr>
       <w:r>
@@ -10380,7 +10382,7 @@
         <w:color w:val="5B6B7A"/>
         <w:sz w:val="18"/>
       </w:rPr>
-      <w:t xml:space="preserve">2026-08-01   ·   </w:t>
+      <w:t xml:space="preserve">2026-8-2   ·   </w:t>
     </w:r>
     <w:r>
       <w:rPr>
@@ -10413,7 +10415,7 @@
         <w:color w:val="5B6B7A"/>
         <w:sz w:val="18"/>
       </w:rPr>
-      <w:t xml:space="preserve">2026-08-01   ·   </w:t>
+      <w:t xml:space="preserve">2026-8-2   ·   </w:t>
     </w:r>
     <w:r>
       <w:rPr>
@@ -10446,7 +10448,7 @@
         <w:color w:val="5B6B7A"/>
         <w:sz w:val="18"/>
       </w:rPr>
-      <w:t xml:space="preserve">2026-08-01   ·   </w:t>
+      <w:t xml:space="preserve">2026-8-2   ·   </w:t>
     </w:r>
     <w:r>
       <w:rPr>

</xml_diff>

<commit_message>
proposal v0.14: add ten-page formal condensed edition
</commit_message>
<xml_diff>
--- a/deliverables/DeepAlign-Bench_正式研究Proposal.docx
+++ b/deliverables/DeepAlign-Bench_正式研究Proposal.docx
@@ -131,7 +131,7 @@
                 <w:color w:val="5B6B7A"/>
                 <w:sz w:val="21"/>
               </w:rPr>
-              <w:t>v0.13 · 组内讨论稿</w:t>
+              <w:t>v0.14 · 组内讨论稿</w:t>
             </w:r>
           </w:p>
         </w:tc>
@@ -790,7 +790,7 @@
         <w:drawing>
           <wp:inline xmlns:a="http://schemas.openxmlformats.org/drawingml/2006/main" xmlns:pic="http://schemas.openxmlformats.org/drawingml/2006/picture">
             <wp:extent cx="8732520" cy="4912042"/>
-            <wp:docPr id="1" name="Picture 1"/>
+            <wp:docPr id="1" name="Picture 1" descr="DeepAlign-Bench 研究流程：从五平面元数据、反事实任务族和跨 agent 运行，到 rubric compiler、分层 judge 与人评校准。" title="DeepAlign-Bench 研究设计"/>
             <wp:cNvGraphicFramePr>
               <a:graphicFrameLocks noChangeAspect="1"/>
             </wp:cNvGraphicFramePr>

</xml_diff>

<commit_message>
proposal v0.25: define paper figure and table blueprint
</commit_message>
<xml_diff>
--- a/deliverables/DeepAlign-Bench_正式研究Proposal.docx
+++ b/deliverables/DeepAlign-Bench_正式研究Proposal.docx
@@ -131,7 +131,7 @@
                 <w:color w:val="5B6B7A"/>
                 <w:sz w:val="21"/>
               </w:rPr>
-              <w:t>v0.24 · 组内讨论稿</w:t>
+              <w:t>v0.25 · 组内讨论稿</w:t>
             </w:r>
           </w:p>
         </w:tc>
@@ -189,7 +189,7 @@
                 <w:color w:val="5B6B7A"/>
                 <w:sz w:val="21"/>
               </w:rPr>
-              <w:t>2026 年 8 月 3 日</w:t>
+              <w:t>2026 年 8 月 4 日</w:t>
             </w:r>
           </w:p>
         </w:tc>
@@ -426,6 +426,22 @@
           <w:rFonts w:ascii="Calibri" w:hAnsi="Calibri" w:eastAsia="PingFang SC"/>
         </w:rPr>
         <w:t>里程碑、论文结构与最小可行版本</w:t>
+      </w:r>
+    </w:p>
+    <w:p>
+      <w:pPr>
+        <w:numPr>
+          <w:ilvl w:val="0"/>
+          <w:numId w:val="10"/>
+        </w:numPr>
+        <w:spacing w:after="100" w:line="290" w:lineRule="auto"/>
+        <w:ind w:left="540" w:hanging="279"/>
+      </w:pPr>
+      <w:r>
+        <w:rPr>
+          <w:rFonts w:ascii="Calibri" w:hAnsi="Calibri" w:eastAsia="PingFang SC"/>
+        </w:rPr>
+        <w:t>论文图表蓝图</w:t>
       </w:r>
     </w:p>
     <w:p>
@@ -17630,18 +17646,390 @@
         <w:pStyle w:val="Heading1"/>
       </w:pPr>
       <w:r>
+        <w:t>16. 论文图表规划：五张主图、四张主表</w:t>
+      </w:r>
+    </w:p>
+    <w:p>
+      <w:r>
+        <w:rPr>
+          <w:rFonts w:ascii="Calibri" w:hAnsi="Calibri" w:eastAsia="PingFang SC"/>
+        </w:rPr>
+        <w:t xml:space="preserve">图表必须围绕论文主张组织，而不是把 Atlas 的所有字段都画出来。两个月锁定版建议主文使用 </w:t>
+      </w:r>
+      <w:r>
+        <w:rPr>
+          <w:rFonts w:ascii="Calibri" w:hAnsi="Calibri" w:eastAsia="PingFang SC"/>
+          <w:b/>
+        </w:rPr>
+        <w:t>5 张图 + 4 张表</w:t>
+      </w:r>
+      <w:r>
+        <w:rPr>
+          <w:rFonts w:ascii="Calibri" w:hAnsi="Calibri" w:eastAsia="PingFang SC"/>
+        </w:rPr>
+        <w:t>；完整的 family、anchor、rubric、judge 和成本明细放入附录。每张主图只回答一个一级问题，结果图不预填理想趋势。</w:t>
+      </w:r>
+    </w:p>
+    <w:p>
+      <w:pPr>
+        <w:pStyle w:val="Heading2"/>
+      </w:pPr>
+      <w:r>
+        <w:t>16.1 主文五张图</w:t>
+      </w:r>
+    </w:p>
+    <w:p>
+      <w:r>
+        <w:rPr>
+          <w:rFonts w:ascii="Calibri" w:hAnsi="Calibri" w:eastAsia="PingFang SC"/>
+          <w:b/>
+        </w:rPr>
+        <w:t>Figure 1 · DeepAlign-Bench 总览：从用户信号到可审计的个性化效应。</w:t>
+      </w:r>
+      <w:r>
+        <w:rPr>
+          <w:rFonts w:ascii="Calibri" w:hAnsi="Calibri" w:eastAsia="PingFang SC"/>
+        </w:rPr>
+        <w:t xml:space="preserve"> 使用从左到右的五段流程：</w:t>
+      </w:r>
+      <w:r>
+        <w:rPr>
+          <w:rFonts w:ascii="Courier New" w:hAnsi="Courier New" w:eastAsia="PingFang SC"/>
+          <w:color w:val="6A3E00"/>
+          <w:sz w:val="20"/>
+        </w:rPr>
+        <w:t>Task/Evidence + paired user state</w:t>
+      </w:r>
+      <w:r>
+        <w:rPr>
+          <w:rFonts w:ascii="Calibri" w:hAnsi="Calibri" w:eastAsia="PingFang SC"/>
+        </w:rPr>
+        <w:t xml:space="preserve"> → </w:t>
+      </w:r>
+      <w:r>
+        <w:rPr>
+          <w:rFonts w:ascii="Courier New" w:hAnsi="Courier New" w:eastAsia="PingFang SC"/>
+          <w:color w:val="6A3E00"/>
+          <w:sz w:val="20"/>
+        </w:rPr>
+        <w:t>signal view + execution environment</w:t>
+      </w:r>
+      <w:r>
+        <w:rPr>
+          <w:rFonts w:ascii="Calibri" w:hAnsi="Calibri" w:eastAsia="PingFang SC"/>
+        </w:rPr>
+        <w:t xml:space="preserve"> → </w:t>
+      </w:r>
+      <w:r>
+        <w:rPr>
+          <w:rFonts w:ascii="Courier New" w:hAnsi="Courier New" w:eastAsia="PingFang SC"/>
+          <w:color w:val="6A3E00"/>
+          <w:sz w:val="20"/>
+        </w:rPr>
+        <w:t>agent system</w:t>
+      </w:r>
+      <w:r>
+        <w:rPr>
+          <w:rFonts w:ascii="Calibri" w:hAnsi="Calibri" w:eastAsia="PingFang SC"/>
+        </w:rPr>
+        <w:t xml:space="preserve"> → </w:t>
+      </w:r>
+      <w:r>
+        <w:rPr>
+          <w:rFonts w:ascii="Courier New" w:hAnsi="Courier New" w:eastAsia="PingFang SC"/>
+          <w:color w:val="6A3E00"/>
+          <w:sz w:val="20"/>
+        </w:rPr>
+        <w:t>matched/swapped artifacts</w:t>
+      </w:r>
+      <w:r>
+        <w:rPr>
+          <w:rFonts w:ascii="Calibri" w:hAnsi="Calibri" w:eastAsia="PingFang SC"/>
+        </w:rPr>
+        <w:t xml:space="preserve"> → </w:t>
+      </w:r>
+      <w:r>
+        <w:rPr>
+          <w:rFonts w:ascii="Courier New" w:hAnsi="Courier New" w:eastAsia="PingFang SC"/>
+          <w:color w:val="6A3E00"/>
+          <w:sz w:val="20"/>
+        </w:rPr>
+        <w:t>TQ/FR gate + CFA/contracts + four leaderboard profiles</w:t>
+      </w:r>
+      <w:r>
+        <w:rPr>
+          <w:rFonts w:ascii="Calibri" w:hAnsi="Calibri" w:eastAsia="PingFang SC"/>
+        </w:rPr>
+        <w:t>。Atlas 五个平面放在顶部作为 case 条件带，S0–S3 anchor stress 与 JudgeBench 放在底部作为两条验证支线。这张图回答“benchmark 整体如何运行”，不塞入所有 taxonomy 叶节点。</w:t>
+      </w:r>
+    </w:p>
+    <w:p>
+      <w:r>
+        <w:rPr>
+          <w:rFonts w:ascii="Calibri" w:hAnsi="Calibri" w:eastAsia="PingFang SC"/>
+          <w:b/>
+        </w:rPr>
+        <w:t>Figure 2 · 一个 counterfactual family 如何构造和评分。</w:t>
+      </w:r>
+      <w:r>
+        <w:rPr>
+          <w:rFonts w:ascii="Calibri" w:hAnsi="Calibri" w:eastAsia="PingFang SC"/>
+        </w:rPr>
+        <w:t xml:space="preserve"> 四个 panel：A 展示 Ua/Ub 的 invariant core 与 2–3 个 minimal user edits；B 展示同一 ledger 的 structured persona、natural history 和 clarification 三个语义等价 signal views；C 展示 </w:t>
+      </w:r>
+      <w:r>
+        <w:rPr>
+          <w:rFonts w:ascii="Courier New" w:hAnsi="Courier New" w:eastAsia="PingFang SC"/>
+          <w:color w:val="6A3E00"/>
+          <w:sz w:val="20"/>
+        </w:rPr>
+        <w:t>M[i,j] = PF_i(Y_j)</w:t>
+      </w:r>
+      <w:r>
+        <w:rPr>
+          <w:rFonts w:ascii="Calibri" w:hAnsi="Calibri" w:eastAsia="PingFang SC"/>
+        </w:rPr>
+        <w:t xml:space="preserve"> 的 2×2 交叉评分矩阵与 CFA；D 用一个具体 case 列出 must-change、must-hold、must-not 和 clarify-if-unknown。它把 persona 真值、输出变化和 estimand 直接连接起来，是方法部分最重要的细节图。</w:t>
+      </w:r>
+    </w:p>
+    <w:p>
+      <w:r>
+        <w:rPr>
+          <w:rFonts w:ascii="Calibri" w:hAnsi="Calibri" w:eastAsia="PingFang SC"/>
+          <w:b/>
+        </w:rPr>
+        <w:t>Figure 3 · 主结果：不同 agent 在什么任务上产生真实个性化价值。</w:t>
+      </w:r>
+      <w:r>
+        <w:rPr>
+          <w:rFonts w:ascii="Calibri" w:hAnsi="Calibri" w:eastAsia="PingFang SC"/>
+        </w:rPr>
+        <w:t xml:space="preserve"> 四个共享尺度的 panel：A 用 forest/dot plot 报各 agent 的 CFA 与 95% CI，并标记是否通过 TQ/FR gate；B 用 </w:t>
+      </w:r>
+      <w:r>
+        <w:rPr>
+          <w:rFonts w:ascii="Courier New" w:hAnsi="Courier New" w:eastAsia="PingFang SC"/>
+          <w:color w:val="6A3E00"/>
+          <w:sz w:val="20"/>
+        </w:rPr>
+        <w:t>agent × research intent</w:t>
+      </w:r>
+      <w:r>
+        <w:rPr>
+          <w:rFonts w:ascii="Calibri" w:hAnsi="Calibri" w:eastAsia="PingFang SC"/>
+        </w:rPr>
+        <w:t xml:space="preserve"> heatmap 报 CFA；C 用 </w:t>
+      </w:r>
+      <w:r>
+        <w:rPr>
+          <w:rFonts w:ascii="Courier New" w:hAnsi="Courier New" w:eastAsia="PingFang SC"/>
+          <w:color w:val="6A3E00"/>
+          <w:sz w:val="20"/>
+        </w:rPr>
+        <w:t>agent × task stratum</w:t>
+      </w:r>
+      <w:r>
+        <w:rPr>
+          <w:rFonts w:ascii="Calibri" w:hAnsi="Calibri" w:eastAsia="PingFang SC"/>
+        </w:rPr>
+        <w:t xml:space="preserve"> heatmap 报 worst-slice CFA 或 PF；D 用 cost–CFA 散点图报告效率前沿。不能用雷达图，也不能把所有指标平均成一个冠军分数。</w:t>
+      </w:r>
+    </w:p>
+    <w:p>
+      <w:r>
+        <w:rPr>
+          <w:rFonts w:ascii="Calibri" w:hAnsi="Calibri" w:eastAsia="PingFang SC"/>
+          <w:b/>
+        </w:rPr>
+        <w:t>Figure 4 · 信号渠道、压力和失败模式。</w:t>
+      </w:r>
+      <w:r>
+        <w:rPr>
+          <w:rFonts w:ascii="Calibri" w:hAnsi="Calibri" w:eastAsia="PingFang SC"/>
+        </w:rPr>
+        <w:t xml:space="preserve"> 四个 panel：A 比较 structured persona、natural history、clarification 和 workspace/history 的 Worst-view CFA 与 Cue Gap；B 按 S0–S3 绘制各 agent 的 CFA/retention dose-response 曲线；C 以“个性化结果风险 × observed failure mode”画归一化 heatmap，并单列 </w:t>
+      </w:r>
+      <w:r>
+        <w:rPr>
+          <w:rFonts w:ascii="Courier New" w:hAnsi="Courier New" w:eastAsia="PingFang SC"/>
+          <w:color w:val="6A3E00"/>
+          <w:sz w:val="20"/>
+        </w:rPr>
+        <w:t>other/emergent</w:t>
+      </w:r>
+      <w:r>
+        <w:rPr>
+          <w:rFonts w:ascii="Calibri" w:hAnsi="Calibri" w:eastAsia="PingFang SC"/>
+        </w:rPr>
+        <w:t>；D 报压力相对 clean 条件造成的 TQ、FR、MP 和隐私/权限 collateral damage。该图对应 Agent-SafetyBench 式失败分析，但分类对象是个性化结果风险与机制，不是 attack 类型。</w:t>
+      </w:r>
+    </w:p>
+    <w:p>
+      <w:r>
+        <w:rPr>
+          <w:rFonts w:ascii="Calibri" w:hAnsi="Calibri" w:eastAsia="PingFang SC"/>
+          <w:b/>
+        </w:rPr>
+        <w:t>Figure 5 · 自动评价是否可信：JudgeBench 与人类校准。</w:t>
+      </w:r>
+      <w:r>
+        <w:rPr>
+          <w:rFonts w:ascii="Calibri" w:hAnsi="Calibri" w:eastAsia="PingFang SC"/>
+        </w:rPr>
+        <w:t xml:space="preserve"> 四个 panel：A 按 rubric module 报 judge–human pairwise accuracy/α；B 画预测置信度与实际正确率的 calibration/reliability curve；C 报 A/B 顺序、长度、格式、persona 关键词和隐私诱饵造成的准确率变化；D 画“自动覆盖率—人工成本—错误率”级联曲线，并标出预注册主榜门槛。Judge 未过门槛时，本图应直接支持降级为人评，而不是隐藏失败。</w:t>
+      </w:r>
+    </w:p>
+    <w:p>
+      <w:pPr>
+        <w:pStyle w:val="Heading2"/>
+      </w:pPr>
+      <w:r>
+        <w:t>16.2 主文四张表</w:t>
+      </w:r>
+    </w:p>
+    <w:p>
+      <w:r>
+        <w:rPr>
+          <w:rFonts w:ascii="Calibri" w:hAnsi="Calibri" w:eastAsia="PingFang SC"/>
+          <w:b/>
+        </w:rPr>
+        <w:t>Table 1 · 与最近邻 benchmark 的定位比较。</w:t>
+      </w:r>
+      <w:r>
+        <w:rPr>
+          <w:rFonts w:ascii="Calibri" w:hAnsi="Calibri" w:eastAsia="PingFang SC"/>
+        </w:rPr>
+        <w:t xml:space="preserve"> 行为 PDR-Bench、ResearchRubrics、DeepResearch Bench、PersonaTrail/APeB、PASB 和 DeepAlign；列只保留与主张有关的 task-persona absolute fit、cross-user counterfactual、must-change/hold/not、multi-cue、longitudinal stress、multi-deliverable、human validity 和 judge calibration。避免用“大而全”的勾选表代替文字论证。</w:t>
+      </w:r>
+    </w:p>
+    <w:p>
+      <w:r>
+        <w:rPr>
+          <w:rFonts w:ascii="Calibri" w:hAnsi="Calibri" w:eastAsia="PingFang SC"/>
+          <w:b/>
+        </w:rPr>
+        <w:t>Table 2 · Benchmark composition 与 empirical coverage。</w:t>
+      </w:r>
+      <w:r>
+        <w:rPr>
+          <w:rFonts w:ascii="Calibri" w:hAnsi="Calibri" w:eastAsia="PingFang SC"/>
+        </w:rPr>
+        <w:t xml:space="preserve"> 按 task stratum、research intent、deliverable、signal channel、environment、agent mode、anchor 和 stakes 报 family/episode 数、用户对数和 </w:t>
+      </w:r>
+      <w:r>
+        <w:rPr>
+          <w:rFonts w:ascii="Courier New" w:hAnsi="Courier New" w:eastAsia="PingFang SC"/>
+          <w:color w:val="6A3E00"/>
+          <w:sz w:val="20"/>
+        </w:rPr>
+        <w:t>tested</w:t>
+      </w:r>
+      <w:r>
+        <w:rPr>
+          <w:rFonts w:ascii="Calibri" w:hAnsi="Calibri" w:eastAsia="PingFang SC"/>
+        </w:rPr>
+        <w:t xml:space="preserve"> 覆盖率；另列 defined-only、structurally-inapplicable 和 deferred 数量。它证明实际测了什么，不用 ontology 的理论分支数冒充样本量。</w:t>
+      </w:r>
+    </w:p>
+    <w:p>
+      <w:r>
+        <w:rPr>
+          <w:rFonts w:ascii="Calibri" w:hAnsi="Calibri" w:eastAsia="PingFang SC"/>
+          <w:b/>
+        </w:rPr>
+        <w:t>Table 3 · 主 leaderboard 数值表。</w:t>
+      </w:r>
+      <w:r>
+        <w:rPr>
+          <w:rFonts w:ascii="Calibri" w:hAnsi="Calibri" w:eastAsia="PingFang SC"/>
+        </w:rPr>
+        <w:t xml:space="preserve"> 每行是一个可比的 </w:t>
+      </w:r>
+      <w:r>
+        <w:rPr>
+          <w:rFonts w:ascii="Courier New" w:hAnsi="Courier New" w:eastAsia="PingFang SC"/>
+          <w:color w:val="6A3E00"/>
+          <w:sz w:val="20"/>
+        </w:rPr>
+        <w:t>agent × execution regime</w:t>
+      </w:r>
+      <w:r>
+        <w:rPr>
+          <w:rFonts w:ascii="Calibri" w:hAnsi="Calibri" w:eastAsia="PingFang SC"/>
+        </w:rPr>
+        <w:t>，列为 TQ、FR、PF、MP、CFA、Worst-view CFA、Neutral Invariance、cost 和 eligibility。E1/E2/E3 分块，商业产品榜与受控 harness 榜不混排；报告置信区间或标准误，而不是只报点估计。</w:t>
+      </w:r>
+    </w:p>
+    <w:p>
+      <w:r>
+        <w:rPr>
+          <w:rFonts w:ascii="Calibri" w:hAnsi="Calibri" w:eastAsia="PingFang SC"/>
+          <w:b/>
+        </w:rPr>
+        <w:t>Table 4 · 关键对照、消融与替代解释。</w:t>
+      </w:r>
+      <w:r>
+        <w:rPr>
+          <w:rFonts w:ascii="Calibri" w:hAnsi="Calibri" w:eastAsia="PingFang SC"/>
+        </w:rPr>
+        <w:t xml:space="preserve"> 行包括 task-only、matched persona、semantic-equivalent history、clarification、irrelevant cue、wrong-user swap、去掉 must-hold/must-not、只按长度/风格匹配和去掉 TQ gate；列为 ΔCFA、Specificity Precision/Recall、Neutral Invariance、TQ/FR、judge coverage 与主要解释。它用于证明结果不是“多给了上下文”“写得更长”或“复述 persona 关键词”。</w:t>
+      </w:r>
+    </w:p>
+    <w:p>
+      <w:pPr>
+        <w:pStyle w:val="Heading2"/>
+      </w:pPr>
+      <w:r>
+        <w:t>16.3 附录图表与版面规则</w:t>
+      </w:r>
+    </w:p>
+    <w:p>
+      <w:r>
+        <w:rPr>
+          <w:rFonts w:ascii="Calibri" w:hAnsi="Calibri" w:eastAsia="PingFang SC"/>
+        </w:rPr>
+        <w:t xml:space="preserve">附录建议保留：逐 family CFA forest plot、完整 </w:t>
+      </w:r>
+      <w:r>
+        <w:rPr>
+          <w:rFonts w:ascii="Courier New" w:hAnsi="Courier New" w:eastAsia="PingFang SC"/>
+          <w:color w:val="6A3E00"/>
+          <w:sz w:val="20"/>
+        </w:rPr>
+        <w:t>3 strata × 6 intents × deliverable</w:t>
+      </w:r>
+      <w:r>
+        <w:rPr>
+          <w:rFonts w:ascii="Calibri" w:hAnsi="Calibri" w:eastAsia="PingFang SC"/>
+        </w:rPr>
+        <w:t xml:space="preserve"> coverage heatmap、八个 anchor 的独立 S0–S3 曲线、clarification value/turn、retention/update 曲线、各语言/用户群切片，以及 judge confusion matrix。附录表应给出 24 个 family、48 个 user-task、persona compatibility gate、rubric leaf bank、agent/version/tool metadata、完整结果、成本、失败案例和人工标注一致性。</w:t>
+      </w:r>
+    </w:p>
+    <w:p>
+      <w:r>
+        <w:rPr>
+          <w:rFonts w:ascii="Calibri" w:hAnsi="Calibri" w:eastAsia="PingFang SC"/>
+        </w:rPr>
+        <w:t>主文结果图统一使用共享坐标、95% CI、样本数和 gate 标记；同一颜色始终代表同一 agent，线型或形状代表 signal/stress 条件。不要使用 3D 图、面积难比较的 sunburst、没有不确定性的柱状榜、把多指标压成一条折线的雷达图，或把 expected 与 observed failure 混在同一标签中。若版面不足，优先保留 Figures 1–3、5 和 Tables 2–4；Figure 4 的逐 anchor 细节移入附录，但不能删掉 JudgeBench 的测量效度证据。</w:t>
+      </w:r>
+    </w:p>
+    <w:p>
+      <w:pPr>
+        <w:pStyle w:val="Heading1"/>
+      </w:pPr>
+      <w:r>
         <w:t>参考文献</w:t>
       </w:r>
     </w:p>
     <w:p>
       <w:pPr>
-        <w:spacing w:after="40" w:line="252" w:lineRule="auto"/>
+        <w:spacing w:after="0" w:line="228" w:lineRule="auto"/>
         <w:ind w:left="360" w:hanging="360"/>
       </w:pPr>
       <w:r>
         <w:rPr>
           <w:rFonts w:ascii="Calibri" w:hAnsi="Calibri" w:eastAsia="PingFang SC"/>
-          <w:sz w:val="18"/>
+          <w:sz w:val="17"/>
         </w:rPr>
         <w:t xml:space="preserve">[1] OpenCompass Team. </w:t>
       </w:r>
@@ -17649,14 +18037,14 @@
         <w:rPr>
           <w:rFonts w:ascii="Calibri" w:hAnsi="Calibri" w:eastAsia="PingFang SC"/>
           <w:i/>
-          <w:sz w:val="18"/>
+          <w:sz w:val="17"/>
         </w:rPr>
         <w:t>OpenCompass: A Universal Evaluation Platform for Large Language Models</w:t>
       </w:r>
       <w:r>
         <w:rPr>
           <w:rFonts w:ascii="Calibri" w:hAnsi="Calibri" w:eastAsia="PingFang SC"/>
-          <w:sz w:val="18"/>
+          <w:sz w:val="17"/>
         </w:rPr>
         <w:t xml:space="preserve">. arXiv:2605.19276, 2026. </w:t>
       </w:r>
@@ -17666,8 +18054,8 @@
             <w:rFonts w:ascii="Calibri" w:hAnsi="Calibri" w:eastAsia="PingFang SC"/>
             <w:color w:val="2E74B5"/>
             <w:u w:val="single"/>
-            <w:sz w:val="18"/>
-            <w:szCs w:val="18"/>
+            <w:sz w:val="17"/>
+            <w:szCs w:val="17"/>
           </w:rPr>
           <w:t>https://arxiv.org/abs/2605.19276</w:t>
         </w:r>
@@ -17675,13 +18063,13 @@
     </w:p>
     <w:p>
       <w:pPr>
-        <w:spacing w:after="40" w:line="252" w:lineRule="auto"/>
+        <w:spacing w:after="0" w:line="228" w:lineRule="auto"/>
         <w:ind w:left="360" w:hanging="360"/>
       </w:pPr>
       <w:r>
         <w:rPr>
           <w:rFonts w:ascii="Calibri" w:hAnsi="Calibri" w:eastAsia="PingFang SC"/>
-          <w:sz w:val="18"/>
+          <w:sz w:val="17"/>
         </w:rPr>
         <w:t xml:space="preserve">[2] ModelScope. </w:t>
       </w:r>
@@ -17689,14 +18077,14 @@
         <w:rPr>
           <w:rFonts w:ascii="Calibri" w:hAnsi="Calibri" w:eastAsia="PingFang SC"/>
           <w:i/>
-          <w:sz w:val="18"/>
+          <w:sz w:val="17"/>
         </w:rPr>
         <w:t>EvalScope Introduction</w:t>
       </w:r>
       <w:r>
         <w:rPr>
           <w:rFonts w:ascii="Calibri" w:hAnsi="Calibri" w:eastAsia="PingFang SC"/>
-          <w:sz w:val="18"/>
+          <w:sz w:val="17"/>
         </w:rPr>
         <w:t xml:space="preserve">. </w:t>
       </w:r>
@@ -17706,8 +18094,8 @@
             <w:rFonts w:ascii="Calibri" w:hAnsi="Calibri" w:eastAsia="PingFang SC"/>
             <w:color w:val="2E74B5"/>
             <w:u w:val="single"/>
-            <w:sz w:val="18"/>
-            <w:szCs w:val="18"/>
+            <w:sz w:val="17"/>
+            <w:szCs w:val="17"/>
           </w:rPr>
           <w:t>https://evalscope.readthedocs.io/en/refact_readme/get_started/introduction.html</w:t>
         </w:r>
@@ -17715,13 +18103,13 @@
     </w:p>
     <w:p>
       <w:pPr>
-        <w:spacing w:after="40" w:line="252" w:lineRule="auto"/>
+        <w:spacing w:after="0" w:line="228" w:lineRule="auto"/>
         <w:ind w:left="360" w:hanging="360"/>
       </w:pPr>
       <w:r>
         <w:rPr>
           <w:rFonts w:ascii="Calibri" w:hAnsi="Calibri" w:eastAsia="PingFang SC"/>
-          <w:sz w:val="18"/>
+          <w:sz w:val="17"/>
         </w:rPr>
         <w:t xml:space="preserve">[3] Zhang et al. </w:t>
       </w:r>
@@ -17729,14 +18117,14 @@
         <w:rPr>
           <w:rFonts w:ascii="Calibri" w:hAnsi="Calibri" w:eastAsia="PingFang SC"/>
           <w:i/>
-          <w:sz w:val="18"/>
+          <w:sz w:val="17"/>
         </w:rPr>
         <w:t>Agent-SafetyBench: Evaluating the Safety of LLM Agents</w:t>
       </w:r>
       <w:r>
         <w:rPr>
           <w:rFonts w:ascii="Calibri" w:hAnsi="Calibri" w:eastAsia="PingFang SC"/>
-          <w:sz w:val="18"/>
+          <w:sz w:val="17"/>
         </w:rPr>
         <w:t xml:space="preserve">. arXiv:2412.14470, 2024/2025. </w:t>
       </w:r>
@@ -17746,8 +18134,8 @@
             <w:rFonts w:ascii="Calibri" w:hAnsi="Calibri" w:eastAsia="PingFang SC"/>
             <w:color w:val="2E74B5"/>
             <w:u w:val="single"/>
-            <w:sz w:val="18"/>
-            <w:szCs w:val="18"/>
+            <w:sz w:val="17"/>
+            <w:szCs w:val="17"/>
           </w:rPr>
           <w:t>https://arxiv.org/abs/2412.14470</w:t>
         </w:r>
@@ -17755,13 +18143,13 @@
     </w:p>
     <w:p>
       <w:pPr>
-        <w:spacing w:after="40" w:line="252" w:lineRule="auto"/>
+        <w:spacing w:after="0" w:line="228" w:lineRule="auto"/>
         <w:ind w:left="360" w:hanging="360"/>
       </w:pPr>
       <w:r>
         <w:rPr>
           <w:rFonts w:ascii="Calibri" w:hAnsi="Calibri" w:eastAsia="PingFang SC"/>
-          <w:sz w:val="18"/>
+          <w:sz w:val="17"/>
         </w:rPr>
         <w:t xml:space="preserve">[4] </w:t>
       </w:r>
@@ -17769,14 +18157,14 @@
         <w:rPr>
           <w:rFonts w:ascii="Calibri" w:hAnsi="Calibri" w:eastAsia="PingFang SC"/>
           <w:i/>
-          <w:sz w:val="18"/>
+          <w:sz w:val="17"/>
         </w:rPr>
         <w:t>Towards Personalized Deep Research: Benchmarks and Evaluations</w:t>
       </w:r>
       <w:r>
         <w:rPr>
           <w:rFonts w:ascii="Calibri" w:hAnsi="Calibri" w:eastAsia="PingFang SC"/>
-          <w:sz w:val="18"/>
+          <w:sz w:val="17"/>
         </w:rPr>
         <w:t xml:space="preserve">. arXiv:2509.25106; ICLR 2026. </w:t>
       </w:r>
@@ -17786,8 +18174,8 @@
             <w:rFonts w:ascii="Calibri" w:hAnsi="Calibri" w:eastAsia="PingFang SC"/>
             <w:color w:val="2E74B5"/>
             <w:u w:val="single"/>
-            <w:sz w:val="18"/>
-            <w:szCs w:val="18"/>
+            <w:sz w:val="17"/>
+            <w:szCs w:val="17"/>
           </w:rPr>
           <w:t>https://arxiv.org/abs/2509.25106</w:t>
         </w:r>
@@ -17795,13 +18183,13 @@
     </w:p>
     <w:p>
       <w:pPr>
-        <w:spacing w:after="40" w:line="252" w:lineRule="auto"/>
+        <w:spacing w:after="0" w:line="228" w:lineRule="auto"/>
         <w:ind w:left="360" w:hanging="360"/>
       </w:pPr>
       <w:r>
         <w:rPr>
           <w:rFonts w:ascii="Calibri" w:hAnsi="Calibri" w:eastAsia="PingFang SC"/>
-          <w:sz w:val="18"/>
+          <w:sz w:val="17"/>
         </w:rPr>
         <w:t xml:space="preserve">[5] Mind Lab. </w:t>
       </w:r>
@@ -17809,14 +18197,14 @@
         <w:rPr>
           <w:rFonts w:ascii="Calibri" w:hAnsi="Calibri" w:eastAsia="PingFang SC"/>
           <w:i/>
-          <w:sz w:val="18"/>
+          <w:sz w:val="17"/>
         </w:rPr>
         <w:t>Macaron-V1-Preview: LivingBench</w:t>
       </w:r>
       <w:r>
         <w:rPr>
           <w:rFonts w:ascii="Calibri" w:hAnsi="Calibri" w:eastAsia="PingFang SC"/>
-          <w:sz w:val="18"/>
+          <w:sz w:val="17"/>
         </w:rPr>
         <w:t xml:space="preserve">. </w:t>
       </w:r>
@@ -17826,8 +18214,8 @@
             <w:rFonts w:ascii="Calibri" w:hAnsi="Calibri" w:eastAsia="PingFang SC"/>
             <w:color w:val="2E74B5"/>
             <w:u w:val="single"/>
-            <w:sz w:val="18"/>
-            <w:szCs w:val="18"/>
+            <w:sz w:val="17"/>
+            <w:szCs w:val="17"/>
           </w:rPr>
           <w:t>https://macaron.im/mindlab/research/macaron-v1-preview</w:t>
         </w:r>
@@ -17835,13 +18223,13 @@
     </w:p>
     <w:p>
       <w:pPr>
-        <w:spacing w:after="40" w:line="252" w:lineRule="auto"/>
+        <w:spacing w:after="0" w:line="228" w:lineRule="auto"/>
         <w:ind w:left="360" w:hanging="360"/>
       </w:pPr>
       <w:r>
         <w:rPr>
           <w:rFonts w:ascii="Calibri" w:hAnsi="Calibri" w:eastAsia="PingFang SC"/>
-          <w:sz w:val="18"/>
+          <w:sz w:val="17"/>
         </w:rPr>
         <w:t xml:space="preserve">[6] Du et al. </w:t>
       </w:r>
@@ -17849,14 +18237,14 @@
         <w:rPr>
           <w:rFonts w:ascii="Calibri" w:hAnsi="Calibri" w:eastAsia="PingFang SC"/>
           <w:i/>
-          <w:sz w:val="18"/>
+          <w:sz w:val="17"/>
         </w:rPr>
         <w:t>DeepResearch Bench: A Comprehensive Benchmark for Deep Research Agents</w:t>
       </w:r>
       <w:r>
         <w:rPr>
           <w:rFonts w:ascii="Calibri" w:hAnsi="Calibri" w:eastAsia="PingFang SC"/>
-          <w:sz w:val="18"/>
+          <w:sz w:val="17"/>
         </w:rPr>
         <w:t xml:space="preserve">. arXiv:2506.11763. </w:t>
       </w:r>
@@ -17866,8 +18254,8 @@
             <w:rFonts w:ascii="Calibri" w:hAnsi="Calibri" w:eastAsia="PingFang SC"/>
             <w:color w:val="2E74B5"/>
             <w:u w:val="single"/>
-            <w:sz w:val="18"/>
-            <w:szCs w:val="18"/>
+            <w:sz w:val="17"/>
+            <w:szCs w:val="17"/>
           </w:rPr>
           <w:t>https://arxiv.org/abs/2506.11763</w:t>
         </w:r>
@@ -17875,13 +18263,13 @@
     </w:p>
     <w:p>
       <w:pPr>
-        <w:spacing w:after="40" w:line="252" w:lineRule="auto"/>
+        <w:spacing w:after="0" w:line="228" w:lineRule="auto"/>
         <w:ind w:left="360" w:hanging="360"/>
       </w:pPr>
       <w:r>
         <w:rPr>
           <w:rFonts w:ascii="Calibri" w:hAnsi="Calibri" w:eastAsia="PingFang SC"/>
-          <w:sz w:val="18"/>
+          <w:sz w:val="17"/>
         </w:rPr>
         <w:t xml:space="preserve">[7] Gou et al. </w:t>
       </w:r>
@@ -17889,14 +18277,14 @@
         <w:rPr>
           <w:rFonts w:ascii="Calibri" w:hAnsi="Calibri" w:eastAsia="PingFang SC"/>
           <w:i/>
-          <w:sz w:val="18"/>
+          <w:sz w:val="17"/>
         </w:rPr>
         <w:t>Mind2Web 2: Evaluating Agentic Search with Agent-as-a-Judge</w:t>
       </w:r>
       <w:r>
         <w:rPr>
           <w:rFonts w:ascii="Calibri" w:hAnsi="Calibri" w:eastAsia="PingFang SC"/>
-          <w:sz w:val="18"/>
+          <w:sz w:val="17"/>
         </w:rPr>
         <w:t xml:space="preserve">. arXiv:2506.21506. </w:t>
       </w:r>
@@ -17906,8 +18294,8 @@
             <w:rFonts w:ascii="Calibri" w:hAnsi="Calibri" w:eastAsia="PingFang SC"/>
             <w:color w:val="2E74B5"/>
             <w:u w:val="single"/>
-            <w:sz w:val="18"/>
-            <w:szCs w:val="18"/>
+            <w:sz w:val="17"/>
+            <w:szCs w:val="17"/>
           </w:rPr>
           <w:t>https://arxiv.org/abs/2506.21506</w:t>
         </w:r>
@@ -17915,13 +18303,13 @@
     </w:p>
     <w:p>
       <w:pPr>
-        <w:spacing w:after="40" w:line="252" w:lineRule="auto"/>
+        <w:spacing w:after="0" w:line="228" w:lineRule="auto"/>
         <w:ind w:left="360" w:hanging="360"/>
       </w:pPr>
       <w:r>
         <w:rPr>
           <w:rFonts w:ascii="Calibri" w:hAnsi="Calibri" w:eastAsia="PingFang SC"/>
-          <w:sz w:val="18"/>
+          <w:sz w:val="17"/>
         </w:rPr>
         <w:t xml:space="preserve">[8] Chen et al. </w:t>
       </w:r>
@@ -17929,14 +18317,14 @@
         <w:rPr>
           <w:rFonts w:ascii="Calibri" w:hAnsi="Calibri" w:eastAsia="PingFang SC"/>
           <w:i/>
-          <w:sz w:val="18"/>
+          <w:sz w:val="17"/>
         </w:rPr>
         <w:t>BrowseComp-Plus: A More Fair and Transparent Evaluation Benchmark of Deep-Research Agent</w:t>
       </w:r>
       <w:r>
         <w:rPr>
           <w:rFonts w:ascii="Calibri" w:hAnsi="Calibri" w:eastAsia="PingFang SC"/>
-          <w:sz w:val="18"/>
+          <w:sz w:val="17"/>
         </w:rPr>
         <w:t xml:space="preserve">. arXiv:2508.06600. </w:t>
       </w:r>
@@ -17946,8 +18334,8 @@
             <w:rFonts w:ascii="Calibri" w:hAnsi="Calibri" w:eastAsia="PingFang SC"/>
             <w:color w:val="2E74B5"/>
             <w:u w:val="single"/>
-            <w:sz w:val="18"/>
-            <w:szCs w:val="18"/>
+            <w:sz w:val="17"/>
+            <w:szCs w:val="17"/>
           </w:rPr>
           <w:t>https://arxiv.org/abs/2508.06600</w:t>
         </w:r>
@@ -17955,13 +18343,13 @@
     </w:p>
     <w:p>
       <w:pPr>
-        <w:spacing w:after="40" w:line="252" w:lineRule="auto"/>
+        <w:spacing w:after="0" w:line="228" w:lineRule="auto"/>
         <w:ind w:left="360" w:hanging="360"/>
       </w:pPr>
       <w:r>
         <w:rPr>
           <w:rFonts w:ascii="Calibri" w:hAnsi="Calibri" w:eastAsia="PingFang SC"/>
-          <w:sz w:val="18"/>
+          <w:sz w:val="17"/>
         </w:rPr>
         <w:t xml:space="preserve">[9] Starace et al. </w:t>
       </w:r>
@@ -17969,14 +18357,14 @@
         <w:rPr>
           <w:rFonts w:ascii="Calibri" w:hAnsi="Calibri" w:eastAsia="PingFang SC"/>
           <w:i/>
-          <w:sz w:val="18"/>
+          <w:sz w:val="17"/>
         </w:rPr>
         <w:t>PaperBench: Evaluating AI’s Ability to Replicate AI Research</w:t>
       </w:r>
       <w:r>
         <w:rPr>
           <w:rFonts w:ascii="Calibri" w:hAnsi="Calibri" w:eastAsia="PingFang SC"/>
-          <w:sz w:val="18"/>
+          <w:sz w:val="17"/>
         </w:rPr>
         <w:t xml:space="preserve">. OpenAI, 2025. </w:t>
       </w:r>
@@ -17986,8 +18374,8 @@
             <w:rFonts w:ascii="Calibri" w:hAnsi="Calibri" w:eastAsia="PingFang SC"/>
             <w:color w:val="2E74B5"/>
             <w:u w:val="single"/>
-            <w:sz w:val="18"/>
-            <w:szCs w:val="18"/>
+            <w:sz w:val="17"/>
+            <w:szCs w:val="17"/>
           </w:rPr>
           <w:t>https://openai.com/index/paperbench/</w:t>
         </w:r>
@@ -17995,13 +18383,13 @@
     </w:p>
     <w:p>
       <w:pPr>
-        <w:spacing w:after="40" w:line="252" w:lineRule="auto"/>
+        <w:spacing w:after="0" w:line="228" w:lineRule="auto"/>
         <w:ind w:left="360" w:hanging="360"/>
       </w:pPr>
       <w:r>
         <w:rPr>
           <w:rFonts w:ascii="Calibri" w:hAnsi="Calibri" w:eastAsia="PingFang SC"/>
-          <w:sz w:val="18"/>
+          <w:sz w:val="17"/>
         </w:rPr>
         <w:t xml:space="preserve">[10] Wang et al. </w:t>
       </w:r>
@@ -18009,14 +18397,14 @@
         <w:rPr>
           <w:rFonts w:ascii="Calibri" w:hAnsi="Calibri" w:eastAsia="PingFang SC"/>
           <w:i/>
-          <w:sz w:val="18"/>
+          <w:sz w:val="17"/>
         </w:rPr>
         <w:t>LiveResearchBench: A Live Benchmark for User-Centric Deep Research in the Wild</w:t>
       </w:r>
       <w:r>
         <w:rPr>
           <w:rFonts w:ascii="Calibri" w:hAnsi="Calibri" w:eastAsia="PingFang SC"/>
-          <w:sz w:val="18"/>
+          <w:sz w:val="17"/>
         </w:rPr>
         <w:t xml:space="preserve">. </w:t>
       </w:r>
@@ -18026,8 +18414,8 @@
             <w:rFonts w:ascii="Calibri" w:hAnsi="Calibri" w:eastAsia="PingFang SC"/>
             <w:color w:val="2E74B5"/>
             <w:u w:val="single"/>
-            <w:sz w:val="18"/>
-            <w:szCs w:val="18"/>
+            <w:sz w:val="17"/>
+            <w:szCs w:val="17"/>
           </w:rPr>
           <w:t>https://livedeepresearch.github.io/</w:t>
         </w:r>
@@ -18035,13 +18423,13 @@
     </w:p>
     <w:p>
       <w:pPr>
-        <w:spacing w:after="40" w:line="252" w:lineRule="auto"/>
+        <w:spacing w:after="0" w:line="228" w:lineRule="auto"/>
         <w:ind w:left="360" w:hanging="360"/>
       </w:pPr>
       <w:r>
         <w:rPr>
           <w:rFonts w:ascii="Calibri" w:hAnsi="Calibri" w:eastAsia="PingFang SC"/>
-          <w:sz w:val="18"/>
+          <w:sz w:val="17"/>
         </w:rPr>
         <w:t xml:space="preserve">[11] Coelho et al. </w:t>
       </w:r>
@@ -18049,14 +18437,14 @@
         <w:rPr>
           <w:rFonts w:ascii="Calibri" w:hAnsi="Calibri" w:eastAsia="PingFang SC"/>
           <w:i/>
-          <w:sz w:val="18"/>
+          <w:sz w:val="17"/>
         </w:rPr>
         <w:t>DeepResearchGym: A Free, Transparent, and Reproducible Evaluation Sandbox for Deep Research</w:t>
       </w:r>
       <w:r>
         <w:rPr>
           <w:rFonts w:ascii="Calibri" w:hAnsi="Calibri" w:eastAsia="PingFang SC"/>
-          <w:sz w:val="18"/>
+          <w:sz w:val="17"/>
         </w:rPr>
         <w:t xml:space="preserve">. arXiv:2505.19253. </w:t>
       </w:r>
@@ -18066,8 +18454,8 @@
             <w:rFonts w:ascii="Calibri" w:hAnsi="Calibri" w:eastAsia="PingFang SC"/>
             <w:color w:val="2E74B5"/>
             <w:u w:val="single"/>
-            <w:sz w:val="18"/>
-            <w:szCs w:val="18"/>
+            <w:sz w:val="17"/>
+            <w:szCs w:val="17"/>
           </w:rPr>
           <w:t>https://arxiv.org/abs/2505.19253</w:t>
         </w:r>
@@ -18075,13 +18463,13 @@
     </w:p>
     <w:p>
       <w:pPr>
-        <w:spacing w:after="40" w:line="252" w:lineRule="auto"/>
+        <w:spacing w:after="0" w:line="228" w:lineRule="auto"/>
         <w:ind w:left="360" w:hanging="360"/>
       </w:pPr>
       <w:r>
         <w:rPr>
           <w:rFonts w:ascii="Calibri" w:hAnsi="Calibri" w:eastAsia="PingFang SC"/>
-          <w:sz w:val="18"/>
+          <w:sz w:val="17"/>
         </w:rPr>
         <w:t xml:space="preserve">[12] Abaskohi et al. </w:t>
       </w:r>
@@ -18089,14 +18477,14 @@
         <w:rPr>
           <w:rFonts w:ascii="Calibri" w:hAnsi="Calibri" w:eastAsia="PingFang SC"/>
           <w:i/>
-          <w:sz w:val="18"/>
+          <w:sz w:val="17"/>
         </w:rPr>
         <w:t>DRBench: A Realistic Benchmark for Enterprise Deep Research</w:t>
       </w:r>
       <w:r>
         <w:rPr>
           <w:rFonts w:ascii="Calibri" w:hAnsi="Calibri" w:eastAsia="PingFang SC"/>
-          <w:sz w:val="18"/>
+          <w:sz w:val="17"/>
         </w:rPr>
         <w:t xml:space="preserve">. arXiv:2510.00172; ICLR 2026. </w:t>
       </w:r>
@@ -18106,8 +18494,8 @@
             <w:rFonts w:ascii="Calibri" w:hAnsi="Calibri" w:eastAsia="PingFang SC"/>
             <w:color w:val="2E74B5"/>
             <w:u w:val="single"/>
-            <w:sz w:val="18"/>
-            <w:szCs w:val="18"/>
+            <w:sz w:val="17"/>
+            <w:szCs w:val="17"/>
           </w:rPr>
           <w:t>https://arxiv.org/abs/2510.00172</w:t>
         </w:r>
@@ -18115,13 +18503,13 @@
     </w:p>
     <w:p>
       <w:pPr>
-        <w:spacing w:after="40" w:line="252" w:lineRule="auto"/>
+        <w:spacing w:after="0" w:line="228" w:lineRule="auto"/>
         <w:ind w:left="360" w:hanging="360"/>
       </w:pPr>
       <w:r>
         <w:rPr>
           <w:rFonts w:ascii="Calibri" w:hAnsi="Calibri" w:eastAsia="PingFang SC"/>
-          <w:sz w:val="18"/>
+          <w:sz w:val="17"/>
         </w:rPr>
         <w:t xml:space="preserve">[13] White et al. </w:t>
       </w:r>
@@ -18129,14 +18517,14 @@
         <w:rPr>
           <w:rFonts w:ascii="Calibri" w:hAnsi="Calibri" w:eastAsia="PingFang SC"/>
           <w:i/>
-          <w:sz w:val="18"/>
+          <w:sz w:val="17"/>
         </w:rPr>
         <w:t>LiveBench: A Challenging, Contamination-Free LLM Benchmark</w:t>
       </w:r>
       <w:r>
         <w:rPr>
           <w:rFonts w:ascii="Calibri" w:hAnsi="Calibri" w:eastAsia="PingFang SC"/>
-          <w:sz w:val="18"/>
+          <w:sz w:val="17"/>
         </w:rPr>
         <w:t xml:space="preserve">. ICLR 2025. </w:t>
       </w:r>
@@ -18146,8 +18534,8 @@
             <w:rFonts w:ascii="Calibri" w:hAnsi="Calibri" w:eastAsia="PingFang SC"/>
             <w:color w:val="2E74B5"/>
             <w:u w:val="single"/>
-            <w:sz w:val="18"/>
-            <w:szCs w:val="18"/>
+            <w:sz w:val="17"/>
+            <w:szCs w:val="17"/>
           </w:rPr>
           <w:t>https://livebench.ai/</w:t>
         </w:r>
@@ -18155,13 +18543,13 @@
     </w:p>
     <w:p>
       <w:pPr>
-        <w:spacing w:after="40" w:line="252" w:lineRule="auto"/>
+        <w:spacing w:after="0" w:line="228" w:lineRule="auto"/>
         <w:ind w:left="360" w:hanging="360"/>
       </w:pPr>
       <w:r>
         <w:rPr>
           <w:rFonts w:ascii="Calibri" w:hAnsi="Calibri" w:eastAsia="PingFang SC"/>
-          <w:sz w:val="18"/>
+          <w:sz w:val="17"/>
         </w:rPr>
         <w:t xml:space="preserve">[14] Zhu et al. </w:t>
       </w:r>
@@ -18169,14 +18557,14 @@
         <w:rPr>
           <w:rFonts w:ascii="Calibri" w:hAnsi="Calibri" w:eastAsia="PingFang SC"/>
           <w:i/>
-          <w:sz w:val="18"/>
+          <w:sz w:val="17"/>
         </w:rPr>
         <w:t>JudgeLM: Fine-tuned Large Language Models are Scalable Judges</w:t>
       </w:r>
       <w:r>
         <w:rPr>
           <w:rFonts w:ascii="Calibri" w:hAnsi="Calibri" w:eastAsia="PingFang SC"/>
-          <w:sz w:val="18"/>
+          <w:sz w:val="17"/>
         </w:rPr>
         <w:t xml:space="preserve">. arXiv:2310.17631, 2023. </w:t>
       </w:r>
@@ -18186,8 +18574,8 @@
             <w:rFonts w:ascii="Calibri" w:hAnsi="Calibri" w:eastAsia="PingFang SC"/>
             <w:color w:val="2E74B5"/>
             <w:u w:val="single"/>
-            <w:sz w:val="18"/>
-            <w:szCs w:val="18"/>
+            <w:sz w:val="17"/>
+            <w:szCs w:val="17"/>
           </w:rPr>
           <w:t>https://arxiv.org/abs/2310.17631</w:t>
         </w:r>
@@ -18195,13 +18583,13 @@
     </w:p>
     <w:p>
       <w:pPr>
-        <w:spacing w:after="40" w:line="252" w:lineRule="auto"/>
+        <w:spacing w:after="0" w:line="228" w:lineRule="auto"/>
         <w:ind w:left="360" w:hanging="360"/>
       </w:pPr>
       <w:r>
         <w:rPr>
           <w:rFonts w:ascii="Calibri" w:hAnsi="Calibri" w:eastAsia="PingFang SC"/>
-          <w:sz w:val="18"/>
+          <w:sz w:val="17"/>
         </w:rPr>
         <w:t xml:space="preserve">[15] Kim et al. </w:t>
       </w:r>
@@ -18209,14 +18597,14 @@
         <w:rPr>
           <w:rFonts w:ascii="Calibri" w:hAnsi="Calibri" w:eastAsia="PingFang SC"/>
           <w:i/>
-          <w:sz w:val="18"/>
+          <w:sz w:val="17"/>
         </w:rPr>
         <w:t>Prometheus 2: An Open Source Language Model Specialized in Evaluating Other Language Models</w:t>
       </w:r>
       <w:r>
         <w:rPr>
           <w:rFonts w:ascii="Calibri" w:hAnsi="Calibri" w:eastAsia="PingFang SC"/>
-          <w:sz w:val="18"/>
+          <w:sz w:val="17"/>
         </w:rPr>
         <w:t xml:space="preserve">. arXiv:2405.01535, 2024. </w:t>
       </w:r>
@@ -18226,8 +18614,8 @@
             <w:rFonts w:ascii="Calibri" w:hAnsi="Calibri" w:eastAsia="PingFang SC"/>
             <w:color w:val="2E74B5"/>
             <w:u w:val="single"/>
-            <w:sz w:val="18"/>
-            <w:szCs w:val="18"/>
+            <w:sz w:val="17"/>
+            <w:szCs w:val="17"/>
           </w:rPr>
           <w:t>https://arxiv.org/abs/2405.01535</w:t>
         </w:r>
@@ -18235,13 +18623,13 @@
     </w:p>
     <w:p>
       <w:pPr>
-        <w:spacing w:after="40" w:line="252" w:lineRule="auto"/>
+        <w:spacing w:after="0" w:line="228" w:lineRule="auto"/>
         <w:ind w:left="360" w:hanging="360"/>
       </w:pPr>
       <w:r>
         <w:rPr>
           <w:rFonts w:ascii="Calibri" w:hAnsi="Calibri" w:eastAsia="PingFang SC"/>
-          <w:sz w:val="18"/>
+          <w:sz w:val="17"/>
         </w:rPr>
         <w:t xml:space="preserve">[16] Huang et al. </w:t>
       </w:r>
@@ -18249,14 +18637,14 @@
         <w:rPr>
           <w:rFonts w:ascii="Calibri" w:hAnsi="Calibri" w:eastAsia="PingFang SC"/>
           <w:i/>
-          <w:sz w:val="18"/>
+          <w:sz w:val="17"/>
         </w:rPr>
         <w:t>An Empirical Study of LLM-as-a-Judge for LLM Evaluation: Fine-tuned Judge Model is not a General Substitute for GPT-4</w:t>
       </w:r>
       <w:r>
         <w:rPr>
           <w:rFonts w:ascii="Calibri" w:hAnsi="Calibri" w:eastAsia="PingFang SC"/>
-          <w:sz w:val="18"/>
+          <w:sz w:val="17"/>
         </w:rPr>
         <w:t xml:space="preserve">. arXiv:2403.02839, 2024. </w:t>
       </w:r>
@@ -18266,8 +18654,8 @@
             <w:rFonts w:ascii="Calibri" w:hAnsi="Calibri" w:eastAsia="PingFang SC"/>
             <w:color w:val="2E74B5"/>
             <w:u w:val="single"/>
-            <w:sz w:val="18"/>
-            <w:szCs w:val="18"/>
+            <w:sz w:val="17"/>
+            <w:szCs w:val="17"/>
           </w:rPr>
           <w:t>https://arxiv.org/abs/2403.02839</w:t>
         </w:r>
@@ -18275,13 +18663,13 @@
     </w:p>
     <w:p>
       <w:pPr>
-        <w:spacing w:after="40" w:line="252" w:lineRule="auto"/>
+        <w:spacing w:after="0" w:line="228" w:lineRule="auto"/>
         <w:ind w:left="360" w:hanging="360"/>
       </w:pPr>
       <w:r>
         <w:rPr>
           <w:rFonts w:ascii="Calibri" w:hAnsi="Calibri" w:eastAsia="PingFang SC"/>
-          <w:sz w:val="18"/>
+          <w:sz w:val="17"/>
         </w:rPr>
         <w:t xml:space="preserve">[17] Java et al. </w:t>
       </w:r>
@@ -18289,14 +18677,14 @@
         <w:rPr>
           <w:rFonts w:ascii="Calibri" w:hAnsi="Calibri" w:eastAsia="PingFang SC"/>
           <w:i/>
-          <w:sz w:val="18"/>
+          <w:sz w:val="17"/>
         </w:rPr>
         <w:t>Characterizing Deep Research: A Benchmark and Formal Definition</w:t>
       </w:r>
       <w:r>
         <w:rPr>
           <w:rFonts w:ascii="Calibri" w:hAnsi="Calibri" w:eastAsia="PingFang SC"/>
-          <w:sz w:val="18"/>
+          <w:sz w:val="17"/>
         </w:rPr>
         <w:t xml:space="preserve">. arXiv:2508.04183; ICLR 2026. </w:t>
       </w:r>
@@ -18306,8 +18694,8 @@
             <w:rFonts w:ascii="Calibri" w:hAnsi="Calibri" w:eastAsia="PingFang SC"/>
             <w:color w:val="2E74B5"/>
             <w:u w:val="single"/>
-            <w:sz w:val="18"/>
-            <w:szCs w:val="18"/>
+            <w:sz w:val="17"/>
+            <w:szCs w:val="17"/>
           </w:rPr>
           <w:t>https://arxiv.org/abs/2508.04183</w:t>
         </w:r>
@@ -18315,13 +18703,13 @@
     </w:p>
     <w:p>
       <w:pPr>
-        <w:spacing w:after="40" w:line="252" w:lineRule="auto"/>
+        <w:spacing w:after="0" w:line="228" w:lineRule="auto"/>
         <w:ind w:left="360" w:hanging="360"/>
       </w:pPr>
       <w:r>
         <w:rPr>
           <w:rFonts w:ascii="Calibri" w:hAnsi="Calibri" w:eastAsia="PingFang SC"/>
-          <w:sz w:val="18"/>
+          <w:sz w:val="17"/>
         </w:rPr>
         <w:t xml:space="preserve">[18] Sharma et al. </w:t>
       </w:r>
@@ -18329,14 +18717,14 @@
         <w:rPr>
           <w:rFonts w:ascii="Calibri" w:hAnsi="Calibri" w:eastAsia="PingFang SC"/>
           <w:i/>
-          <w:sz w:val="18"/>
+          <w:sz w:val="17"/>
         </w:rPr>
         <w:t>ResearchRubrics: A Benchmark of Prompts and Rubrics for Evaluating Deep Research Agents</w:t>
       </w:r>
       <w:r>
         <w:rPr>
           <w:rFonts w:ascii="Calibri" w:hAnsi="Calibri" w:eastAsia="PingFang SC"/>
-          <w:sz w:val="18"/>
+          <w:sz w:val="17"/>
         </w:rPr>
         <w:t xml:space="preserve">. arXiv:2511.07685; ICLR 2026. </w:t>
       </w:r>
@@ -18346,8 +18734,8 @@
             <w:rFonts w:ascii="Calibri" w:hAnsi="Calibri" w:eastAsia="PingFang SC"/>
             <w:color w:val="2E74B5"/>
             <w:u w:val="single"/>
-            <w:sz w:val="18"/>
-            <w:szCs w:val="18"/>
+            <w:sz w:val="17"/>
+            <w:szCs w:val="17"/>
           </w:rPr>
           <w:t>https://arxiv.org/abs/2511.07685</w:t>
         </w:r>
@@ -18355,13 +18743,13 @@
     </w:p>
     <w:p>
       <w:pPr>
-        <w:spacing w:after="40" w:line="252" w:lineRule="auto"/>
+        <w:spacing w:after="0" w:line="228" w:lineRule="auto"/>
         <w:ind w:left="360" w:hanging="360"/>
       </w:pPr>
       <w:r>
         <w:rPr>
           <w:rFonts w:ascii="Calibri" w:hAnsi="Calibri" w:eastAsia="PingFang SC"/>
-          <w:sz w:val="18"/>
+          <w:sz w:val="17"/>
         </w:rPr>
         <w:t xml:space="preserve">[19] Yoran et al. </w:t>
       </w:r>
@@ -18369,14 +18757,14 @@
         <w:rPr>
           <w:rFonts w:ascii="Calibri" w:hAnsi="Calibri" w:eastAsia="PingFang SC"/>
           <w:i/>
-          <w:sz w:val="18"/>
+          <w:sz w:val="17"/>
         </w:rPr>
         <w:t>AssistantBench: Can Web Agents Solve Realistic and Time-Consuming Tasks?</w:t>
       </w:r>
       <w:r>
         <w:rPr>
           <w:rFonts w:ascii="Calibri" w:hAnsi="Calibri" w:eastAsia="PingFang SC"/>
-          <w:sz w:val="18"/>
+          <w:sz w:val="17"/>
         </w:rPr>
         <w:t xml:space="preserve"> arXiv:2407.15711, 2024. </w:t>
       </w:r>
@@ -18386,8 +18774,8 @@
             <w:rFonts w:ascii="Calibri" w:hAnsi="Calibri" w:eastAsia="PingFang SC"/>
             <w:color w:val="2E74B5"/>
             <w:u w:val="single"/>
-            <w:sz w:val="18"/>
-            <w:szCs w:val="18"/>
+            <w:sz w:val="17"/>
+            <w:szCs w:val="17"/>
           </w:rPr>
           <w:t>https://arxiv.org/abs/2407.15711</w:t>
         </w:r>
@@ -18395,13 +18783,13 @@
     </w:p>
     <w:p>
       <w:pPr>
-        <w:spacing w:after="40" w:line="252" w:lineRule="auto"/>
+        <w:spacing w:after="0" w:line="228" w:lineRule="auto"/>
         <w:ind w:left="360" w:hanging="360"/>
       </w:pPr>
       <w:r>
         <w:rPr>
           <w:rFonts w:ascii="Calibri" w:hAnsi="Calibri" w:eastAsia="PingFang SC"/>
-          <w:sz w:val="18"/>
+          <w:sz w:val="17"/>
         </w:rPr>
         <w:t xml:space="preserve">[20] Rosset et al. </w:t>
       </w:r>
@@ -18409,14 +18797,14 @@
         <w:rPr>
           <w:rFonts w:ascii="Calibri" w:hAnsi="Calibri" w:eastAsia="PingFang SC"/>
           <w:i/>
-          <w:sz w:val="18"/>
+          <w:sz w:val="17"/>
         </w:rPr>
         <w:t>Researchy Questions: A Dataset of Multi-Perspective, Decompositional Questions for LLM Web Agents</w:t>
       </w:r>
       <w:r>
         <w:rPr>
           <w:rFonts w:ascii="Calibri" w:hAnsi="Calibri" w:eastAsia="PingFang SC"/>
-          <w:sz w:val="18"/>
+          <w:sz w:val="17"/>
         </w:rPr>
         <w:t xml:space="preserve">. arXiv:2402.17896, 2024. </w:t>
       </w:r>
@@ -18426,8 +18814,8 @@
             <w:rFonts w:ascii="Calibri" w:hAnsi="Calibri" w:eastAsia="PingFang SC"/>
             <w:color w:val="2E74B5"/>
             <w:u w:val="single"/>
-            <w:sz w:val="18"/>
-            <w:szCs w:val="18"/>
+            <w:sz w:val="17"/>
+            <w:szCs w:val="17"/>
           </w:rPr>
           <w:t>https://arxiv.org/abs/2402.17896</w:t>
         </w:r>
@@ -18435,13 +18823,13 @@
     </w:p>
     <w:p>
       <w:pPr>
-        <w:spacing w:after="40" w:line="252" w:lineRule="auto"/>
+        <w:spacing w:after="0" w:line="228" w:lineRule="auto"/>
         <w:ind w:left="360" w:hanging="360"/>
       </w:pPr>
       <w:r>
         <w:rPr>
           <w:rFonts w:ascii="Calibri" w:hAnsi="Calibri" w:eastAsia="PingFang SC"/>
-          <w:sz w:val="18"/>
+          <w:sz w:val="17"/>
         </w:rPr>
         <w:t xml:space="preserve">[21] Xu et al. </w:t>
       </w:r>
@@ -18449,14 +18837,14 @@
         <w:rPr>
           <w:rFonts w:ascii="Calibri" w:hAnsi="Calibri" w:eastAsia="PingFang SC"/>
           <w:i/>
-          <w:sz w:val="18"/>
+          <w:sz w:val="17"/>
         </w:rPr>
         <w:t>ResearcherBench: Evaluating Deep AI Research Systems on the Frontiers of Scientific Inquiry</w:t>
       </w:r>
       <w:r>
         <w:rPr>
           <w:rFonts w:ascii="Calibri" w:hAnsi="Calibri" w:eastAsia="PingFang SC"/>
-          <w:sz w:val="18"/>
+          <w:sz w:val="17"/>
         </w:rPr>
         <w:t xml:space="preserve">. arXiv:2507.16280, 2025. </w:t>
       </w:r>
@@ -18466,8 +18854,8 @@
             <w:rFonts w:ascii="Calibri" w:hAnsi="Calibri" w:eastAsia="PingFang SC"/>
             <w:color w:val="2E74B5"/>
             <w:u w:val="single"/>
-            <w:sz w:val="18"/>
-            <w:szCs w:val="18"/>
+            <w:sz w:val="17"/>
+            <w:szCs w:val="17"/>
           </w:rPr>
           <w:t>https://arxiv.org/abs/2507.16280</w:t>
         </w:r>
@@ -18475,13 +18863,13 @@
     </w:p>
     <w:p>
       <w:pPr>
-        <w:spacing w:after="40" w:line="252" w:lineRule="auto"/>
+        <w:spacing w:after="0" w:line="228" w:lineRule="auto"/>
         <w:ind w:left="360" w:hanging="360"/>
       </w:pPr>
       <w:r>
         <w:rPr>
           <w:rFonts w:ascii="Calibri" w:hAnsi="Calibri" w:eastAsia="PingFang SC"/>
-          <w:sz w:val="18"/>
+          <w:sz w:val="17"/>
         </w:rPr>
         <w:t xml:space="preserve">[22] Liang et al. </w:t>
       </w:r>
@@ -18489,14 +18877,14 @@
         <w:rPr>
           <w:rFonts w:ascii="Calibri" w:hAnsi="Calibri" w:eastAsia="PingFang SC"/>
           <w:i/>
-          <w:sz w:val="18"/>
+          <w:sz w:val="17"/>
         </w:rPr>
         <w:t>Holistic Evaluation of Language Models</w:t>
       </w:r>
       <w:r>
         <w:rPr>
           <w:rFonts w:ascii="Calibri" w:hAnsi="Calibri" w:eastAsia="PingFang SC"/>
-          <w:sz w:val="18"/>
+          <w:sz w:val="17"/>
         </w:rPr>
         <w:t xml:space="preserve">. TMLR, 2023. </w:t>
       </w:r>
@@ -18506,8 +18894,8 @@
             <w:rFonts w:ascii="Calibri" w:hAnsi="Calibri" w:eastAsia="PingFang SC"/>
             <w:color w:val="2E74B5"/>
             <w:u w:val="single"/>
-            <w:sz w:val="18"/>
-            <w:szCs w:val="18"/>
+            <w:sz w:val="17"/>
+            <w:szCs w:val="17"/>
           </w:rPr>
           <w:t>https://arxiv.org/abs/2211.09110</w:t>
         </w:r>
@@ -18515,13 +18903,13 @@
     </w:p>
     <w:p>
       <w:pPr>
-        <w:spacing w:after="40" w:line="252" w:lineRule="auto"/>
+        <w:spacing w:after="0" w:line="228" w:lineRule="auto"/>
         <w:ind w:left="360" w:hanging="360"/>
       </w:pPr>
       <w:r>
         <w:rPr>
           <w:rFonts w:ascii="Calibri" w:hAnsi="Calibri" w:eastAsia="PingFang SC"/>
-          <w:sz w:val="18"/>
+          <w:sz w:val="17"/>
         </w:rPr>
         <w:t xml:space="preserve">[23] Ribeiro et al. </w:t>
       </w:r>
@@ -18529,14 +18917,14 @@
         <w:rPr>
           <w:rFonts w:ascii="Calibri" w:hAnsi="Calibri" w:eastAsia="PingFang SC"/>
           <w:i/>
-          <w:sz w:val="18"/>
+          <w:sz w:val="17"/>
         </w:rPr>
         <w:t>Beyond Accuracy: Behavioral Testing of NLP Models with CheckList</w:t>
       </w:r>
       <w:r>
         <w:rPr>
           <w:rFonts w:ascii="Calibri" w:hAnsi="Calibri" w:eastAsia="PingFang SC"/>
-          <w:sz w:val="18"/>
+          <w:sz w:val="17"/>
         </w:rPr>
         <w:t xml:space="preserve">. ACL, 2020. </w:t>
       </w:r>
@@ -18546,8 +18934,8 @@
             <w:rFonts w:ascii="Calibri" w:hAnsi="Calibri" w:eastAsia="PingFang SC"/>
             <w:color w:val="2E74B5"/>
             <w:u w:val="single"/>
-            <w:sz w:val="18"/>
-            <w:szCs w:val="18"/>
+            <w:sz w:val="17"/>
+            <w:szCs w:val="17"/>
           </w:rPr>
           <w:t>https://aclanthology.org/2020.acl-main.442/</w:t>
         </w:r>
@@ -18555,13 +18943,13 @@
     </w:p>
     <w:p>
       <w:pPr>
-        <w:spacing w:after="40" w:line="252" w:lineRule="auto"/>
+        <w:spacing w:after="0" w:line="228" w:lineRule="auto"/>
         <w:ind w:left="360" w:hanging="360"/>
       </w:pPr>
       <w:r>
         <w:rPr>
           <w:rFonts w:ascii="Calibri" w:hAnsi="Calibri" w:eastAsia="PingFang SC"/>
-          <w:sz w:val="18"/>
+          <w:sz w:val="17"/>
         </w:rPr>
         <w:t xml:space="preserve">[24] Reuel et al. </w:t>
       </w:r>
@@ -18569,14 +18957,14 @@
         <w:rPr>
           <w:rFonts w:ascii="Calibri" w:hAnsi="Calibri" w:eastAsia="PingFang SC"/>
           <w:i/>
-          <w:sz w:val="18"/>
+          <w:sz w:val="17"/>
         </w:rPr>
         <w:t>BetterBench: Assessing AI Benchmarks, Uncovering Issues, and Establishing Best Practices</w:t>
       </w:r>
       <w:r>
         <w:rPr>
           <w:rFonts w:ascii="Calibri" w:hAnsi="Calibri" w:eastAsia="PingFang SC"/>
-          <w:sz w:val="18"/>
+          <w:sz w:val="17"/>
         </w:rPr>
         <w:t xml:space="preserve">. arXiv:2411.12990, 2024. </w:t>
       </w:r>
@@ -18586,8 +18974,8 @@
             <w:rFonts w:ascii="Calibri" w:hAnsi="Calibri" w:eastAsia="PingFang SC"/>
             <w:color w:val="2E74B5"/>
             <w:u w:val="single"/>
-            <w:sz w:val="18"/>
-            <w:szCs w:val="18"/>
+            <w:sz w:val="17"/>
+            <w:szCs w:val="17"/>
           </w:rPr>
           <w:t>https://arxiv.org/abs/2411.12990</w:t>
         </w:r>
@@ -18595,13 +18983,13 @@
     </w:p>
     <w:p>
       <w:pPr>
-        <w:spacing w:after="40" w:line="252" w:lineRule="auto"/>
+        <w:spacing w:after="0" w:line="228" w:lineRule="auto"/>
         <w:ind w:left="360" w:hanging="360"/>
       </w:pPr>
       <w:r>
         <w:rPr>
           <w:rFonts w:ascii="Calibri" w:hAnsi="Calibri" w:eastAsia="PingFang SC"/>
-          <w:sz w:val="18"/>
+          <w:sz w:val="17"/>
         </w:rPr>
         <w:t xml:space="preserve">[25] Sokol et al. </w:t>
       </w:r>
@@ -18609,14 +18997,14 @@
         <w:rPr>
           <w:rFonts w:ascii="Calibri" w:hAnsi="Calibri" w:eastAsia="PingFang SC"/>
           <w:i/>
-          <w:sz w:val="18"/>
+          <w:sz w:val="17"/>
         </w:rPr>
         <w:t>BenchmarkCards: Standardized Documentation for Large Language Model Benchmarks</w:t>
       </w:r>
       <w:r>
         <w:rPr>
           <w:rFonts w:ascii="Calibri" w:hAnsi="Calibri" w:eastAsia="PingFang SC"/>
-          <w:sz w:val="18"/>
+          <w:sz w:val="17"/>
         </w:rPr>
         <w:t xml:space="preserve">. NeurIPS Datasets and Benchmarks, 2025. </w:t>
       </w:r>
@@ -18626,8 +19014,8 @@
             <w:rFonts w:ascii="Calibri" w:hAnsi="Calibri" w:eastAsia="PingFang SC"/>
             <w:color w:val="2E74B5"/>
             <w:u w:val="single"/>
-            <w:sz w:val="18"/>
-            <w:szCs w:val="18"/>
+            <w:sz w:val="17"/>
+            <w:szCs w:val="17"/>
           </w:rPr>
           <w:t>https://papers.neurips.cc/paper_files/paper/2025/hash/76175f4355e2f67cf91be468c8860070-Abstract-Datasets_and_Benchmarks_Track.html</w:t>
         </w:r>
@@ -18635,13 +19023,13 @@
     </w:p>
     <w:p>
       <w:pPr>
-        <w:spacing w:after="40" w:line="252" w:lineRule="auto"/>
+        <w:spacing w:after="0" w:line="228" w:lineRule="auto"/>
         <w:ind w:left="360" w:hanging="360"/>
       </w:pPr>
       <w:r>
         <w:rPr>
           <w:rFonts w:ascii="Calibri" w:hAnsi="Calibri" w:eastAsia="PingFang SC"/>
-          <w:sz w:val="18"/>
+          <w:sz w:val="17"/>
         </w:rPr>
         <w:t xml:space="preserve">[26] Zeng et al. </w:t>
       </w:r>
@@ -18649,14 +19037,14 @@
         <w:rPr>
           <w:rFonts w:ascii="Calibri" w:hAnsi="Calibri" w:eastAsia="PingFang SC"/>
           <w:i/>
-          <w:sz w:val="18"/>
+          <w:sz w:val="17"/>
         </w:rPr>
         <w:t>Setoka: A Benchmark for Hierarchical User Understanding in Personalized Agents over Heterogeneous Data</w:t>
       </w:r>
       <w:r>
         <w:rPr>
           <w:rFonts w:ascii="Calibri" w:hAnsi="Calibri" w:eastAsia="PingFang SC"/>
-          <w:sz w:val="18"/>
+          <w:sz w:val="17"/>
         </w:rPr>
         <w:t xml:space="preserve">. arXiv:2607.27056, 2026. </w:t>
       </w:r>
@@ -18666,8 +19054,8 @@
             <w:rFonts w:ascii="Calibri" w:hAnsi="Calibri" w:eastAsia="PingFang SC"/>
             <w:color w:val="2E74B5"/>
             <w:u w:val="single"/>
-            <w:sz w:val="18"/>
-            <w:szCs w:val="18"/>
+            <w:sz w:val="17"/>
+            <w:szCs w:val="17"/>
           </w:rPr>
           <w:t>https://arxiv.org/abs/2607.27056</w:t>
         </w:r>
@@ -18675,13 +19063,13 @@
     </w:p>
     <w:p>
       <w:pPr>
-        <w:spacing w:after="40" w:line="252" w:lineRule="auto"/>
+        <w:spacing w:after="0" w:line="228" w:lineRule="auto"/>
         <w:ind w:left="360" w:hanging="360"/>
       </w:pPr>
       <w:r>
         <w:rPr>
           <w:rFonts w:ascii="Calibri" w:hAnsi="Calibri" w:eastAsia="PingFang SC"/>
-          <w:sz w:val="18"/>
+          <w:sz w:val="17"/>
         </w:rPr>
         <w:t xml:space="preserve">[27] Qian et al. </w:t>
       </w:r>
@@ -18689,14 +19077,14 @@
         <w:rPr>
           <w:rFonts w:ascii="Calibri" w:hAnsi="Calibri" w:eastAsia="PingFang SC"/>
           <w:i/>
-          <w:sz w:val="18"/>
+          <w:sz w:val="17"/>
         </w:rPr>
         <w:t>Toward User-Conditioned Evaluation of Personal LLM Agents under Temporal Interventions</w:t>
       </w:r>
       <w:r>
         <w:rPr>
           <w:rFonts w:ascii="Calibri" w:hAnsi="Calibri" w:eastAsia="PingFang SC"/>
-          <w:sz w:val="18"/>
+          <w:sz w:val="17"/>
         </w:rPr>
         <w:t xml:space="preserve">. arXiv:2607.21635, 2026. </w:t>
       </w:r>
@@ -18706,8 +19094,8 @@
             <w:rFonts w:ascii="Calibri" w:hAnsi="Calibri" w:eastAsia="PingFang SC"/>
             <w:color w:val="2E74B5"/>
             <w:u w:val="single"/>
-            <w:sz w:val="18"/>
-            <w:szCs w:val="18"/>
+            <w:sz w:val="17"/>
+            <w:szCs w:val="17"/>
           </w:rPr>
           <w:t>https://arxiv.org/abs/2607.21635</w:t>
         </w:r>
@@ -18715,13 +19103,13 @@
     </w:p>
     <w:p>
       <w:pPr>
-        <w:spacing w:after="40" w:line="252" w:lineRule="auto"/>
+        <w:spacing w:after="0" w:line="228" w:lineRule="auto"/>
         <w:ind w:left="360" w:hanging="360"/>
       </w:pPr>
       <w:r>
         <w:rPr>
           <w:rFonts w:ascii="Calibri" w:hAnsi="Calibri" w:eastAsia="PingFang SC"/>
-          <w:sz w:val="18"/>
+          <w:sz w:val="17"/>
         </w:rPr>
         <w:t xml:space="preserve">[28] Yang et al. </w:t>
       </w:r>
@@ -18729,14 +19117,14 @@
         <w:rPr>
           <w:rFonts w:ascii="Calibri" w:hAnsi="Calibri" w:eastAsia="PingFang SC"/>
           <w:i/>
-          <w:sz w:val="18"/>
+          <w:sz w:val="17"/>
         </w:rPr>
         <w:t>PersonaTrail: Benchmarking Personalized Web Agents through Browsing Trails</w:t>
       </w:r>
       <w:r>
         <w:rPr>
           <w:rFonts w:ascii="Calibri" w:hAnsi="Calibri" w:eastAsia="PingFang SC"/>
-          <w:sz w:val="18"/>
+          <w:sz w:val="17"/>
         </w:rPr>
         <w:t xml:space="preserve">. arXiv:2607.20482, 2026. </w:t>
       </w:r>
@@ -18746,8 +19134,8 @@
             <w:rFonts w:ascii="Calibri" w:hAnsi="Calibri" w:eastAsia="PingFang SC"/>
             <w:color w:val="2E74B5"/>
             <w:u w:val="single"/>
-            <w:sz w:val="18"/>
-            <w:szCs w:val="18"/>
+            <w:sz w:val="17"/>
+            <w:szCs w:val="17"/>
           </w:rPr>
           <w:t>https://arxiv.org/abs/2607.20482</w:t>
         </w:r>
@@ -18755,13 +19143,13 @@
     </w:p>
     <w:p>
       <w:pPr>
-        <w:spacing w:after="40" w:line="252" w:lineRule="auto"/>
+        <w:spacing w:after="0" w:line="228" w:lineRule="auto"/>
         <w:ind w:left="360" w:hanging="360"/>
       </w:pPr>
       <w:r>
         <w:rPr>
           <w:rFonts w:ascii="Calibri" w:hAnsi="Calibri" w:eastAsia="PingFang SC"/>
-          <w:sz w:val="18"/>
+          <w:sz w:val="17"/>
         </w:rPr>
         <w:t xml:space="preserve">[29] Todisco et al. </w:t>
       </w:r>
@@ -18769,14 +19157,14 @@
         <w:rPr>
           <w:rFonts w:ascii="Calibri" w:hAnsi="Calibri" w:eastAsia="PingFang SC"/>
           <w:i/>
-          <w:sz w:val="18"/>
+          <w:sz w:val="17"/>
         </w:rPr>
         <w:t>TARS: A Theory-of-Mind Agent for Personalized In-IDE Code Comprehension</w:t>
       </w:r>
       <w:r>
         <w:rPr>
           <w:rFonts w:ascii="Calibri" w:hAnsi="Calibri" w:eastAsia="PingFang SC"/>
-          <w:sz w:val="18"/>
+          <w:sz w:val="17"/>
         </w:rPr>
         <w:t xml:space="preserve">. arXiv:2607.15948, 2026. </w:t>
       </w:r>
@@ -18786,8 +19174,8 @@
             <w:rFonts w:ascii="Calibri" w:hAnsi="Calibri" w:eastAsia="PingFang SC"/>
             <w:color w:val="2E74B5"/>
             <w:u w:val="single"/>
-            <w:sz w:val="18"/>
-            <w:szCs w:val="18"/>
+            <w:sz w:val="17"/>
+            <w:szCs w:val="17"/>
           </w:rPr>
           <w:t>https://arxiv.org/abs/2607.15948</w:t>
         </w:r>
@@ -18795,13 +19183,13 @@
     </w:p>
     <w:p>
       <w:pPr>
-        <w:spacing w:after="40" w:line="252" w:lineRule="auto"/>
+        <w:spacing w:after="0" w:line="228" w:lineRule="auto"/>
         <w:ind w:left="360" w:hanging="360"/>
       </w:pPr>
       <w:r>
         <w:rPr>
           <w:rFonts w:ascii="Calibri" w:hAnsi="Calibri" w:eastAsia="PingFang SC"/>
-          <w:sz w:val="18"/>
+          <w:sz w:val="17"/>
         </w:rPr>
         <w:t xml:space="preserve">[30] Yang. </w:t>
       </w:r>
@@ -18809,14 +19197,14 @@
         <w:rPr>
           <w:rFonts w:ascii="Calibri" w:hAnsi="Calibri" w:eastAsia="PingFang SC"/>
           <w:i/>
-          <w:sz w:val="18"/>
+          <w:sz w:val="17"/>
         </w:rPr>
         <w:t>Self-Aware Recursively Self-Improving Agents for Personal Singularity</w:t>
       </w:r>
       <w:r>
         <w:rPr>
           <w:rFonts w:ascii="Calibri" w:hAnsi="Calibri" w:eastAsia="PingFang SC"/>
-          <w:sz w:val="18"/>
+          <w:sz w:val="17"/>
         </w:rPr>
         <w:t xml:space="preserve">. arXiv:2607.12254, 2026. </w:t>
       </w:r>
@@ -18826,8 +19214,8 @@
             <w:rFonts w:ascii="Calibri" w:hAnsi="Calibri" w:eastAsia="PingFang SC"/>
             <w:color w:val="2E74B5"/>
             <w:u w:val="single"/>
-            <w:sz w:val="18"/>
-            <w:szCs w:val="18"/>
+            <w:sz w:val="17"/>
+            <w:szCs w:val="17"/>
           </w:rPr>
           <w:t>https://arxiv.org/abs/2607.12254</w:t>
         </w:r>
@@ -18835,13 +19223,13 @@
     </w:p>
     <w:p>
       <w:pPr>
-        <w:spacing w:after="40" w:line="252" w:lineRule="auto"/>
+        <w:spacing w:after="0" w:line="228" w:lineRule="auto"/>
         <w:ind w:left="360" w:hanging="360"/>
       </w:pPr>
       <w:r>
         <w:rPr>
           <w:rFonts w:ascii="Calibri" w:hAnsi="Calibri" w:eastAsia="PingFang SC"/>
-          <w:sz w:val="18"/>
+          <w:sz w:val="17"/>
         </w:rPr>
         <w:t xml:space="preserve">[31] Mao et al. </w:t>
       </w:r>
@@ -18849,14 +19237,14 @@
         <w:rPr>
           <w:rFonts w:ascii="Calibri" w:hAnsi="Calibri" w:eastAsia="PingFang SC"/>
           <w:i/>
-          <w:sz w:val="18"/>
+          <w:sz w:val="17"/>
         </w:rPr>
         <w:t>Agents Don't Just Agree, They Remember: Benchmarking Persistent Sycophancy in Stateful Personal Agents</w:t>
       </w:r>
       <w:r>
         <w:rPr>
           <w:rFonts w:ascii="Calibri" w:hAnsi="Calibri" w:eastAsia="PingFang SC"/>
-          <w:sz w:val="18"/>
+          <w:sz w:val="17"/>
         </w:rPr>
         <w:t xml:space="preserve">. arXiv:2607.10526, 2026. </w:t>
       </w:r>
@@ -18866,8 +19254,8 @@
             <w:rFonts w:ascii="Calibri" w:hAnsi="Calibri" w:eastAsia="PingFang SC"/>
             <w:color w:val="2E74B5"/>
             <w:u w:val="single"/>
-            <w:sz w:val="18"/>
-            <w:szCs w:val="18"/>
+            <w:sz w:val="17"/>
+            <w:szCs w:val="17"/>
           </w:rPr>
           <w:t>https://arxiv.org/abs/2607.10526</w:t>
         </w:r>
@@ -18875,13 +19263,13 @@
     </w:p>
     <w:p>
       <w:pPr>
-        <w:spacing w:after="40" w:line="252" w:lineRule="auto"/>
+        <w:spacing w:after="0" w:line="228" w:lineRule="auto"/>
         <w:ind w:left="360" w:hanging="360"/>
       </w:pPr>
       <w:r>
         <w:rPr>
           <w:rFonts w:ascii="Calibri" w:hAnsi="Calibri" w:eastAsia="PingFang SC"/>
-          <w:sz w:val="18"/>
+          <w:sz w:val="17"/>
         </w:rPr>
         <w:t xml:space="preserve">[32] Yang et al. </w:t>
       </w:r>
@@ -18889,14 +19277,14 @@
         <w:rPr>
           <w:rFonts w:ascii="Calibri" w:hAnsi="Calibri" w:eastAsia="PingFang SC"/>
           <w:i/>
-          <w:sz w:val="18"/>
+          <w:sz w:val="17"/>
         </w:rPr>
         <w:t>APeB: Benchmarking Personalization Ability of Large Language Model Agents</w:t>
       </w:r>
       <w:r>
         <w:rPr>
           <w:rFonts w:ascii="Calibri" w:hAnsi="Calibri" w:eastAsia="PingFang SC"/>
-          <w:sz w:val="18"/>
+          <w:sz w:val="17"/>
         </w:rPr>
         <w:t xml:space="preserve">. arXiv:2607.03162, 2026. </w:t>
       </w:r>
@@ -18906,8 +19294,8 @@
             <w:rFonts w:ascii="Calibri" w:hAnsi="Calibri" w:eastAsia="PingFang SC"/>
             <w:color w:val="2E74B5"/>
             <w:u w:val="single"/>
-            <w:sz w:val="18"/>
-            <w:szCs w:val="18"/>
+            <w:sz w:val="17"/>
+            <w:szCs w:val="17"/>
           </w:rPr>
           <w:t>https://arxiv.org/abs/2607.03162</w:t>
         </w:r>
@@ -18915,13 +19303,13 @@
     </w:p>
     <w:p>
       <w:pPr>
-        <w:spacing w:after="40" w:line="252" w:lineRule="auto"/>
+        <w:spacing w:after="0" w:line="228" w:lineRule="auto"/>
         <w:ind w:left="360" w:hanging="360"/>
       </w:pPr>
       <w:r>
         <w:rPr>
           <w:rFonts w:ascii="Calibri" w:hAnsi="Calibri" w:eastAsia="PingFang SC"/>
-          <w:sz w:val="18"/>
+          <w:sz w:val="17"/>
         </w:rPr>
         <w:t xml:space="preserve">[33] Salemi et al. </w:t>
       </w:r>
@@ -18929,14 +19317,14 @@
         <w:rPr>
           <w:rFonts w:ascii="Calibri" w:hAnsi="Calibri" w:eastAsia="PingFang SC"/>
           <w:i/>
-          <w:sz w:val="18"/>
+          <w:sz w:val="17"/>
         </w:rPr>
         <w:t>LaMP: When Large Language Models Meet Personalization</w:t>
       </w:r>
       <w:r>
         <w:rPr>
           <w:rFonts w:ascii="Calibri" w:hAnsi="Calibri" w:eastAsia="PingFang SC"/>
-          <w:sz w:val="18"/>
+          <w:sz w:val="17"/>
         </w:rPr>
         <w:t xml:space="preserve">. ACL, 2024. </w:t>
       </w:r>
@@ -18946,8 +19334,8 @@
             <w:rFonts w:ascii="Calibri" w:hAnsi="Calibri" w:eastAsia="PingFang SC"/>
             <w:color w:val="2E74B5"/>
             <w:u w:val="single"/>
-            <w:sz w:val="18"/>
-            <w:szCs w:val="18"/>
+            <w:sz w:val="17"/>
+            <w:szCs w:val="17"/>
           </w:rPr>
           <w:t>https://aclanthology.org/2024.acl-long.399/</w:t>
         </w:r>
@@ -18955,13 +19343,13 @@
     </w:p>
     <w:p>
       <w:pPr>
-        <w:spacing w:after="40" w:line="252" w:lineRule="auto"/>
+        <w:spacing w:after="0" w:line="228" w:lineRule="auto"/>
         <w:ind w:left="360" w:hanging="360"/>
       </w:pPr>
       <w:r>
         <w:rPr>
           <w:rFonts w:ascii="Calibri" w:hAnsi="Calibri" w:eastAsia="PingFang SC"/>
-          <w:sz w:val="18"/>
+          <w:sz w:val="17"/>
         </w:rPr>
         <w:t xml:space="preserve">[34] Singh et al. </w:t>
       </w:r>
@@ -18969,14 +19357,14 @@
         <w:rPr>
           <w:rFonts w:ascii="Calibri" w:hAnsi="Calibri" w:eastAsia="PingFang SC"/>
           <w:i/>
-          <w:sz w:val="18"/>
+          <w:sz w:val="17"/>
         </w:rPr>
         <w:t>Personal Large Language Model Agents: A Case Study on Tailored Travel Planning</w:t>
       </w:r>
       <w:r>
         <w:rPr>
           <w:rFonts w:ascii="Calibri" w:hAnsi="Calibri" w:eastAsia="PingFang SC"/>
-          <w:sz w:val="18"/>
+          <w:sz w:val="17"/>
         </w:rPr>
         <w:t xml:space="preserve">. EMNLP Industry Track, 2024. </w:t>
       </w:r>
@@ -18986,8 +19374,8 @@
             <w:rFonts w:ascii="Calibri" w:hAnsi="Calibri" w:eastAsia="PingFang SC"/>
             <w:color w:val="2E74B5"/>
             <w:u w:val="single"/>
-            <w:sz w:val="18"/>
-            <w:szCs w:val="18"/>
+            <w:sz w:val="17"/>
+            <w:szCs w:val="17"/>
           </w:rPr>
           <w:t>https://aclanthology.org/2024.emnlp-industry.37/</w:t>
         </w:r>
@@ -18995,13 +19383,13 @@
     </w:p>
     <w:p>
       <w:pPr>
-        <w:spacing w:after="40" w:line="252" w:lineRule="auto"/>
+        <w:spacing w:after="0" w:line="228" w:lineRule="auto"/>
         <w:ind w:left="360" w:hanging="360"/>
       </w:pPr>
       <w:r>
         <w:rPr>
           <w:rFonts w:ascii="Calibri" w:hAnsi="Calibri" w:eastAsia="PingFang SC"/>
-          <w:sz w:val="18"/>
+          <w:sz w:val="17"/>
         </w:rPr>
         <w:t xml:space="preserve">[35] Zhao et al. </w:t>
       </w:r>
@@ -19009,14 +19397,14 @@
         <w:rPr>
           <w:rFonts w:ascii="Calibri" w:hAnsi="Calibri" w:eastAsia="PingFang SC"/>
           <w:i/>
-          <w:sz w:val="18"/>
+          <w:sz w:val="17"/>
         </w:rPr>
         <w:t>PersonaLens: A Benchmark for Personalization Evaluation in Conversational AI Assistants</w:t>
       </w:r>
       <w:r>
         <w:rPr>
           <w:rFonts w:ascii="Calibri" w:hAnsi="Calibri" w:eastAsia="PingFang SC"/>
-          <w:sz w:val="18"/>
+          <w:sz w:val="17"/>
         </w:rPr>
         <w:t xml:space="preserve">. Findings of ACL, 2025. </w:t>
       </w:r>
@@ -19026,8 +19414,8 @@
             <w:rFonts w:ascii="Calibri" w:hAnsi="Calibri" w:eastAsia="PingFang SC"/>
             <w:color w:val="2E74B5"/>
             <w:u w:val="single"/>
-            <w:sz w:val="18"/>
-            <w:szCs w:val="18"/>
+            <w:sz w:val="17"/>
+            <w:szCs w:val="17"/>
           </w:rPr>
           <w:t>https://aclanthology.org/2025.findings-acl.927/</w:t>
         </w:r>
@@ -19035,13 +19423,13 @@
     </w:p>
     <w:p>
       <w:pPr>
-        <w:spacing w:after="40" w:line="252" w:lineRule="auto"/>
+        <w:spacing w:after="0" w:line="228" w:lineRule="auto"/>
         <w:ind w:left="360" w:hanging="360"/>
       </w:pPr>
       <w:r>
         <w:rPr>
           <w:rFonts w:ascii="Calibri" w:hAnsi="Calibri" w:eastAsia="PingFang SC"/>
-          <w:sz w:val="18"/>
+          <w:sz w:val="17"/>
         </w:rPr>
         <w:t xml:space="preserve">[36] Jiang et al. </w:t>
       </w:r>
@@ -19049,14 +19437,14 @@
         <w:rPr>
           <w:rFonts w:ascii="Calibri" w:hAnsi="Calibri" w:eastAsia="PingFang SC"/>
           <w:i/>
-          <w:sz w:val="18"/>
+          <w:sz w:val="17"/>
         </w:rPr>
         <w:t>Know Me, Respond to Me: Benchmarking LLMs for Dynamic User Profiling and Personalized Responses at Scale</w:t>
       </w:r>
       <w:r>
         <w:rPr>
           <w:rFonts w:ascii="Calibri" w:hAnsi="Calibri" w:eastAsia="PingFang SC"/>
-          <w:sz w:val="18"/>
+          <w:sz w:val="17"/>
         </w:rPr>
         <w:t xml:space="preserve">. arXiv:2504.14225, 2025. </w:t>
       </w:r>
@@ -19066,8 +19454,8 @@
             <w:rFonts w:ascii="Calibri" w:hAnsi="Calibri" w:eastAsia="PingFang SC"/>
             <w:color w:val="2E74B5"/>
             <w:u w:val="single"/>
-            <w:sz w:val="18"/>
-            <w:szCs w:val="18"/>
+            <w:sz w:val="17"/>
+            <w:szCs w:val="17"/>
           </w:rPr>
           <w:t>https://arxiv.org/abs/2504.14225</w:t>
         </w:r>
@@ -19075,13 +19463,13 @@
     </w:p>
     <w:p>
       <w:pPr>
-        <w:spacing w:after="40" w:line="252" w:lineRule="auto"/>
+        <w:spacing w:after="0" w:line="228" w:lineRule="auto"/>
         <w:ind w:left="360" w:hanging="360"/>
       </w:pPr>
       <w:r>
         <w:rPr>
           <w:rFonts w:ascii="Calibri" w:hAnsi="Calibri" w:eastAsia="PingFang SC"/>
-          <w:sz w:val="18"/>
+          <w:sz w:val="17"/>
         </w:rPr>
         <w:t xml:space="preserve">[37] Hao et al. </w:t>
       </w:r>
@@ -19089,14 +19477,14 @@
         <w:rPr>
           <w:rFonts w:ascii="Calibri" w:hAnsi="Calibri" w:eastAsia="PingFang SC"/>
           <w:i/>
-          <w:sz w:val="18"/>
+          <w:sz w:val="17"/>
         </w:rPr>
         <w:t>Evaluating Personalized Tool-Augmented LLMs from the Perspectives of Personalization and Proactivity</w:t>
       </w:r>
       <w:r>
         <w:rPr>
           <w:rFonts w:ascii="Calibri" w:hAnsi="Calibri" w:eastAsia="PingFang SC"/>
-          <w:sz w:val="18"/>
+          <w:sz w:val="17"/>
         </w:rPr>
         <w:t xml:space="preserve">. ACL, 2025. </w:t>
       </w:r>
@@ -19106,8 +19494,8 @@
             <w:rFonts w:ascii="Calibri" w:hAnsi="Calibri" w:eastAsia="PingFang SC"/>
             <w:color w:val="2E74B5"/>
             <w:u w:val="single"/>
-            <w:sz w:val="18"/>
-            <w:szCs w:val="18"/>
+            <w:sz w:val="17"/>
+            <w:szCs w:val="17"/>
           </w:rPr>
           <w:t>https://aclanthology.org/2025.acl-long.1064/</w:t>
         </w:r>
@@ -19115,13 +19503,13 @@
     </w:p>
     <w:p>
       <w:pPr>
-        <w:spacing w:after="40" w:line="252" w:lineRule="auto"/>
+        <w:spacing w:after="0" w:line="228" w:lineRule="auto"/>
         <w:ind w:left="360" w:hanging="360"/>
       </w:pPr>
       <w:r>
         <w:rPr>
           <w:rFonts w:ascii="Calibri" w:hAnsi="Calibri" w:eastAsia="PingFang SC"/>
-          <w:sz w:val="18"/>
+          <w:sz w:val="17"/>
         </w:rPr>
         <w:t xml:space="preserve">[38] Cheng et al. </w:t>
       </w:r>
@@ -19129,14 +19517,14 @@
         <w:rPr>
           <w:rFonts w:ascii="Calibri" w:hAnsi="Calibri" w:eastAsia="PingFang SC"/>
           <w:i/>
-          <w:sz w:val="18"/>
+          <w:sz w:val="17"/>
         </w:rPr>
         <w:t>ToolSpectrum: Towards Personalized Tool Utilization for Large Language Models</w:t>
       </w:r>
       <w:r>
         <w:rPr>
           <w:rFonts w:ascii="Calibri" w:hAnsi="Calibri" w:eastAsia="PingFang SC"/>
-          <w:sz w:val="18"/>
+          <w:sz w:val="17"/>
         </w:rPr>
         <w:t xml:space="preserve">. arXiv:2505.13176, 2025. </w:t>
       </w:r>
@@ -19146,8 +19534,8 @@
             <w:rFonts w:ascii="Calibri" w:hAnsi="Calibri" w:eastAsia="PingFang SC"/>
             <w:color w:val="2E74B5"/>
             <w:u w:val="single"/>
-            <w:sz w:val="18"/>
-            <w:szCs w:val="18"/>
+            <w:sz w:val="17"/>
+            <w:szCs w:val="17"/>
           </w:rPr>
           <w:t>https://arxiv.org/abs/2505.13176</w:t>
         </w:r>
@@ -19155,13 +19543,13 @@
     </w:p>
     <w:p>
       <w:pPr>
-        <w:spacing w:after="40" w:line="252" w:lineRule="auto"/>
+        <w:spacing w:after="0" w:line="228" w:lineRule="auto"/>
         <w:ind w:left="360" w:hanging="360"/>
       </w:pPr>
       <w:r>
         <w:rPr>
           <w:rFonts w:ascii="Calibri" w:hAnsi="Calibri" w:eastAsia="PingFang SC"/>
-          <w:sz w:val="18"/>
+          <w:sz w:val="17"/>
         </w:rPr>
         <w:t xml:space="preserve">[39] Zhang et al. </w:t>
       </w:r>
@@ -19169,14 +19557,14 @@
         <w:rPr>
           <w:rFonts w:ascii="Calibri" w:hAnsi="Calibri" w:eastAsia="PingFang SC"/>
           <w:i/>
-          <w:sz w:val="18"/>
+          <w:sz w:val="17"/>
         </w:rPr>
         <w:t>PRIME: Large Language Model Personalization with Cognitive Dual-Memory and Personalized Thought Process</w:t>
       </w:r>
       <w:r>
         <w:rPr>
           <w:rFonts w:ascii="Calibri" w:hAnsi="Calibri" w:eastAsia="PingFang SC"/>
-          <w:sz w:val="18"/>
+          <w:sz w:val="17"/>
         </w:rPr>
         <w:t xml:space="preserve">. EMNLP, 2025. </w:t>
       </w:r>
@@ -19186,8 +19574,8 @@
             <w:rFonts w:ascii="Calibri" w:hAnsi="Calibri" w:eastAsia="PingFang SC"/>
             <w:color w:val="2E74B5"/>
             <w:u w:val="single"/>
-            <w:sz w:val="18"/>
-            <w:szCs w:val="18"/>
+            <w:sz w:val="17"/>
+            <w:szCs w:val="17"/>
           </w:rPr>
           <w:t>https://aclanthology.org/2025.emnlp-main.1711/</w:t>
         </w:r>
@@ -19195,13 +19583,13 @@
     </w:p>
     <w:p>
       <w:pPr>
-        <w:spacing w:after="40" w:line="252" w:lineRule="auto"/>
+        <w:spacing w:after="0" w:line="228" w:lineRule="auto"/>
         <w:ind w:left="360" w:hanging="360"/>
       </w:pPr>
       <w:r>
         <w:rPr>
           <w:rFonts w:ascii="Calibri" w:hAnsi="Calibri" w:eastAsia="PingFang SC"/>
-          <w:sz w:val="18"/>
+          <w:sz w:val="17"/>
         </w:rPr>
         <w:t xml:space="preserve">[40] Li et al. </w:t>
       </w:r>
@@ -19209,14 +19597,14 @@
         <w:rPr>
           <w:rFonts w:ascii="Calibri" w:hAnsi="Calibri" w:eastAsia="PingFang SC"/>
           <w:i/>
-          <w:sz w:val="18"/>
+          <w:sz w:val="17"/>
         </w:rPr>
         <w:t>Personalized Deep Research: A User-Centric Framework, Dataset, and Hybrid Evaluation for Knowledge Discovery</w:t>
       </w:r>
       <w:r>
         <w:rPr>
           <w:rFonts w:ascii="Calibri" w:hAnsi="Calibri" w:eastAsia="PingFang SC"/>
-          <w:sz w:val="18"/>
+          <w:sz w:val="17"/>
         </w:rPr>
         <w:t xml:space="preserve">. arXiv:2605.10530, 2026. </w:t>
       </w:r>
@@ -19226,8 +19614,8 @@
             <w:rFonts w:ascii="Calibri" w:hAnsi="Calibri" w:eastAsia="PingFang SC"/>
             <w:color w:val="2E74B5"/>
             <w:u w:val="single"/>
-            <w:sz w:val="18"/>
-            <w:szCs w:val="18"/>
+            <w:sz w:val="17"/>
+            <w:szCs w:val="17"/>
           </w:rPr>
           <w:t>https://arxiv.org/abs/2605.10530</w:t>
         </w:r>
@@ -19235,13 +19623,13 @@
     </w:p>
     <w:p>
       <w:pPr>
-        <w:spacing w:after="40" w:line="252" w:lineRule="auto"/>
+        <w:spacing w:after="0" w:line="228" w:lineRule="auto"/>
         <w:ind w:left="360" w:hanging="360"/>
       </w:pPr>
       <w:r>
         <w:rPr>
           <w:rFonts w:ascii="Calibri" w:hAnsi="Calibri" w:eastAsia="PingFang SC"/>
-          <w:sz w:val="18"/>
+          <w:sz w:val="17"/>
         </w:rPr>
         <w:t xml:space="preserve">[41] Balepur et al. </w:t>
       </w:r>
@@ -19249,14 +19637,14 @@
         <w:rPr>
           <w:rFonts w:ascii="Calibri" w:hAnsi="Calibri" w:eastAsia="PingFang SC"/>
           <w:i/>
-          <w:sz w:val="18"/>
+          <w:sz w:val="17"/>
         </w:rPr>
         <w:t>Language Models Don't Know What You Want: Evaluating Personalization in Deep Research Needs Real Users</w:t>
       </w:r>
       <w:r>
         <w:rPr>
           <w:rFonts w:ascii="Calibri" w:hAnsi="Calibri" w:eastAsia="PingFang SC"/>
-          <w:sz w:val="18"/>
+          <w:sz w:val="17"/>
         </w:rPr>
         <w:t xml:space="preserve">. ACL, 2026. </w:t>
       </w:r>
@@ -19266,8 +19654,8 @@
             <w:rFonts w:ascii="Calibri" w:hAnsi="Calibri" w:eastAsia="PingFang SC"/>
             <w:color w:val="2E74B5"/>
             <w:u w:val="single"/>
-            <w:sz w:val="18"/>
-            <w:szCs w:val="18"/>
+            <w:sz w:val="17"/>
+            <w:szCs w:val="17"/>
           </w:rPr>
           <w:t>https://aclanthology.org/2026.acl-long.723/</w:t>
         </w:r>
@@ -19275,13 +19663,13 @@
     </w:p>
     <w:p>
       <w:pPr>
-        <w:spacing w:after="40" w:line="252" w:lineRule="auto"/>
+        <w:spacing w:after="0" w:line="228" w:lineRule="auto"/>
         <w:ind w:left="360" w:hanging="360"/>
       </w:pPr>
       <w:r>
         <w:rPr>
           <w:rFonts w:ascii="Calibri" w:hAnsi="Calibri" w:eastAsia="PingFang SC"/>
-          <w:sz w:val="18"/>
+          <w:sz w:val="17"/>
         </w:rPr>
         <w:t xml:space="preserve">[42] Garbacea et al. </w:t>
       </w:r>
@@ -19289,14 +19677,14 @@
         <w:rPr>
           <w:rFonts w:ascii="Calibri" w:hAnsi="Calibri" w:eastAsia="PingFang SC"/>
           <w:i/>
-          <w:sz w:val="18"/>
+          <w:sz w:val="17"/>
         </w:rPr>
         <w:t>Personalized Benchmarking: Evaluating LLMs by Individual Preferences</w:t>
       </w:r>
       <w:r>
         <w:rPr>
           <w:rFonts w:ascii="Calibri" w:hAnsi="Calibri" w:eastAsia="PingFang SC"/>
-          <w:sz w:val="18"/>
+          <w:sz w:val="17"/>
         </w:rPr>
         <w:t xml:space="preserve">. Findings of ACL, 2026. </w:t>
       </w:r>
@@ -19306,8 +19694,8 @@
             <w:rFonts w:ascii="Calibri" w:hAnsi="Calibri" w:eastAsia="PingFang SC"/>
             <w:color w:val="2E74B5"/>
             <w:u w:val="single"/>
-            <w:sz w:val="18"/>
-            <w:szCs w:val="18"/>
+            <w:sz w:val="17"/>
+            <w:szCs w:val="17"/>
           </w:rPr>
           <w:t>https://aclanthology.org/2026.findings-acl.31/</w:t>
         </w:r>
@@ -19315,13 +19703,13 @@
     </w:p>
     <w:p>
       <w:pPr>
-        <w:spacing w:after="40" w:line="252" w:lineRule="auto"/>
+        <w:spacing w:after="0" w:line="228" w:lineRule="auto"/>
         <w:ind w:left="360" w:hanging="360"/>
       </w:pPr>
       <w:r>
         <w:rPr>
           <w:rFonts w:ascii="Calibri" w:hAnsi="Calibri" w:eastAsia="PingFang SC"/>
-          <w:sz w:val="18"/>
+          <w:sz w:val="17"/>
         </w:rPr>
         <w:t xml:space="preserve">[43] Feng et al. </w:t>
       </w:r>
@@ -19329,14 +19717,14 @@
         <w:rPr>
           <w:rFonts w:ascii="Calibri" w:hAnsi="Calibri" w:eastAsia="PingFang SC"/>
           <w:i/>
-          <w:sz w:val="18"/>
+          <w:sz w:val="17"/>
         </w:rPr>
         <w:t>How Does Personalized Memory Shape LLM Behavior? Benchmarking Rational Preference Utilization in Personalized Assistants</w:t>
       </w:r>
       <w:r>
         <w:rPr>
           <w:rFonts w:ascii="Calibri" w:hAnsi="Calibri" w:eastAsia="PingFang SC"/>
-          <w:sz w:val="18"/>
+          <w:sz w:val="17"/>
         </w:rPr>
         <w:t xml:space="preserve">. arXiv:2601.16621, 2026. </w:t>
       </w:r>
@@ -19346,8 +19734,8 @@
             <w:rFonts w:ascii="Calibri" w:hAnsi="Calibri" w:eastAsia="PingFang SC"/>
             <w:color w:val="2E74B5"/>
             <w:u w:val="single"/>
-            <w:sz w:val="18"/>
-            <w:szCs w:val="18"/>
+            <w:sz w:val="17"/>
+            <w:szCs w:val="17"/>
           </w:rPr>
           <w:t>https://arxiv.org/abs/2601.16621</w:t>
         </w:r>
@@ -19355,13 +19743,13 @@
     </w:p>
     <w:p>
       <w:pPr>
-        <w:spacing w:after="40" w:line="252" w:lineRule="auto"/>
+        <w:spacing w:after="0" w:line="228" w:lineRule="auto"/>
         <w:ind w:left="360" w:hanging="360"/>
       </w:pPr>
       <w:r>
         <w:rPr>
           <w:rFonts w:ascii="Calibri" w:hAnsi="Calibri" w:eastAsia="PingFang SC"/>
-          <w:sz w:val="18"/>
+          <w:sz w:val="17"/>
         </w:rPr>
         <w:t xml:space="preserve">[44] Liang et al. </w:t>
       </w:r>
@@ -19369,14 +19757,14 @@
         <w:rPr>
           <w:rFonts w:ascii="Calibri" w:hAnsi="Calibri" w:eastAsia="PingFang SC"/>
           <w:i/>
-          <w:sz w:val="18"/>
+          <w:sz w:val="17"/>
         </w:rPr>
         <w:t>Learning Personalized Agents from Human Feedback</w:t>
       </w:r>
       <w:r>
         <w:rPr>
           <w:rFonts w:ascii="Calibri" w:hAnsi="Calibri" w:eastAsia="PingFang SC"/>
-          <w:sz w:val="18"/>
+          <w:sz w:val="17"/>
         </w:rPr>
         <w:t xml:space="preserve">. arXiv:2602.16173, 2026. </w:t>
       </w:r>
@@ -19386,8 +19774,8 @@
             <w:rFonts w:ascii="Calibri" w:hAnsi="Calibri" w:eastAsia="PingFang SC"/>
             <w:color w:val="2E74B5"/>
             <w:u w:val="single"/>
-            <w:sz w:val="18"/>
-            <w:szCs w:val="18"/>
+            <w:sz w:val="17"/>
+            <w:szCs w:val="17"/>
           </w:rPr>
           <w:t>https://arxiv.org/abs/2602.16173</w:t>
         </w:r>
@@ -19395,13 +19783,13 @@
     </w:p>
     <w:p>
       <w:pPr>
-        <w:spacing w:after="40" w:line="252" w:lineRule="auto"/>
+        <w:spacing w:after="0" w:line="228" w:lineRule="auto"/>
         <w:ind w:left="360" w:hanging="360"/>
       </w:pPr>
       <w:r>
         <w:rPr>
           <w:rFonts w:ascii="Calibri" w:hAnsi="Calibri" w:eastAsia="PingFang SC"/>
-          <w:sz w:val="18"/>
+          <w:sz w:val="17"/>
         </w:rPr>
         <w:t xml:space="preserve">[45] In et al. </w:t>
       </w:r>
@@ -19409,14 +19797,14 @@
         <w:rPr>
           <w:rFonts w:ascii="Calibri" w:hAnsi="Calibri" w:eastAsia="PingFang SC"/>
           <w:i/>
-          <w:sz w:val="18"/>
+          <w:sz w:val="17"/>
         </w:rPr>
         <w:t>Personalize-then-Store: Benchmarking and Learning Personalized Memory for Long-horizon Agents</w:t>
       </w:r>
       <w:r>
         <w:rPr>
           <w:rFonts w:ascii="Calibri" w:hAnsi="Calibri" w:eastAsia="PingFang SC"/>
-          <w:sz w:val="18"/>
+          <w:sz w:val="17"/>
         </w:rPr>
         <w:t xml:space="preserve">. arXiv:2605.25535, 2026. </w:t>
       </w:r>
@@ -19426,8 +19814,8 @@
             <w:rFonts w:ascii="Calibri" w:hAnsi="Calibri" w:eastAsia="PingFang SC"/>
             <w:color w:val="2E74B5"/>
             <w:u w:val="single"/>
-            <w:sz w:val="18"/>
-            <w:szCs w:val="18"/>
+            <w:sz w:val="17"/>
+            <w:szCs w:val="17"/>
           </w:rPr>
           <w:t>https://arxiv.org/abs/2605.25535</w:t>
         </w:r>
@@ -19435,13 +19823,13 @@
     </w:p>
     <w:p>
       <w:pPr>
-        <w:spacing w:after="40" w:line="252" w:lineRule="auto"/>
+        <w:spacing w:after="0" w:line="228" w:lineRule="auto"/>
         <w:ind w:left="360" w:hanging="360"/>
       </w:pPr>
       <w:r>
         <w:rPr>
           <w:rFonts w:ascii="Calibri" w:hAnsi="Calibri" w:eastAsia="PingFang SC"/>
-          <w:sz w:val="18"/>
+          <w:sz w:val="17"/>
         </w:rPr>
         <w:t xml:space="preserve">[46] Uddin et al. </w:t>
       </w:r>
@@ -19449,14 +19837,14 @@
         <w:rPr>
           <w:rFonts w:ascii="Calibri" w:hAnsi="Calibri" w:eastAsia="PingFang SC"/>
           <w:i/>
-          <w:sz w:val="18"/>
+          <w:sz w:val="17"/>
         </w:rPr>
         <w:t>From Recall to Forgetting: Benchmarking Long-Term Memory for Personalized Agents</w:t>
       </w:r>
       <w:r>
         <w:rPr>
           <w:rFonts w:ascii="Calibri" w:hAnsi="Calibri" w:eastAsia="PingFang SC"/>
-          <w:sz w:val="18"/>
+          <w:sz w:val="17"/>
         </w:rPr>
         <w:t xml:space="preserve">. Findings of ACL, 2026. </w:t>
       </w:r>
@@ -19466,8 +19854,8 @@
             <w:rFonts w:ascii="Calibri" w:hAnsi="Calibri" w:eastAsia="PingFang SC"/>
             <w:color w:val="2E74B5"/>
             <w:u w:val="single"/>
-            <w:sz w:val="18"/>
-            <w:szCs w:val="18"/>
+            <w:sz w:val="17"/>
+            <w:szCs w:val="17"/>
           </w:rPr>
           <w:t>https://aclanthology.org/2026.findings-acl.1337/</w:t>
         </w:r>
@@ -19475,13 +19863,13 @@
     </w:p>
     <w:p>
       <w:pPr>
-        <w:spacing w:after="40" w:line="252" w:lineRule="auto"/>
+        <w:spacing w:after="0" w:line="228" w:lineRule="auto"/>
         <w:ind w:left="360" w:hanging="360"/>
       </w:pPr>
       <w:r>
         <w:rPr>
           <w:rFonts w:ascii="Calibri" w:hAnsi="Calibri" w:eastAsia="PingFang SC"/>
-          <w:sz w:val="18"/>
+          <w:sz w:val="17"/>
         </w:rPr>
         <w:t xml:space="preserve">[47] Hu et al. </w:t>
       </w:r>
@@ -19489,14 +19877,14 @@
         <w:rPr>
           <w:rFonts w:ascii="Calibri" w:hAnsi="Calibri" w:eastAsia="PingFang SC"/>
           <w:i/>
-          <w:sz w:val="18"/>
+          <w:sz w:val="17"/>
         </w:rPr>
         <w:t>CloneMem: Benchmarking Long-Term Memory for AI Clones</w:t>
       </w:r>
       <w:r>
         <w:rPr>
           <w:rFonts w:ascii="Calibri" w:hAnsi="Calibri" w:eastAsia="PingFang SC"/>
-          <w:sz w:val="18"/>
+          <w:sz w:val="17"/>
         </w:rPr>
         <w:t xml:space="preserve">. ACL, 2026. </w:t>
       </w:r>
@@ -19506,8 +19894,8 @@
             <w:rFonts w:ascii="Calibri" w:hAnsi="Calibri" w:eastAsia="PingFang SC"/>
             <w:color w:val="2E74B5"/>
             <w:u w:val="single"/>
-            <w:sz w:val="18"/>
-            <w:szCs w:val="18"/>
+            <w:sz w:val="17"/>
+            <w:szCs w:val="17"/>
           </w:rPr>
           <w:t>https://aclanthology.org/2026.acl-long.1549/</w:t>
         </w:r>
@@ -19515,13 +19903,13 @@
     </w:p>
     <w:p>
       <w:pPr>
-        <w:spacing w:after="40" w:line="252" w:lineRule="auto"/>
+        <w:spacing w:after="0" w:line="228" w:lineRule="auto"/>
         <w:ind w:left="360" w:hanging="360"/>
       </w:pPr>
       <w:r>
         <w:rPr>
           <w:rFonts w:ascii="Calibri" w:hAnsi="Calibri" w:eastAsia="PingFang SC"/>
-          <w:sz w:val="18"/>
+          <w:sz w:val="17"/>
         </w:rPr>
         <w:t xml:space="preserve">[48] Shen et al. </w:t>
       </w:r>
@@ -19529,14 +19917,14 @@
         <w:rPr>
           <w:rFonts w:ascii="Calibri" w:hAnsi="Calibri" w:eastAsia="PingFang SC"/>
           <w:i/>
-          <w:sz w:val="18"/>
+          <w:sz w:val="17"/>
         </w:rPr>
         <w:t>Mem2ActBench: A Benchmark for Evaluating Long-Term Memory Utilization in Task-Oriented Autonomous Agents</w:t>
       </w:r>
       <w:r>
         <w:rPr>
           <w:rFonts w:ascii="Calibri" w:hAnsi="Calibri" w:eastAsia="PingFang SC"/>
-          <w:sz w:val="18"/>
+          <w:sz w:val="17"/>
         </w:rPr>
         <w:t xml:space="preserve">. ACL, 2026. </w:t>
       </w:r>
@@ -19546,8 +19934,8 @@
             <w:rFonts w:ascii="Calibri" w:hAnsi="Calibri" w:eastAsia="PingFang SC"/>
             <w:color w:val="2E74B5"/>
             <w:u w:val="single"/>
-            <w:sz w:val="18"/>
-            <w:szCs w:val="18"/>
+            <w:sz w:val="17"/>
+            <w:szCs w:val="17"/>
           </w:rPr>
           <w:t>https://aclanthology.org/2026.acl-long.370/</w:t>
         </w:r>
@@ -19555,13 +19943,13 @@
     </w:p>
     <w:p>
       <w:pPr>
-        <w:spacing w:after="40" w:line="252" w:lineRule="auto"/>
+        <w:spacing w:after="0" w:line="228" w:lineRule="auto"/>
         <w:ind w:left="360" w:hanging="360"/>
       </w:pPr>
       <w:r>
         <w:rPr>
           <w:rFonts w:ascii="Calibri" w:hAnsi="Calibri" w:eastAsia="PingFang SC"/>
-          <w:sz w:val="18"/>
+          <w:sz w:val="17"/>
         </w:rPr>
         <w:t xml:space="preserve">[49] Chen et al. </w:t>
       </w:r>
@@ -19569,14 +19957,14 @@
         <w:rPr>
           <w:rFonts w:ascii="Calibri" w:hAnsi="Calibri" w:eastAsia="PingFang SC"/>
           <w:i/>
-          <w:sz w:val="18"/>
+          <w:sz w:val="17"/>
         </w:rPr>
         <w:t>Towards Preference Following in Tool Calling Language Agents</w:t>
       </w:r>
       <w:r>
         <w:rPr>
           <w:rFonts w:ascii="Calibri" w:hAnsi="Calibri" w:eastAsia="PingFang SC"/>
-          <w:sz w:val="18"/>
+          <w:sz w:val="17"/>
         </w:rPr>
         <w:t xml:space="preserve">. Findings of ACL, 2026. </w:t>
       </w:r>
@@ -19586,8 +19974,8 @@
             <w:rFonts w:ascii="Calibri" w:hAnsi="Calibri" w:eastAsia="PingFang SC"/>
             <w:color w:val="2E74B5"/>
             <w:u w:val="single"/>
-            <w:sz w:val="18"/>
-            <w:szCs w:val="18"/>
+            <w:sz w:val="17"/>
+            <w:szCs w:val="17"/>
           </w:rPr>
           <w:t>https://aclanthology.org/2026.findings-acl.1676/</w:t>
         </w:r>
@@ -19595,13 +19983,13 @@
     </w:p>
     <w:p>
       <w:pPr>
-        <w:spacing w:after="40" w:line="252" w:lineRule="auto"/>
+        <w:spacing w:after="0" w:line="228" w:lineRule="auto"/>
         <w:ind w:left="360" w:hanging="360"/>
       </w:pPr>
       <w:r>
         <w:rPr>
           <w:rFonts w:ascii="Calibri" w:hAnsi="Calibri" w:eastAsia="PingFang SC"/>
-          <w:sz w:val="18"/>
+          <w:sz w:val="17"/>
         </w:rPr>
         <w:t xml:space="preserve">[50] Lyu et al. </w:t>
       </w:r>
@@ -19609,14 +19997,14 @@
         <w:rPr>
           <w:rFonts w:ascii="Calibri" w:hAnsi="Calibri" w:eastAsia="PingFang SC"/>
           <w:i/>
-          <w:sz w:val="18"/>
+          <w:sz w:val="17"/>
         </w:rPr>
         <w:t>PersonalAlign: Hierarchical Implicit Intent Alignment for Personalized GUI Agent with Long-Term User-Centric Records</w:t>
       </w:r>
       <w:r>
         <w:rPr>
           <w:rFonts w:ascii="Calibri" w:hAnsi="Calibri" w:eastAsia="PingFang SC"/>
-          <w:sz w:val="18"/>
+          <w:sz w:val="17"/>
         </w:rPr>
         <w:t xml:space="preserve">. ACL, 2026. </w:t>
       </w:r>
@@ -19626,8 +20014,8 @@
             <w:rFonts w:ascii="Calibri" w:hAnsi="Calibri" w:eastAsia="PingFang SC"/>
             <w:color w:val="2E74B5"/>
             <w:u w:val="single"/>
-            <w:sz w:val="18"/>
-            <w:szCs w:val="18"/>
+            <w:sz w:val="17"/>
+            <w:szCs w:val="17"/>
           </w:rPr>
           <w:t>https://aclanthology.org/2026.acl-long.1669/</w:t>
         </w:r>
@@ -19635,13 +20023,13 @@
     </w:p>
     <w:p>
       <w:pPr>
-        <w:spacing w:after="40" w:line="252" w:lineRule="auto"/>
+        <w:spacing w:after="0" w:line="228" w:lineRule="auto"/>
         <w:ind w:left="360" w:hanging="360"/>
       </w:pPr>
       <w:r>
         <w:rPr>
           <w:rFonts w:ascii="Calibri" w:hAnsi="Calibri" w:eastAsia="PingFang SC"/>
-          <w:sz w:val="18"/>
+          <w:sz w:val="17"/>
         </w:rPr>
         <w:t xml:space="preserve">[51] Wang et al. </w:t>
       </w:r>
@@ -19649,14 +20037,14 @@
         <w:rPr>
           <w:rFonts w:ascii="Calibri" w:hAnsi="Calibri" w:eastAsia="PingFang SC"/>
           <w:i/>
-          <w:sz w:val="18"/>
+          <w:sz w:val="17"/>
         </w:rPr>
         <w:t>OPeRA: A Dataset of Observation, Persona, Rationale, and Action for Evaluating LLMs on Human Online Shopping Behavior Simulation</w:t>
       </w:r>
       <w:r>
         <w:rPr>
           <w:rFonts w:ascii="Calibri" w:hAnsi="Calibri" w:eastAsia="PingFang SC"/>
-          <w:sz w:val="18"/>
+          <w:sz w:val="17"/>
         </w:rPr>
         <w:t xml:space="preserve">. ACL, 2026. </w:t>
       </w:r>
@@ -19666,8 +20054,8 @@
             <w:rFonts w:ascii="Calibri" w:hAnsi="Calibri" w:eastAsia="PingFang SC"/>
             <w:color w:val="2E74B5"/>
             <w:u w:val="single"/>
-            <w:sz w:val="18"/>
-            <w:szCs w:val="18"/>
+            <w:sz w:val="17"/>
+            <w:szCs w:val="17"/>
           </w:rPr>
           <w:t>https://aclanthology.org/2026.acl-long.2033/</w:t>
         </w:r>
@@ -19675,13 +20063,13 @@
     </w:p>
     <w:p>
       <w:pPr>
-        <w:spacing w:after="40" w:line="252" w:lineRule="auto"/>
+        <w:spacing w:after="0" w:line="228" w:lineRule="auto"/>
         <w:ind w:left="360" w:hanging="360"/>
       </w:pPr>
       <w:r>
         <w:rPr>
           <w:rFonts w:ascii="Calibri" w:hAnsi="Calibri" w:eastAsia="PingFang SC"/>
-          <w:sz w:val="18"/>
+          <w:sz w:val="17"/>
         </w:rPr>
         <w:t xml:space="preserve">[52] Guo et al. </w:t>
       </w:r>
@@ -19689,14 +20077,14 @@
         <w:rPr>
           <w:rFonts w:ascii="Calibri" w:hAnsi="Calibri" w:eastAsia="PingFang SC"/>
           <w:i/>
-          <w:sz w:val="18"/>
+          <w:sz w:val="17"/>
         </w:rPr>
         <w:t>When Personalization Legitimizes Risks: Uncovering Safety Vulnerabilities in Personalized Dialogue Agents</w:t>
       </w:r>
       <w:r>
         <w:rPr>
           <w:rFonts w:ascii="Calibri" w:hAnsi="Calibri" w:eastAsia="PingFang SC"/>
-          <w:sz w:val="18"/>
+          <w:sz w:val="17"/>
         </w:rPr>
         <w:t xml:space="preserve">. ACL, 2026. </w:t>
       </w:r>
@@ -19706,8 +20094,8 @@
             <w:rFonts w:ascii="Calibri" w:hAnsi="Calibri" w:eastAsia="PingFang SC"/>
             <w:color w:val="2E74B5"/>
             <w:u w:val="single"/>
-            <w:sz w:val="18"/>
-            <w:szCs w:val="18"/>
+            <w:sz w:val="17"/>
+            <w:szCs w:val="17"/>
           </w:rPr>
           <w:t>https://aclanthology.org/2026.acl-long.1260/</w:t>
         </w:r>
@@ -19715,13 +20103,13 @@
     </w:p>
     <w:p>
       <w:pPr>
-        <w:spacing w:after="40" w:line="252" w:lineRule="auto"/>
+        <w:spacing w:after="0" w:line="228" w:lineRule="auto"/>
         <w:ind w:left="360" w:hanging="360"/>
       </w:pPr>
       <w:r>
         <w:rPr>
           <w:rFonts w:ascii="Calibri" w:hAnsi="Calibri" w:eastAsia="PingFang SC"/>
-          <w:sz w:val="18"/>
+          <w:sz w:val="17"/>
         </w:rPr>
         <w:t xml:space="preserve">[53] Weeber et al. </w:t>
       </w:r>
@@ -19729,14 +20117,14 @@
         <w:rPr>
           <w:rFonts w:ascii="Calibri" w:hAnsi="Calibri" w:eastAsia="PingFang SC"/>
           <w:i/>
-          <w:sz w:val="18"/>
+          <w:sz w:val="17"/>
         </w:rPr>
         <w:t>One Persona, Many Cues, Different Results: How Sociodemographic Cues Impact LLM Personalization</w:t>
       </w:r>
       <w:r>
         <w:rPr>
           <w:rFonts w:ascii="Calibri" w:hAnsi="Calibri" w:eastAsia="PingFang SC"/>
-          <w:sz w:val="18"/>
+          <w:sz w:val="17"/>
         </w:rPr>
         <w:t xml:space="preserve">. ACL, 2026. </w:t>
       </w:r>
@@ -19746,8 +20134,8 @@
             <w:rFonts w:ascii="Calibri" w:hAnsi="Calibri" w:eastAsia="PingFang SC"/>
             <w:color w:val="2E74B5"/>
             <w:u w:val="single"/>
-            <w:sz w:val="18"/>
-            <w:szCs w:val="18"/>
+            <w:sz w:val="17"/>
+            <w:szCs w:val="17"/>
           </w:rPr>
           <w:t>https://aclanthology.org/2026.acl-long.2079/</w:t>
         </w:r>
@@ -19755,13 +20143,13 @@
     </w:p>
     <w:p>
       <w:pPr>
-        <w:spacing w:after="40" w:line="252" w:lineRule="auto"/>
+        <w:spacing w:after="0" w:line="228" w:lineRule="auto"/>
         <w:ind w:left="360" w:hanging="360"/>
       </w:pPr>
       <w:r>
         <w:rPr>
           <w:rFonts w:ascii="Calibri" w:hAnsi="Calibri" w:eastAsia="PingFang SC"/>
-          <w:sz w:val="18"/>
+          <w:sz w:val="17"/>
         </w:rPr>
         <w:t xml:space="preserve">[54] Qiu et al. </w:t>
       </w:r>
@@ -19769,14 +20157,14 @@
         <w:rPr>
           <w:rFonts w:ascii="Calibri" w:hAnsi="Calibri" w:eastAsia="PingFang SC"/>
           <w:i/>
-          <w:sz w:val="18"/>
+          <w:sz w:val="17"/>
         </w:rPr>
         <w:t>Preference-Aware Rubric Learning for Personalized Evaluation</w:t>
       </w:r>
       <w:r>
         <w:rPr>
           <w:rFonts w:ascii="Calibri" w:hAnsi="Calibri" w:eastAsia="PingFang SC"/>
-          <w:sz w:val="18"/>
+          <w:sz w:val="17"/>
         </w:rPr>
         <w:t xml:space="preserve">. arXiv:2605.31545, 2026. </w:t>
       </w:r>
@@ -19786,8 +20174,8 @@
             <w:rFonts w:ascii="Calibri" w:hAnsi="Calibri" w:eastAsia="PingFang SC"/>
             <w:color w:val="2E74B5"/>
             <w:u w:val="single"/>
-            <w:sz w:val="18"/>
-            <w:szCs w:val="18"/>
+            <w:sz w:val="17"/>
+            <w:szCs w:val="17"/>
           </w:rPr>
           <w:t>https://arxiv.org/abs/2605.31545</w:t>
         </w:r>
@@ -19835,7 +20223,7 @@
         <w:color w:val="5B6B7A"/>
         <w:sz w:val="18"/>
       </w:rPr>
-      <w:t xml:space="preserve">2026-8-3   ·   </w:t>
+      <w:t xml:space="preserve">2026-8-4   ·   </w:t>
     </w:r>
     <w:r>
       <w:rPr>
@@ -19868,7 +20256,7 @@
         <w:color w:val="5B6B7A"/>
         <w:sz w:val="18"/>
       </w:rPr>
-      <w:t xml:space="preserve">2026-8-3   ·   </w:t>
+      <w:t xml:space="preserve">2026-8-4   ·   </w:t>
     </w:r>
     <w:r>
       <w:rPr>
@@ -19901,7 +20289,7 @@
         <w:color w:val="5B6B7A"/>
         <w:sz w:val="18"/>
       </w:rPr>
-      <w:t xml:space="preserve">2026-8-3   ·   </w:t>
+      <w:t xml:space="preserve">2026-8-4   ·   </w:t>
     </w:r>
     <w:r>
       <w:rPr>

</xml_diff>

<commit_message>
proposal v0.26: prototype benchmark result figures
</commit_message>
<xml_diff>
--- a/deliverables/DeepAlign-Bench_正式研究Proposal.docx
+++ b/deliverables/DeepAlign-Bench_正式研究Proposal.docx
@@ -131,7 +131,7 @@
                 <w:color w:val="5B6B7A"/>
                 <w:sz w:val="21"/>
               </w:rPr>
-              <w:t>v0.25 · 组内讨论稿</w:t>
+              <w:t>v0.26 · 组内讨论稿</w:t>
             </w:r>
           </w:p>
         </w:tc>
@@ -17798,13 +17798,13 @@
           <w:rFonts w:ascii="Calibri" w:hAnsi="Calibri" w:eastAsia="PingFang SC"/>
           <w:b/>
         </w:rPr>
-        <w:t>Figure 3 · 主结果：不同 agent 在什么任务上产生真实个性化价值。</w:t>
-      </w:r>
-      <w:r>
-        <w:rPr>
-          <w:rFonts w:ascii="Calibri" w:hAnsi="Calibri" w:eastAsia="PingFang SC"/>
-        </w:rPr>
-        <w:t xml:space="preserve"> 四个共享尺度的 panel：A 用 forest/dot plot 报各 agent 的 CFA 与 95% CI，并标记是否通过 TQ/FR gate；B 用 </w:t>
+        <w:t>Figure 3 · 主结果：不同 agent 是否产生了用户特异价值，以及这种价值出现在哪里。</w:t>
+      </w:r>
+      <w:r>
+        <w:rPr>
+          <w:rFonts w:ascii="Calibri" w:hAnsi="Calibri" w:eastAsia="PingFang SC"/>
+        </w:rPr>
+        <w:t xml:space="preserve"> 四个 panel：A 是本论文的 signature plot，横轴为 </w:t>
       </w:r>
       <w:r>
         <w:rPr>
@@ -17812,13 +17812,13 @@
           <w:color w:val="6A3E00"/>
           <w:sz w:val="20"/>
         </w:rPr>
-        <w:t>agent × research intent</w:t>
-      </w:r>
-      <w:r>
-        <w:rPr>
-          <w:rFonts w:ascii="Calibri" w:hAnsi="Calibri" w:eastAsia="PingFang SC"/>
-        </w:rPr>
-        <w:t xml:space="preserve"> heatmap 报 CFA；C 用 </w:t>
+        <w:t>PF_swapped</w:t>
+      </w:r>
+      <w:r>
+        <w:rPr>
+          <w:rFonts w:ascii="Calibri" w:hAnsi="Calibri" w:eastAsia="PingFang SC"/>
+        </w:rPr>
+        <w:t xml:space="preserve">、纵轴为 </w:t>
       </w:r>
       <w:r>
         <w:rPr>
@@ -17826,28 +17826,13 @@
           <w:color w:val="6A3E00"/>
           <w:sz w:val="20"/>
         </w:rPr>
-        <w:t>agent × task stratum</w:t>
-      </w:r>
-      <w:r>
-        <w:rPr>
-          <w:rFonts w:ascii="Calibri" w:hAnsi="Calibri" w:eastAsia="PingFang SC"/>
-        </w:rPr>
-        <w:t xml:space="preserve"> heatmap 报 worst-slice CFA 或 PF；D 用 cost–CFA 散点图报告效率前沿。不能用雷达图，也不能把所有指标平均成一个冠军分数。</w:t>
-      </w:r>
-    </w:p>
-    <w:p>
-      <w:r>
-        <w:rPr>
-          <w:rFonts w:ascii="Calibri" w:hAnsi="Calibri" w:eastAsia="PingFang SC"/>
-          <w:b/>
-        </w:rPr>
-        <w:t>Figure 4 · 信号渠道、压力和失败模式。</w:t>
-      </w:r>
-      <w:r>
-        <w:rPr>
-          <w:rFonts w:ascii="Calibri" w:hAnsi="Calibri" w:eastAsia="PingFang SC"/>
-        </w:rPr>
-        <w:t xml:space="preserve"> 四个 panel：A 比较 structured persona、natural history、clarification 和 workspace/history 的 Worst-view CFA 与 Cue Gap；B 按 S0–S3 绘制各 agent 的 CFA/retention dose-response 曲线；C 以“个性化结果风险 × observed failure mode”画归一化 heatmap，并单列 </w:t>
+        <w:t>PF_matched</w:t>
+      </w:r>
+      <w:r>
+        <w:rPr>
+          <w:rFonts w:ascii="Calibri" w:hAnsi="Calibri" w:eastAsia="PingFang SC"/>
+        </w:rPr>
+        <w:t xml:space="preserve">，45° 对角线表示没有跨用户优势；离对角线越远且位于上方，说明 matched 版本相对 swapped 版本的用户特异价值越强。点的实心/空心只表示是否通过 TQ/FR gate，不用颜色重复编码质量。B 用 forest/dot plot 报各 agent 的 CFA 与 95% CI，并按 E1/E2/E3 execution regime 分块；C 用统一色标的 </w:t>
       </w:r>
       <w:r>
         <w:rPr>
@@ -17855,13 +17840,13 @@
           <w:color w:val="6A3E00"/>
           <w:sz w:val="20"/>
         </w:rPr>
-        <w:t>other/emergent</w:t>
-      </w:r>
-      <w:r>
-        <w:rPr>
-          <w:rFonts w:ascii="Calibri" w:hAnsi="Calibri" w:eastAsia="PingFang SC"/>
-        </w:rPr>
-        <w:t>；D 报压力相对 clean 条件造成的 TQ、FR、MP 和隐私/权限 collateral damage。该图对应 Agent-SafetyBench 式失败分析，但分类对象是个性化结果风险与机制，不是 attack 类型。</w:t>
+        <w:t>agent × (3 task strata × 6 research intents)</w:t>
+      </w:r>
+      <w:r>
+        <w:rPr>
+          <w:rFonts w:ascii="Calibri" w:hAnsi="Calibri" w:eastAsia="PingFang SC"/>
+        </w:rPr>
+        <w:t xml:space="preserve"> 嵌套 heatmap 报 CFA，缺测单元使用斜线并在底部报告样本量；D 只在可比 regime 内画 cost–CFA Pareto frontier。A 解释 estimand，B 给出不确定性，C 显示能力拓扑，D 报告效率；不能用雷达图或单一冠军分数替代这四类信息。</w:t>
       </w:r>
     </w:p>
     <w:p>
@@ -17870,51 +17855,13 @@
           <w:rFonts w:ascii="Calibri" w:hAnsi="Calibri" w:eastAsia="PingFang SC"/>
           <w:b/>
         </w:rPr>
-        <w:t>Figure 5 · 自动评价是否可信：JudgeBench 与人类校准。</w:t>
-      </w:r>
-      <w:r>
-        <w:rPr>
-          <w:rFonts w:ascii="Calibri" w:hAnsi="Calibri" w:eastAsia="PingFang SC"/>
-        </w:rPr>
-        <w:t xml:space="preserve"> 四个 panel：A 按 rubric module 报 judge–human pairwise accuracy/α；B 画预测置信度与实际正确率的 calibration/reliability curve；C 报 A/B 顺序、长度、格式、persona 关键词和隐私诱饵造成的准确率变化；D 画“自动覆盖率—人工成本—错误率”级联曲线，并标出预注册主榜门槛。Judge 未过门槛时，本图应直接支持降级为人评，而不是隐藏失败。</w:t>
-      </w:r>
-    </w:p>
-    <w:p>
-      <w:pPr>
-        <w:pStyle w:val="Heading2"/>
-      </w:pPr>
-      <w:r>
-        <w:t>16.2 主文四张表</w:t>
-      </w:r>
-    </w:p>
-    <w:p>
-      <w:r>
-        <w:rPr>
-          <w:rFonts w:ascii="Calibri" w:hAnsi="Calibri" w:eastAsia="PingFang SC"/>
-          <w:b/>
-        </w:rPr>
-        <w:t>Table 1 · 与最近邻 benchmark 的定位比较。</w:t>
-      </w:r>
-      <w:r>
-        <w:rPr>
-          <w:rFonts w:ascii="Calibri" w:hAnsi="Calibri" w:eastAsia="PingFang SC"/>
-        </w:rPr>
-        <w:t xml:space="preserve"> 行为 PDR-Bench、ResearchRubrics、DeepResearch Bench、PersonaTrail/APeB、PASB 和 DeepAlign；列只保留与主张有关的 task-persona absolute fit、cross-user counterfactual、must-change/hold/not、multi-cue、longitudinal stress、multi-deliverable、human validity 和 judge calibration。避免用“大而全”的勾选表代替文字论证。</w:t>
-      </w:r>
-    </w:p>
-    <w:p>
-      <w:r>
-        <w:rPr>
-          <w:rFonts w:ascii="Calibri" w:hAnsi="Calibri" w:eastAsia="PingFang SC"/>
-          <w:b/>
-        </w:rPr>
-        <w:t>Table 2 · Benchmark composition 与 empirical coverage。</w:t>
-      </w:r>
-      <w:r>
-        <w:rPr>
-          <w:rFonts w:ascii="Calibri" w:hAnsi="Calibri" w:eastAsia="PingFang SC"/>
-        </w:rPr>
-        <w:t xml:space="preserve"> 按 task stratum、research intent、deliverable、signal channel、environment、agent mode、anchor 和 stakes 报 family/episode 数、用户对数和 </w:t>
+        <w:t>Figure 4 · 信号渠道、压力和最终失败。</w:t>
+      </w:r>
+      <w:r>
+        <w:rPr>
+          <w:rFonts w:ascii="Calibri" w:hAnsi="Calibri" w:eastAsia="PingFang SC"/>
+        </w:rPr>
+        <w:t xml:space="preserve"> 四个 panel：A 用 </w:t>
       </w:r>
       <w:r>
         <w:rPr>
@@ -17922,28 +17869,13 @@
           <w:color w:val="6A3E00"/>
           <w:sz w:val="20"/>
         </w:rPr>
-        <w:t>tested</w:t>
-      </w:r>
-      <w:r>
-        <w:rPr>
-          <w:rFonts w:ascii="Calibri" w:hAnsi="Calibri" w:eastAsia="PingFang SC"/>
-        </w:rPr>
-        <w:t xml:space="preserve"> 覆盖率；另列 defined-only、structurally-inapplicable 和 deferred 数量。它证明实际测了什么，不用 ontology 的理论分支数冒充样本量。</w:t>
-      </w:r>
-    </w:p>
-    <w:p>
-      <w:r>
-        <w:rPr>
-          <w:rFonts w:ascii="Calibri" w:hAnsi="Calibri" w:eastAsia="PingFang SC"/>
-          <w:b/>
-        </w:rPr>
-        <w:t>Table 3 · 主 leaderboard 数值表。</w:t>
-      </w:r>
-      <w:r>
-        <w:rPr>
-          <w:rFonts w:ascii="Calibri" w:hAnsi="Calibri" w:eastAsia="PingFang SC"/>
-        </w:rPr>
-        <w:t xml:space="preserve"> 每行是一个可比的 </w:t>
+        <w:t>agent × signal view</w:t>
+      </w:r>
+      <w:r>
+        <w:rPr>
+          <w:rFonts w:ascii="Calibri" w:hAnsi="Calibri" w:eastAsia="PingFang SC"/>
+        </w:rPr>
+        <w:t xml:space="preserve"> heatmap 报 structured persona、natural history、clarification、workspace/history 等条件下的 CFA，并在最右两列报告 Worst-view CFA 与 Cue Gap；B 按 S0–S3 绘制各 agent 的 CFA retention curve，主文只画跨 anchor 汇总及置信区间，逐 anchor 曲线进入附录；C 按 agent 画 outcome-level failure 的堆叠横条，横条总长度是全部 episode 中的绝对失败率，而不是“已失败样本内部占比”；D 用 </w:t>
       </w:r>
       <w:r>
         <w:rPr>
@@ -17951,44 +17883,13 @@
           <w:color w:val="6A3E00"/>
           <w:sz w:val="20"/>
         </w:rPr>
-        <w:t>agent × execution regime</w:t>
-      </w:r>
-      <w:r>
-        <w:rPr>
-          <w:rFonts w:ascii="Calibri" w:hAnsi="Calibri" w:eastAsia="PingFang SC"/>
-        </w:rPr>
-        <w:t>，列为 TQ、FR、PF、MP、CFA、Worst-view CFA、Neutral Invariance、cost 和 eligibility。E1/E2/E3 分块，商业产品榜与受控 harness 榜不混排；报告置信区间或标准误，而不是只报点估计。</w:t>
-      </w:r>
-    </w:p>
-    <w:p>
-      <w:r>
-        <w:rPr>
-          <w:rFonts w:ascii="Calibri" w:hAnsi="Calibri" w:eastAsia="PingFang SC"/>
-          <w:b/>
-        </w:rPr>
-        <w:t>Table 4 · 关键对照、消融与替代解释。</w:t>
-      </w:r>
-      <w:r>
-        <w:rPr>
-          <w:rFonts w:ascii="Calibri" w:hAnsi="Calibri" w:eastAsia="PingFang SC"/>
-        </w:rPr>
-        <w:t xml:space="preserve"> 行包括 task-only、matched persona、semantic-equivalent history、clarification、irrelevant cue、wrong-user swap、去掉 must-hold/must-not、只按长度/风格匹配和去掉 TQ gate；列为 ΔCFA、Specificity Precision/Recall、Neutral Invariance、TQ/FR、judge coverage 与主要解释。它用于证明结果不是“多给了上下文”“写得更长”或“复述 persona 关键词”。</w:t>
-      </w:r>
-    </w:p>
-    <w:p>
-      <w:pPr>
-        <w:pStyle w:val="Heading2"/>
-      </w:pPr>
-      <w:r>
-        <w:t>16.3 附录图表与版面规则</w:t>
-      </w:r>
-    </w:p>
-    <w:p>
-      <w:r>
-        <w:rPr>
-          <w:rFonts w:ascii="Calibri" w:hAnsi="Calibri" w:eastAsia="PingFang SC"/>
-        </w:rPr>
-        <w:t xml:space="preserve">附录建议保留：逐 family CFA forest plot、完整 </w:t>
+        <w:t>anchor family × observed outcome failure</w:t>
+      </w:r>
+      <w:r>
+        <w:rPr>
+          <w:rFonts w:ascii="Calibri" w:hAnsi="Calibri" w:eastAsia="PingFang SC"/>
+        </w:rPr>
+        <w:t xml:space="preserve"> heatmap 显示哪类压力更容易触发用户盲、错误用户绑定、过度个性化、共同核心破坏、冲突/过期误用、隐私/权限和澄清失败，并单列 </w:t>
       </w:r>
       <w:r>
         <w:rPr>
@@ -17996,6 +17897,175 @@
           <w:color w:val="6A3E00"/>
           <w:sz w:val="20"/>
         </w:rPr>
+        <w:t>other/emergent</w:t>
+      </w:r>
+      <w:r>
+        <w:rPr>
+          <w:rFonts w:ascii="Calibri" w:hAnsi="Calibri" w:eastAsia="PingFang SC"/>
+        </w:rPr>
+        <w:t>。主文不从最终交付物反推内部机制；只有具备可比 trace 的系统，才可在附录报告 acquisition、preservation、use 或 update 的过程证据。</w:t>
+      </w:r>
+    </w:p>
+    <w:p>
+      <w:r>
+        <w:rPr>
+          <w:rFonts w:ascii="Calibri" w:hAnsi="Calibri" w:eastAsia="PingFang SC"/>
+          <w:b/>
+        </w:rPr>
+        <w:t>Figure 5 · 自动评价是否可信：JudgeBench 与人类校准。</w:t>
+      </w:r>
+      <w:r>
+        <w:rPr>
+          <w:rFonts w:ascii="Calibri" w:hAnsi="Calibri" w:eastAsia="PingFang SC"/>
+        </w:rPr>
+        <w:t xml:space="preserve"> 四个 panel：A 按 rubric module 报 judge–human pairwise accuracy/α；B 画预测置信度与实际正确率的 calibration/reliability curve；C 报 A/B 顺序、长度、格式、persona 关键词和隐私诱饵造成的准确率变化；D 画“自动覆盖率—人工成本—错误率”级联曲线，并标出预注册主榜门槛。Judge 未过门槛时，本图应直接支持降级为人评，而不是隐藏失败。</w:t>
+      </w:r>
+    </w:p>
+    <w:p>
+      <w:pPr>
+        <w:pStyle w:val="Heading2"/>
+      </w:pPr>
+      <w:r>
+        <w:t>16.2 主文四张表</w:t>
+      </w:r>
+    </w:p>
+    <w:p>
+      <w:r>
+        <w:rPr>
+          <w:rFonts w:ascii="Calibri" w:hAnsi="Calibri" w:eastAsia="PingFang SC"/>
+          <w:b/>
+        </w:rPr>
+        <w:t>Table 1 · 与最近邻 benchmark 的定位比较。</w:t>
+      </w:r>
+      <w:r>
+        <w:rPr>
+          <w:rFonts w:ascii="Calibri" w:hAnsi="Calibri" w:eastAsia="PingFang SC"/>
+        </w:rPr>
+        <w:t xml:space="preserve"> 行为 PDR-Bench、ResearchRubrics、DeepResearch Bench、PersonaTrail/APeB、PASB 和 DeepAlign；列只保留与主张有关的 task-persona absolute fit、cross-user counterfactual、must-change/hold/not、multi-cue、longitudinal stress、multi-deliverable、human validity 和 judge calibration。避免用“大而全”的勾选表代替文字论证。</w:t>
+      </w:r>
+    </w:p>
+    <w:p>
+      <w:r>
+        <w:rPr>
+          <w:rFonts w:ascii="Calibri" w:hAnsi="Calibri" w:eastAsia="PingFang SC"/>
+          <w:b/>
+        </w:rPr>
+        <w:t>Table 2 · Benchmark composition 与 empirical coverage。</w:t>
+      </w:r>
+      <w:r>
+        <w:rPr>
+          <w:rFonts w:ascii="Calibri" w:hAnsi="Calibri" w:eastAsia="PingFang SC"/>
+        </w:rPr>
+        <w:t xml:space="preserve"> 按 task stratum、research intent、deliverable、signal channel、environment、agent mode、anchor 和 stakes 报 family/episode 数、用户对数和 </w:t>
+      </w:r>
+      <w:r>
+        <w:rPr>
+          <w:rFonts w:ascii="Courier New" w:hAnsi="Courier New" w:eastAsia="PingFang SC"/>
+          <w:color w:val="6A3E00"/>
+          <w:sz w:val="20"/>
+        </w:rPr>
+        <w:t>tested</w:t>
+      </w:r>
+      <w:r>
+        <w:rPr>
+          <w:rFonts w:ascii="Calibri" w:hAnsi="Calibri" w:eastAsia="PingFang SC"/>
+        </w:rPr>
+        <w:t xml:space="preserve"> 覆盖率；另列 defined-only、structurally-inapplicable 和 deferred 数量。它证明实际测了什么，不用 ontology 的理论分支数冒充样本量。</w:t>
+      </w:r>
+    </w:p>
+    <w:p>
+      <w:r>
+        <w:rPr>
+          <w:rFonts w:ascii="Calibri" w:hAnsi="Calibri" w:eastAsia="PingFang SC"/>
+          <w:b/>
+        </w:rPr>
+        <w:t>Table 3 · 主 leaderboard 数值表。</w:t>
+      </w:r>
+      <w:r>
+        <w:rPr>
+          <w:rFonts w:ascii="Calibri" w:hAnsi="Calibri" w:eastAsia="PingFang SC"/>
+        </w:rPr>
+        <w:t xml:space="preserve"> 每行是一个可比的 </w:t>
+      </w:r>
+      <w:r>
+        <w:rPr>
+          <w:rFonts w:ascii="Courier New" w:hAnsi="Courier New" w:eastAsia="PingFang SC"/>
+          <w:color w:val="6A3E00"/>
+          <w:sz w:val="20"/>
+        </w:rPr>
+        <w:t>agent × execution regime</w:t>
+      </w:r>
+      <w:r>
+        <w:rPr>
+          <w:rFonts w:ascii="Calibri" w:hAnsi="Calibri" w:eastAsia="PingFang SC"/>
+        </w:rPr>
+        <w:t>，列为 TQ、FR、</w:t>
+      </w:r>
+      <w:r>
+        <w:rPr>
+          <w:rFonts w:ascii="Courier New" w:hAnsi="Courier New" w:eastAsia="PingFang SC"/>
+          <w:color w:val="6A3E00"/>
+          <w:sz w:val="20"/>
+        </w:rPr>
+        <w:t>PF_matched</w:t>
+      </w:r>
+      <w:r>
+        <w:rPr>
+          <w:rFonts w:ascii="Calibri" w:hAnsi="Calibri" w:eastAsia="PingFang SC"/>
+        </w:rPr>
+        <w:t>、</w:t>
+      </w:r>
+      <w:r>
+        <w:rPr>
+          <w:rFonts w:ascii="Courier New" w:hAnsi="Courier New" w:eastAsia="PingFang SC"/>
+          <w:color w:val="6A3E00"/>
+          <w:sz w:val="20"/>
+        </w:rPr>
+        <w:t>PF_swapped</w:t>
+      </w:r>
+      <w:r>
+        <w:rPr>
+          <w:rFonts w:ascii="Calibri" w:hAnsi="Calibri" w:eastAsia="PingFang SC"/>
+        </w:rPr>
+        <w:t>、MP、CFA、Worst-view CFA、Neutral Invariance、cost 和 eligibility。E1/E2/E3 分块，商业产品榜与受控 harness 榜不混排；报告置信区间或标准误，而不是只报点估计。</w:t>
+      </w:r>
+    </w:p>
+    <w:p>
+      <w:r>
+        <w:rPr>
+          <w:rFonts w:ascii="Calibri" w:hAnsi="Calibri" w:eastAsia="PingFang SC"/>
+          <w:b/>
+        </w:rPr>
+        <w:t>Table 4 · 关键对照、消融与替代解释。</w:t>
+      </w:r>
+      <w:r>
+        <w:rPr>
+          <w:rFonts w:ascii="Calibri" w:hAnsi="Calibri" w:eastAsia="PingFang SC"/>
+        </w:rPr>
+        <w:t xml:space="preserve"> 行包括 task-only、matched persona、semantic-equivalent history、clarification、irrelevant cue、wrong-user swap、去掉 must-hold/must-not、只按长度/风格匹配和去掉 TQ gate；列为 ΔCFA、Specificity Precision/Recall、Neutral Invariance、TQ/FR、judge coverage 与主要解释。它用于证明结果不是“多给了上下文”“写得更长”或“复述 persona 关键词”。</w:t>
+      </w:r>
+    </w:p>
+    <w:p>
+      <w:pPr>
+        <w:pStyle w:val="Heading2"/>
+      </w:pPr>
+      <w:r>
+        <w:t>16.3 附录图表与版面规则</w:t>
+      </w:r>
+    </w:p>
+    <w:p>
+      <w:r>
+        <w:rPr>
+          <w:rFonts w:ascii="Calibri" w:hAnsi="Calibri" w:eastAsia="PingFang SC"/>
+        </w:rPr>
+        <w:t xml:space="preserve">附录建议保留：逐 family CFA forest plot、完整 </w:t>
+      </w:r>
+      <w:r>
+        <w:rPr>
+          <w:rFonts w:ascii="Courier New" w:hAnsi="Courier New" w:eastAsia="PingFang SC"/>
+          <w:color w:val="6A3E00"/>
+          <w:sz w:val="20"/>
+        </w:rPr>
         <w:t>3 strata × 6 intents × deliverable</w:t>
       </w:r>
       <w:r>
@@ -18023,13 +18093,13 @@
     </w:p>
     <w:p>
       <w:pPr>
-        <w:spacing w:after="0" w:line="228" w:lineRule="auto"/>
+        <w:spacing w:after="0" w:line="221" w:lineRule="auto"/>
         <w:ind w:left="360" w:hanging="360"/>
       </w:pPr>
       <w:r>
         <w:rPr>
           <w:rFonts w:ascii="Calibri" w:hAnsi="Calibri" w:eastAsia="PingFang SC"/>
-          <w:sz w:val="17"/>
+          <w:sz w:val="16"/>
         </w:rPr>
         <w:t xml:space="preserve">[1] OpenCompass Team. </w:t>
       </w:r>
@@ -18037,14 +18107,14 @@
         <w:rPr>
           <w:rFonts w:ascii="Calibri" w:hAnsi="Calibri" w:eastAsia="PingFang SC"/>
           <w:i/>
-          <w:sz w:val="17"/>
+          <w:sz w:val="16"/>
         </w:rPr>
         <w:t>OpenCompass: A Universal Evaluation Platform for Large Language Models</w:t>
       </w:r>
       <w:r>
         <w:rPr>
           <w:rFonts w:ascii="Calibri" w:hAnsi="Calibri" w:eastAsia="PingFang SC"/>
-          <w:sz w:val="17"/>
+          <w:sz w:val="16"/>
         </w:rPr>
         <w:t xml:space="preserve">. arXiv:2605.19276, 2026. </w:t>
       </w:r>
@@ -18063,13 +18133,13 @@
     </w:p>
     <w:p>
       <w:pPr>
-        <w:spacing w:after="0" w:line="228" w:lineRule="auto"/>
+        <w:spacing w:after="0" w:line="221" w:lineRule="auto"/>
         <w:ind w:left="360" w:hanging="360"/>
       </w:pPr>
       <w:r>
         <w:rPr>
           <w:rFonts w:ascii="Calibri" w:hAnsi="Calibri" w:eastAsia="PingFang SC"/>
-          <w:sz w:val="17"/>
+          <w:sz w:val="16"/>
         </w:rPr>
         <w:t xml:space="preserve">[2] ModelScope. </w:t>
       </w:r>
@@ -18077,14 +18147,14 @@
         <w:rPr>
           <w:rFonts w:ascii="Calibri" w:hAnsi="Calibri" w:eastAsia="PingFang SC"/>
           <w:i/>
-          <w:sz w:val="17"/>
+          <w:sz w:val="16"/>
         </w:rPr>
         <w:t>EvalScope Introduction</w:t>
       </w:r>
       <w:r>
         <w:rPr>
           <w:rFonts w:ascii="Calibri" w:hAnsi="Calibri" w:eastAsia="PingFang SC"/>
-          <w:sz w:val="17"/>
+          <w:sz w:val="16"/>
         </w:rPr>
         <w:t xml:space="preserve">. </w:t>
       </w:r>
@@ -18103,13 +18173,13 @@
     </w:p>
     <w:p>
       <w:pPr>
-        <w:spacing w:after="0" w:line="228" w:lineRule="auto"/>
+        <w:spacing w:after="0" w:line="221" w:lineRule="auto"/>
         <w:ind w:left="360" w:hanging="360"/>
       </w:pPr>
       <w:r>
         <w:rPr>
           <w:rFonts w:ascii="Calibri" w:hAnsi="Calibri" w:eastAsia="PingFang SC"/>
-          <w:sz w:val="17"/>
+          <w:sz w:val="16"/>
         </w:rPr>
         <w:t xml:space="preserve">[3] Zhang et al. </w:t>
       </w:r>
@@ -18117,14 +18187,14 @@
         <w:rPr>
           <w:rFonts w:ascii="Calibri" w:hAnsi="Calibri" w:eastAsia="PingFang SC"/>
           <w:i/>
-          <w:sz w:val="17"/>
+          <w:sz w:val="16"/>
         </w:rPr>
         <w:t>Agent-SafetyBench: Evaluating the Safety of LLM Agents</w:t>
       </w:r>
       <w:r>
         <w:rPr>
           <w:rFonts w:ascii="Calibri" w:hAnsi="Calibri" w:eastAsia="PingFang SC"/>
-          <w:sz w:val="17"/>
+          <w:sz w:val="16"/>
         </w:rPr>
         <w:t xml:space="preserve">. arXiv:2412.14470, 2024/2025. </w:t>
       </w:r>
@@ -18143,13 +18213,13 @@
     </w:p>
     <w:p>
       <w:pPr>
-        <w:spacing w:after="0" w:line="228" w:lineRule="auto"/>
+        <w:spacing w:after="0" w:line="221" w:lineRule="auto"/>
         <w:ind w:left="360" w:hanging="360"/>
       </w:pPr>
       <w:r>
         <w:rPr>
           <w:rFonts w:ascii="Calibri" w:hAnsi="Calibri" w:eastAsia="PingFang SC"/>
-          <w:sz w:val="17"/>
+          <w:sz w:val="16"/>
         </w:rPr>
         <w:t xml:space="preserve">[4] </w:t>
       </w:r>
@@ -18157,14 +18227,14 @@
         <w:rPr>
           <w:rFonts w:ascii="Calibri" w:hAnsi="Calibri" w:eastAsia="PingFang SC"/>
           <w:i/>
-          <w:sz w:val="17"/>
+          <w:sz w:val="16"/>
         </w:rPr>
         <w:t>Towards Personalized Deep Research: Benchmarks and Evaluations</w:t>
       </w:r>
       <w:r>
         <w:rPr>
           <w:rFonts w:ascii="Calibri" w:hAnsi="Calibri" w:eastAsia="PingFang SC"/>
-          <w:sz w:val="17"/>
+          <w:sz w:val="16"/>
         </w:rPr>
         <w:t xml:space="preserve">. arXiv:2509.25106; ICLR 2026. </w:t>
       </w:r>
@@ -18183,13 +18253,13 @@
     </w:p>
     <w:p>
       <w:pPr>
-        <w:spacing w:after="0" w:line="228" w:lineRule="auto"/>
+        <w:spacing w:after="0" w:line="221" w:lineRule="auto"/>
         <w:ind w:left="360" w:hanging="360"/>
       </w:pPr>
       <w:r>
         <w:rPr>
           <w:rFonts w:ascii="Calibri" w:hAnsi="Calibri" w:eastAsia="PingFang SC"/>
-          <w:sz w:val="17"/>
+          <w:sz w:val="16"/>
         </w:rPr>
         <w:t xml:space="preserve">[5] Mind Lab. </w:t>
       </w:r>
@@ -18197,14 +18267,14 @@
         <w:rPr>
           <w:rFonts w:ascii="Calibri" w:hAnsi="Calibri" w:eastAsia="PingFang SC"/>
           <w:i/>
-          <w:sz w:val="17"/>
+          <w:sz w:val="16"/>
         </w:rPr>
         <w:t>Macaron-V1-Preview: LivingBench</w:t>
       </w:r>
       <w:r>
         <w:rPr>
           <w:rFonts w:ascii="Calibri" w:hAnsi="Calibri" w:eastAsia="PingFang SC"/>
-          <w:sz w:val="17"/>
+          <w:sz w:val="16"/>
         </w:rPr>
         <w:t xml:space="preserve">. </w:t>
       </w:r>
@@ -18223,13 +18293,13 @@
     </w:p>
     <w:p>
       <w:pPr>
-        <w:spacing w:after="0" w:line="228" w:lineRule="auto"/>
+        <w:spacing w:after="0" w:line="221" w:lineRule="auto"/>
         <w:ind w:left="360" w:hanging="360"/>
       </w:pPr>
       <w:r>
         <w:rPr>
           <w:rFonts w:ascii="Calibri" w:hAnsi="Calibri" w:eastAsia="PingFang SC"/>
-          <w:sz w:val="17"/>
+          <w:sz w:val="16"/>
         </w:rPr>
         <w:t xml:space="preserve">[6] Du et al. </w:t>
       </w:r>
@@ -18237,14 +18307,14 @@
         <w:rPr>
           <w:rFonts w:ascii="Calibri" w:hAnsi="Calibri" w:eastAsia="PingFang SC"/>
           <w:i/>
-          <w:sz w:val="17"/>
+          <w:sz w:val="16"/>
         </w:rPr>
         <w:t>DeepResearch Bench: A Comprehensive Benchmark for Deep Research Agents</w:t>
       </w:r>
       <w:r>
         <w:rPr>
           <w:rFonts w:ascii="Calibri" w:hAnsi="Calibri" w:eastAsia="PingFang SC"/>
-          <w:sz w:val="17"/>
+          <w:sz w:val="16"/>
         </w:rPr>
         <w:t xml:space="preserve">. arXiv:2506.11763. </w:t>
       </w:r>
@@ -18263,13 +18333,13 @@
     </w:p>
     <w:p>
       <w:pPr>
-        <w:spacing w:after="0" w:line="228" w:lineRule="auto"/>
+        <w:spacing w:after="0" w:line="221" w:lineRule="auto"/>
         <w:ind w:left="360" w:hanging="360"/>
       </w:pPr>
       <w:r>
         <w:rPr>
           <w:rFonts w:ascii="Calibri" w:hAnsi="Calibri" w:eastAsia="PingFang SC"/>
-          <w:sz w:val="17"/>
+          <w:sz w:val="16"/>
         </w:rPr>
         <w:t xml:space="preserve">[7] Gou et al. </w:t>
       </w:r>
@@ -18277,14 +18347,14 @@
         <w:rPr>
           <w:rFonts w:ascii="Calibri" w:hAnsi="Calibri" w:eastAsia="PingFang SC"/>
           <w:i/>
-          <w:sz w:val="17"/>
+          <w:sz w:val="16"/>
         </w:rPr>
         <w:t>Mind2Web 2: Evaluating Agentic Search with Agent-as-a-Judge</w:t>
       </w:r>
       <w:r>
         <w:rPr>
           <w:rFonts w:ascii="Calibri" w:hAnsi="Calibri" w:eastAsia="PingFang SC"/>
-          <w:sz w:val="17"/>
+          <w:sz w:val="16"/>
         </w:rPr>
         <w:t xml:space="preserve">. arXiv:2506.21506. </w:t>
       </w:r>
@@ -18303,13 +18373,13 @@
     </w:p>
     <w:p>
       <w:pPr>
-        <w:spacing w:after="0" w:line="228" w:lineRule="auto"/>
+        <w:spacing w:after="0" w:line="221" w:lineRule="auto"/>
         <w:ind w:left="360" w:hanging="360"/>
       </w:pPr>
       <w:r>
         <w:rPr>
           <w:rFonts w:ascii="Calibri" w:hAnsi="Calibri" w:eastAsia="PingFang SC"/>
-          <w:sz w:val="17"/>
+          <w:sz w:val="16"/>
         </w:rPr>
         <w:t xml:space="preserve">[8] Chen et al. </w:t>
       </w:r>
@@ -18317,14 +18387,14 @@
         <w:rPr>
           <w:rFonts w:ascii="Calibri" w:hAnsi="Calibri" w:eastAsia="PingFang SC"/>
           <w:i/>
-          <w:sz w:val="17"/>
+          <w:sz w:val="16"/>
         </w:rPr>
         <w:t>BrowseComp-Plus: A More Fair and Transparent Evaluation Benchmark of Deep-Research Agent</w:t>
       </w:r>
       <w:r>
         <w:rPr>
           <w:rFonts w:ascii="Calibri" w:hAnsi="Calibri" w:eastAsia="PingFang SC"/>
-          <w:sz w:val="17"/>
+          <w:sz w:val="16"/>
         </w:rPr>
         <w:t xml:space="preserve">. arXiv:2508.06600. </w:t>
       </w:r>
@@ -18343,13 +18413,13 @@
     </w:p>
     <w:p>
       <w:pPr>
-        <w:spacing w:after="0" w:line="228" w:lineRule="auto"/>
+        <w:spacing w:after="0" w:line="221" w:lineRule="auto"/>
         <w:ind w:left="360" w:hanging="360"/>
       </w:pPr>
       <w:r>
         <w:rPr>
           <w:rFonts w:ascii="Calibri" w:hAnsi="Calibri" w:eastAsia="PingFang SC"/>
-          <w:sz w:val="17"/>
+          <w:sz w:val="16"/>
         </w:rPr>
         <w:t xml:space="preserve">[9] Starace et al. </w:t>
       </w:r>
@@ -18357,14 +18427,14 @@
         <w:rPr>
           <w:rFonts w:ascii="Calibri" w:hAnsi="Calibri" w:eastAsia="PingFang SC"/>
           <w:i/>
-          <w:sz w:val="17"/>
+          <w:sz w:val="16"/>
         </w:rPr>
         <w:t>PaperBench: Evaluating AI’s Ability to Replicate AI Research</w:t>
       </w:r>
       <w:r>
         <w:rPr>
           <w:rFonts w:ascii="Calibri" w:hAnsi="Calibri" w:eastAsia="PingFang SC"/>
-          <w:sz w:val="17"/>
+          <w:sz w:val="16"/>
         </w:rPr>
         <w:t xml:space="preserve">. OpenAI, 2025. </w:t>
       </w:r>
@@ -18383,13 +18453,13 @@
     </w:p>
     <w:p>
       <w:pPr>
-        <w:spacing w:after="0" w:line="228" w:lineRule="auto"/>
+        <w:spacing w:after="0" w:line="221" w:lineRule="auto"/>
         <w:ind w:left="360" w:hanging="360"/>
       </w:pPr>
       <w:r>
         <w:rPr>
           <w:rFonts w:ascii="Calibri" w:hAnsi="Calibri" w:eastAsia="PingFang SC"/>
-          <w:sz w:val="17"/>
+          <w:sz w:val="16"/>
         </w:rPr>
         <w:t xml:space="preserve">[10] Wang et al. </w:t>
       </w:r>
@@ -18397,14 +18467,14 @@
         <w:rPr>
           <w:rFonts w:ascii="Calibri" w:hAnsi="Calibri" w:eastAsia="PingFang SC"/>
           <w:i/>
-          <w:sz w:val="17"/>
+          <w:sz w:val="16"/>
         </w:rPr>
         <w:t>LiveResearchBench: A Live Benchmark for User-Centric Deep Research in the Wild</w:t>
       </w:r>
       <w:r>
         <w:rPr>
           <w:rFonts w:ascii="Calibri" w:hAnsi="Calibri" w:eastAsia="PingFang SC"/>
-          <w:sz w:val="17"/>
+          <w:sz w:val="16"/>
         </w:rPr>
         <w:t xml:space="preserve">. </w:t>
       </w:r>
@@ -18423,13 +18493,13 @@
     </w:p>
     <w:p>
       <w:pPr>
-        <w:spacing w:after="0" w:line="228" w:lineRule="auto"/>
+        <w:spacing w:after="0" w:line="221" w:lineRule="auto"/>
         <w:ind w:left="360" w:hanging="360"/>
       </w:pPr>
       <w:r>
         <w:rPr>
           <w:rFonts w:ascii="Calibri" w:hAnsi="Calibri" w:eastAsia="PingFang SC"/>
-          <w:sz w:val="17"/>
+          <w:sz w:val="16"/>
         </w:rPr>
         <w:t xml:space="preserve">[11] Coelho et al. </w:t>
       </w:r>
@@ -18437,14 +18507,14 @@
         <w:rPr>
           <w:rFonts w:ascii="Calibri" w:hAnsi="Calibri" w:eastAsia="PingFang SC"/>
           <w:i/>
-          <w:sz w:val="17"/>
+          <w:sz w:val="16"/>
         </w:rPr>
         <w:t>DeepResearchGym: A Free, Transparent, and Reproducible Evaluation Sandbox for Deep Research</w:t>
       </w:r>
       <w:r>
         <w:rPr>
           <w:rFonts w:ascii="Calibri" w:hAnsi="Calibri" w:eastAsia="PingFang SC"/>
-          <w:sz w:val="17"/>
+          <w:sz w:val="16"/>
         </w:rPr>
         <w:t xml:space="preserve">. arXiv:2505.19253. </w:t>
       </w:r>
@@ -18463,13 +18533,13 @@
     </w:p>
     <w:p>
       <w:pPr>
-        <w:spacing w:after="0" w:line="228" w:lineRule="auto"/>
+        <w:spacing w:after="0" w:line="221" w:lineRule="auto"/>
         <w:ind w:left="360" w:hanging="360"/>
       </w:pPr>
       <w:r>
         <w:rPr>
           <w:rFonts w:ascii="Calibri" w:hAnsi="Calibri" w:eastAsia="PingFang SC"/>
-          <w:sz w:val="17"/>
+          <w:sz w:val="16"/>
         </w:rPr>
         <w:t xml:space="preserve">[12] Abaskohi et al. </w:t>
       </w:r>
@@ -18477,14 +18547,14 @@
         <w:rPr>
           <w:rFonts w:ascii="Calibri" w:hAnsi="Calibri" w:eastAsia="PingFang SC"/>
           <w:i/>
-          <w:sz w:val="17"/>
+          <w:sz w:val="16"/>
         </w:rPr>
         <w:t>DRBench: A Realistic Benchmark for Enterprise Deep Research</w:t>
       </w:r>
       <w:r>
         <w:rPr>
           <w:rFonts w:ascii="Calibri" w:hAnsi="Calibri" w:eastAsia="PingFang SC"/>
-          <w:sz w:val="17"/>
+          <w:sz w:val="16"/>
         </w:rPr>
         <w:t xml:space="preserve">. arXiv:2510.00172; ICLR 2026. </w:t>
       </w:r>
@@ -18503,13 +18573,13 @@
     </w:p>
     <w:p>
       <w:pPr>
-        <w:spacing w:after="0" w:line="228" w:lineRule="auto"/>
+        <w:spacing w:after="0" w:line="221" w:lineRule="auto"/>
         <w:ind w:left="360" w:hanging="360"/>
       </w:pPr>
       <w:r>
         <w:rPr>
           <w:rFonts w:ascii="Calibri" w:hAnsi="Calibri" w:eastAsia="PingFang SC"/>
-          <w:sz w:val="17"/>
+          <w:sz w:val="16"/>
         </w:rPr>
         <w:t xml:space="preserve">[13] White et al. </w:t>
       </w:r>
@@ -18517,14 +18587,14 @@
         <w:rPr>
           <w:rFonts w:ascii="Calibri" w:hAnsi="Calibri" w:eastAsia="PingFang SC"/>
           <w:i/>
-          <w:sz w:val="17"/>
+          <w:sz w:val="16"/>
         </w:rPr>
         <w:t>LiveBench: A Challenging, Contamination-Free LLM Benchmark</w:t>
       </w:r>
       <w:r>
         <w:rPr>
           <w:rFonts w:ascii="Calibri" w:hAnsi="Calibri" w:eastAsia="PingFang SC"/>
-          <w:sz w:val="17"/>
+          <w:sz w:val="16"/>
         </w:rPr>
         <w:t xml:space="preserve">. ICLR 2025. </w:t>
       </w:r>
@@ -18543,13 +18613,13 @@
     </w:p>
     <w:p>
       <w:pPr>
-        <w:spacing w:after="0" w:line="228" w:lineRule="auto"/>
+        <w:spacing w:after="0" w:line="221" w:lineRule="auto"/>
         <w:ind w:left="360" w:hanging="360"/>
       </w:pPr>
       <w:r>
         <w:rPr>
           <w:rFonts w:ascii="Calibri" w:hAnsi="Calibri" w:eastAsia="PingFang SC"/>
-          <w:sz w:val="17"/>
+          <w:sz w:val="16"/>
         </w:rPr>
         <w:t xml:space="preserve">[14] Zhu et al. </w:t>
       </w:r>
@@ -18557,14 +18627,14 @@
         <w:rPr>
           <w:rFonts w:ascii="Calibri" w:hAnsi="Calibri" w:eastAsia="PingFang SC"/>
           <w:i/>
-          <w:sz w:val="17"/>
+          <w:sz w:val="16"/>
         </w:rPr>
         <w:t>JudgeLM: Fine-tuned Large Language Models are Scalable Judges</w:t>
       </w:r>
       <w:r>
         <w:rPr>
           <w:rFonts w:ascii="Calibri" w:hAnsi="Calibri" w:eastAsia="PingFang SC"/>
-          <w:sz w:val="17"/>
+          <w:sz w:val="16"/>
         </w:rPr>
         <w:t xml:space="preserve">. arXiv:2310.17631, 2023. </w:t>
       </w:r>
@@ -18583,13 +18653,13 @@
     </w:p>
     <w:p>
       <w:pPr>
-        <w:spacing w:after="0" w:line="228" w:lineRule="auto"/>
+        <w:spacing w:after="0" w:line="221" w:lineRule="auto"/>
         <w:ind w:left="360" w:hanging="360"/>
       </w:pPr>
       <w:r>
         <w:rPr>
           <w:rFonts w:ascii="Calibri" w:hAnsi="Calibri" w:eastAsia="PingFang SC"/>
-          <w:sz w:val="17"/>
+          <w:sz w:val="16"/>
         </w:rPr>
         <w:t xml:space="preserve">[15] Kim et al. </w:t>
       </w:r>
@@ -18597,14 +18667,14 @@
         <w:rPr>
           <w:rFonts w:ascii="Calibri" w:hAnsi="Calibri" w:eastAsia="PingFang SC"/>
           <w:i/>
-          <w:sz w:val="17"/>
+          <w:sz w:val="16"/>
         </w:rPr>
         <w:t>Prometheus 2: An Open Source Language Model Specialized in Evaluating Other Language Models</w:t>
       </w:r>
       <w:r>
         <w:rPr>
           <w:rFonts w:ascii="Calibri" w:hAnsi="Calibri" w:eastAsia="PingFang SC"/>
-          <w:sz w:val="17"/>
+          <w:sz w:val="16"/>
         </w:rPr>
         <w:t xml:space="preserve">. arXiv:2405.01535, 2024. </w:t>
       </w:r>
@@ -18623,13 +18693,13 @@
     </w:p>
     <w:p>
       <w:pPr>
-        <w:spacing w:after="0" w:line="228" w:lineRule="auto"/>
+        <w:spacing w:after="0" w:line="221" w:lineRule="auto"/>
         <w:ind w:left="360" w:hanging="360"/>
       </w:pPr>
       <w:r>
         <w:rPr>
           <w:rFonts w:ascii="Calibri" w:hAnsi="Calibri" w:eastAsia="PingFang SC"/>
-          <w:sz w:val="17"/>
+          <w:sz w:val="16"/>
         </w:rPr>
         <w:t xml:space="preserve">[16] Huang et al. </w:t>
       </w:r>
@@ -18637,14 +18707,14 @@
         <w:rPr>
           <w:rFonts w:ascii="Calibri" w:hAnsi="Calibri" w:eastAsia="PingFang SC"/>
           <w:i/>
-          <w:sz w:val="17"/>
+          <w:sz w:val="16"/>
         </w:rPr>
         <w:t>An Empirical Study of LLM-as-a-Judge for LLM Evaluation: Fine-tuned Judge Model is not a General Substitute for GPT-4</w:t>
       </w:r>
       <w:r>
         <w:rPr>
           <w:rFonts w:ascii="Calibri" w:hAnsi="Calibri" w:eastAsia="PingFang SC"/>
-          <w:sz w:val="17"/>
+          <w:sz w:val="16"/>
         </w:rPr>
         <w:t xml:space="preserve">. arXiv:2403.02839, 2024. </w:t>
       </w:r>
@@ -18663,13 +18733,13 @@
     </w:p>
     <w:p>
       <w:pPr>
-        <w:spacing w:after="0" w:line="228" w:lineRule="auto"/>
+        <w:spacing w:after="0" w:line="221" w:lineRule="auto"/>
         <w:ind w:left="360" w:hanging="360"/>
       </w:pPr>
       <w:r>
         <w:rPr>
           <w:rFonts w:ascii="Calibri" w:hAnsi="Calibri" w:eastAsia="PingFang SC"/>
-          <w:sz w:val="17"/>
+          <w:sz w:val="16"/>
         </w:rPr>
         <w:t xml:space="preserve">[17] Java et al. </w:t>
       </w:r>
@@ -18677,14 +18747,14 @@
         <w:rPr>
           <w:rFonts w:ascii="Calibri" w:hAnsi="Calibri" w:eastAsia="PingFang SC"/>
           <w:i/>
-          <w:sz w:val="17"/>
+          <w:sz w:val="16"/>
         </w:rPr>
         <w:t>Characterizing Deep Research: A Benchmark and Formal Definition</w:t>
       </w:r>
       <w:r>
         <w:rPr>
           <w:rFonts w:ascii="Calibri" w:hAnsi="Calibri" w:eastAsia="PingFang SC"/>
-          <w:sz w:val="17"/>
+          <w:sz w:val="16"/>
         </w:rPr>
         <w:t xml:space="preserve">. arXiv:2508.04183; ICLR 2026. </w:t>
       </w:r>
@@ -18703,13 +18773,13 @@
     </w:p>
     <w:p>
       <w:pPr>
-        <w:spacing w:after="0" w:line="228" w:lineRule="auto"/>
+        <w:spacing w:after="0" w:line="221" w:lineRule="auto"/>
         <w:ind w:left="360" w:hanging="360"/>
       </w:pPr>
       <w:r>
         <w:rPr>
           <w:rFonts w:ascii="Calibri" w:hAnsi="Calibri" w:eastAsia="PingFang SC"/>
-          <w:sz w:val="17"/>
+          <w:sz w:val="16"/>
         </w:rPr>
         <w:t xml:space="preserve">[18] Sharma et al. </w:t>
       </w:r>
@@ -18717,14 +18787,14 @@
         <w:rPr>
           <w:rFonts w:ascii="Calibri" w:hAnsi="Calibri" w:eastAsia="PingFang SC"/>
           <w:i/>
-          <w:sz w:val="17"/>
+          <w:sz w:val="16"/>
         </w:rPr>
         <w:t>ResearchRubrics: A Benchmark of Prompts and Rubrics for Evaluating Deep Research Agents</w:t>
       </w:r>
       <w:r>
         <w:rPr>
           <w:rFonts w:ascii="Calibri" w:hAnsi="Calibri" w:eastAsia="PingFang SC"/>
-          <w:sz w:val="17"/>
+          <w:sz w:val="16"/>
         </w:rPr>
         <w:t xml:space="preserve">. arXiv:2511.07685; ICLR 2026. </w:t>
       </w:r>
@@ -18743,13 +18813,13 @@
     </w:p>
     <w:p>
       <w:pPr>
-        <w:spacing w:after="0" w:line="228" w:lineRule="auto"/>
+        <w:spacing w:after="0" w:line="221" w:lineRule="auto"/>
         <w:ind w:left="360" w:hanging="360"/>
       </w:pPr>
       <w:r>
         <w:rPr>
           <w:rFonts w:ascii="Calibri" w:hAnsi="Calibri" w:eastAsia="PingFang SC"/>
-          <w:sz w:val="17"/>
+          <w:sz w:val="16"/>
         </w:rPr>
         <w:t xml:space="preserve">[19] Yoran et al. </w:t>
       </w:r>
@@ -18757,14 +18827,14 @@
         <w:rPr>
           <w:rFonts w:ascii="Calibri" w:hAnsi="Calibri" w:eastAsia="PingFang SC"/>
           <w:i/>
-          <w:sz w:val="17"/>
+          <w:sz w:val="16"/>
         </w:rPr>
         <w:t>AssistantBench: Can Web Agents Solve Realistic and Time-Consuming Tasks?</w:t>
       </w:r>
       <w:r>
         <w:rPr>
           <w:rFonts w:ascii="Calibri" w:hAnsi="Calibri" w:eastAsia="PingFang SC"/>
-          <w:sz w:val="17"/>
+          <w:sz w:val="16"/>
         </w:rPr>
         <w:t xml:space="preserve"> arXiv:2407.15711, 2024. </w:t>
       </w:r>
@@ -18783,13 +18853,13 @@
     </w:p>
     <w:p>
       <w:pPr>
-        <w:spacing w:after="0" w:line="228" w:lineRule="auto"/>
+        <w:spacing w:after="0" w:line="221" w:lineRule="auto"/>
         <w:ind w:left="360" w:hanging="360"/>
       </w:pPr>
       <w:r>
         <w:rPr>
           <w:rFonts w:ascii="Calibri" w:hAnsi="Calibri" w:eastAsia="PingFang SC"/>
-          <w:sz w:val="17"/>
+          <w:sz w:val="16"/>
         </w:rPr>
         <w:t xml:space="preserve">[20] Rosset et al. </w:t>
       </w:r>
@@ -18797,14 +18867,14 @@
         <w:rPr>
           <w:rFonts w:ascii="Calibri" w:hAnsi="Calibri" w:eastAsia="PingFang SC"/>
           <w:i/>
-          <w:sz w:val="17"/>
+          <w:sz w:val="16"/>
         </w:rPr>
         <w:t>Researchy Questions: A Dataset of Multi-Perspective, Decompositional Questions for LLM Web Agents</w:t>
       </w:r>
       <w:r>
         <w:rPr>
           <w:rFonts w:ascii="Calibri" w:hAnsi="Calibri" w:eastAsia="PingFang SC"/>
-          <w:sz w:val="17"/>
+          <w:sz w:val="16"/>
         </w:rPr>
         <w:t xml:space="preserve">. arXiv:2402.17896, 2024. </w:t>
       </w:r>
@@ -18823,13 +18893,13 @@
     </w:p>
     <w:p>
       <w:pPr>
-        <w:spacing w:after="0" w:line="228" w:lineRule="auto"/>
+        <w:spacing w:after="0" w:line="221" w:lineRule="auto"/>
         <w:ind w:left="360" w:hanging="360"/>
       </w:pPr>
       <w:r>
         <w:rPr>
           <w:rFonts w:ascii="Calibri" w:hAnsi="Calibri" w:eastAsia="PingFang SC"/>
-          <w:sz w:val="17"/>
+          <w:sz w:val="16"/>
         </w:rPr>
         <w:t xml:space="preserve">[21] Xu et al. </w:t>
       </w:r>
@@ -18837,14 +18907,14 @@
         <w:rPr>
           <w:rFonts w:ascii="Calibri" w:hAnsi="Calibri" w:eastAsia="PingFang SC"/>
           <w:i/>
-          <w:sz w:val="17"/>
+          <w:sz w:val="16"/>
         </w:rPr>
         <w:t>ResearcherBench: Evaluating Deep AI Research Systems on the Frontiers of Scientific Inquiry</w:t>
       </w:r>
       <w:r>
         <w:rPr>
           <w:rFonts w:ascii="Calibri" w:hAnsi="Calibri" w:eastAsia="PingFang SC"/>
-          <w:sz w:val="17"/>
+          <w:sz w:val="16"/>
         </w:rPr>
         <w:t xml:space="preserve">. arXiv:2507.16280, 2025. </w:t>
       </w:r>
@@ -18863,13 +18933,13 @@
     </w:p>
     <w:p>
       <w:pPr>
-        <w:spacing w:after="0" w:line="228" w:lineRule="auto"/>
+        <w:spacing w:after="0" w:line="221" w:lineRule="auto"/>
         <w:ind w:left="360" w:hanging="360"/>
       </w:pPr>
       <w:r>
         <w:rPr>
           <w:rFonts w:ascii="Calibri" w:hAnsi="Calibri" w:eastAsia="PingFang SC"/>
-          <w:sz w:val="17"/>
+          <w:sz w:val="16"/>
         </w:rPr>
         <w:t xml:space="preserve">[22] Liang et al. </w:t>
       </w:r>
@@ -18877,14 +18947,14 @@
         <w:rPr>
           <w:rFonts w:ascii="Calibri" w:hAnsi="Calibri" w:eastAsia="PingFang SC"/>
           <w:i/>
-          <w:sz w:val="17"/>
+          <w:sz w:val="16"/>
         </w:rPr>
         <w:t>Holistic Evaluation of Language Models</w:t>
       </w:r>
       <w:r>
         <w:rPr>
           <w:rFonts w:ascii="Calibri" w:hAnsi="Calibri" w:eastAsia="PingFang SC"/>
-          <w:sz w:val="17"/>
+          <w:sz w:val="16"/>
         </w:rPr>
         <w:t xml:space="preserve">. TMLR, 2023. </w:t>
       </w:r>
@@ -18903,13 +18973,13 @@
     </w:p>
     <w:p>
       <w:pPr>
-        <w:spacing w:after="0" w:line="228" w:lineRule="auto"/>
+        <w:spacing w:after="0" w:line="221" w:lineRule="auto"/>
         <w:ind w:left="360" w:hanging="360"/>
       </w:pPr>
       <w:r>
         <w:rPr>
           <w:rFonts w:ascii="Calibri" w:hAnsi="Calibri" w:eastAsia="PingFang SC"/>
-          <w:sz w:val="17"/>
+          <w:sz w:val="16"/>
         </w:rPr>
         <w:t xml:space="preserve">[23] Ribeiro et al. </w:t>
       </w:r>
@@ -18917,14 +18987,14 @@
         <w:rPr>
           <w:rFonts w:ascii="Calibri" w:hAnsi="Calibri" w:eastAsia="PingFang SC"/>
           <w:i/>
-          <w:sz w:val="17"/>
+          <w:sz w:val="16"/>
         </w:rPr>
         <w:t>Beyond Accuracy: Behavioral Testing of NLP Models with CheckList</w:t>
       </w:r>
       <w:r>
         <w:rPr>
           <w:rFonts w:ascii="Calibri" w:hAnsi="Calibri" w:eastAsia="PingFang SC"/>
-          <w:sz w:val="17"/>
+          <w:sz w:val="16"/>
         </w:rPr>
         <w:t xml:space="preserve">. ACL, 2020. </w:t>
       </w:r>
@@ -18943,13 +19013,13 @@
     </w:p>
     <w:p>
       <w:pPr>
-        <w:spacing w:after="0" w:line="228" w:lineRule="auto"/>
+        <w:spacing w:after="0" w:line="221" w:lineRule="auto"/>
         <w:ind w:left="360" w:hanging="360"/>
       </w:pPr>
       <w:r>
         <w:rPr>
           <w:rFonts w:ascii="Calibri" w:hAnsi="Calibri" w:eastAsia="PingFang SC"/>
-          <w:sz w:val="17"/>
+          <w:sz w:val="16"/>
         </w:rPr>
         <w:t xml:space="preserve">[24] Reuel et al. </w:t>
       </w:r>
@@ -18957,14 +19027,14 @@
         <w:rPr>
           <w:rFonts w:ascii="Calibri" w:hAnsi="Calibri" w:eastAsia="PingFang SC"/>
           <w:i/>
-          <w:sz w:val="17"/>
+          <w:sz w:val="16"/>
         </w:rPr>
         <w:t>BetterBench: Assessing AI Benchmarks, Uncovering Issues, and Establishing Best Practices</w:t>
       </w:r>
       <w:r>
         <w:rPr>
           <w:rFonts w:ascii="Calibri" w:hAnsi="Calibri" w:eastAsia="PingFang SC"/>
-          <w:sz w:val="17"/>
+          <w:sz w:val="16"/>
         </w:rPr>
         <w:t xml:space="preserve">. arXiv:2411.12990, 2024. </w:t>
       </w:r>
@@ -18983,13 +19053,13 @@
     </w:p>
     <w:p>
       <w:pPr>
-        <w:spacing w:after="0" w:line="228" w:lineRule="auto"/>
+        <w:spacing w:after="0" w:line="221" w:lineRule="auto"/>
         <w:ind w:left="360" w:hanging="360"/>
       </w:pPr>
       <w:r>
         <w:rPr>
           <w:rFonts w:ascii="Calibri" w:hAnsi="Calibri" w:eastAsia="PingFang SC"/>
-          <w:sz w:val="17"/>
+          <w:sz w:val="16"/>
         </w:rPr>
         <w:t xml:space="preserve">[25] Sokol et al. </w:t>
       </w:r>
@@ -18997,14 +19067,14 @@
         <w:rPr>
           <w:rFonts w:ascii="Calibri" w:hAnsi="Calibri" w:eastAsia="PingFang SC"/>
           <w:i/>
-          <w:sz w:val="17"/>
+          <w:sz w:val="16"/>
         </w:rPr>
         <w:t>BenchmarkCards: Standardized Documentation for Large Language Model Benchmarks</w:t>
       </w:r>
       <w:r>
         <w:rPr>
           <w:rFonts w:ascii="Calibri" w:hAnsi="Calibri" w:eastAsia="PingFang SC"/>
-          <w:sz w:val="17"/>
+          <w:sz w:val="16"/>
         </w:rPr>
         <w:t xml:space="preserve">. NeurIPS Datasets and Benchmarks, 2025. </w:t>
       </w:r>
@@ -19023,13 +19093,13 @@
     </w:p>
     <w:p>
       <w:pPr>
-        <w:spacing w:after="0" w:line="228" w:lineRule="auto"/>
+        <w:spacing w:after="0" w:line="221" w:lineRule="auto"/>
         <w:ind w:left="360" w:hanging="360"/>
       </w:pPr>
       <w:r>
         <w:rPr>
           <w:rFonts w:ascii="Calibri" w:hAnsi="Calibri" w:eastAsia="PingFang SC"/>
-          <w:sz w:val="17"/>
+          <w:sz w:val="16"/>
         </w:rPr>
         <w:t xml:space="preserve">[26] Zeng et al. </w:t>
       </w:r>
@@ -19037,14 +19107,14 @@
         <w:rPr>
           <w:rFonts w:ascii="Calibri" w:hAnsi="Calibri" w:eastAsia="PingFang SC"/>
           <w:i/>
-          <w:sz w:val="17"/>
+          <w:sz w:val="16"/>
         </w:rPr>
         <w:t>Setoka: A Benchmark for Hierarchical User Understanding in Personalized Agents over Heterogeneous Data</w:t>
       </w:r>
       <w:r>
         <w:rPr>
           <w:rFonts w:ascii="Calibri" w:hAnsi="Calibri" w:eastAsia="PingFang SC"/>
-          <w:sz w:val="17"/>
+          <w:sz w:val="16"/>
         </w:rPr>
         <w:t xml:space="preserve">. arXiv:2607.27056, 2026. </w:t>
       </w:r>
@@ -19063,13 +19133,13 @@
     </w:p>
     <w:p>
       <w:pPr>
-        <w:spacing w:after="0" w:line="228" w:lineRule="auto"/>
+        <w:spacing w:after="0" w:line="221" w:lineRule="auto"/>
         <w:ind w:left="360" w:hanging="360"/>
       </w:pPr>
       <w:r>
         <w:rPr>
           <w:rFonts w:ascii="Calibri" w:hAnsi="Calibri" w:eastAsia="PingFang SC"/>
-          <w:sz w:val="17"/>
+          <w:sz w:val="16"/>
         </w:rPr>
         <w:t xml:space="preserve">[27] Qian et al. </w:t>
       </w:r>
@@ -19077,14 +19147,14 @@
         <w:rPr>
           <w:rFonts w:ascii="Calibri" w:hAnsi="Calibri" w:eastAsia="PingFang SC"/>
           <w:i/>
-          <w:sz w:val="17"/>
+          <w:sz w:val="16"/>
         </w:rPr>
         <w:t>Toward User-Conditioned Evaluation of Personal LLM Agents under Temporal Interventions</w:t>
       </w:r>
       <w:r>
         <w:rPr>
           <w:rFonts w:ascii="Calibri" w:hAnsi="Calibri" w:eastAsia="PingFang SC"/>
-          <w:sz w:val="17"/>
+          <w:sz w:val="16"/>
         </w:rPr>
         <w:t xml:space="preserve">. arXiv:2607.21635, 2026. </w:t>
       </w:r>
@@ -19103,13 +19173,13 @@
     </w:p>
     <w:p>
       <w:pPr>
-        <w:spacing w:after="0" w:line="228" w:lineRule="auto"/>
+        <w:spacing w:after="0" w:line="221" w:lineRule="auto"/>
         <w:ind w:left="360" w:hanging="360"/>
       </w:pPr>
       <w:r>
         <w:rPr>
           <w:rFonts w:ascii="Calibri" w:hAnsi="Calibri" w:eastAsia="PingFang SC"/>
-          <w:sz w:val="17"/>
+          <w:sz w:val="16"/>
         </w:rPr>
         <w:t xml:space="preserve">[28] Yang et al. </w:t>
       </w:r>
@@ -19117,14 +19187,14 @@
         <w:rPr>
           <w:rFonts w:ascii="Calibri" w:hAnsi="Calibri" w:eastAsia="PingFang SC"/>
           <w:i/>
-          <w:sz w:val="17"/>
+          <w:sz w:val="16"/>
         </w:rPr>
         <w:t>PersonaTrail: Benchmarking Personalized Web Agents through Browsing Trails</w:t>
       </w:r>
       <w:r>
         <w:rPr>
           <w:rFonts w:ascii="Calibri" w:hAnsi="Calibri" w:eastAsia="PingFang SC"/>
-          <w:sz w:val="17"/>
+          <w:sz w:val="16"/>
         </w:rPr>
         <w:t xml:space="preserve">. arXiv:2607.20482, 2026. </w:t>
       </w:r>
@@ -19143,13 +19213,13 @@
     </w:p>
     <w:p>
       <w:pPr>
-        <w:spacing w:after="0" w:line="228" w:lineRule="auto"/>
+        <w:spacing w:after="0" w:line="221" w:lineRule="auto"/>
         <w:ind w:left="360" w:hanging="360"/>
       </w:pPr>
       <w:r>
         <w:rPr>
           <w:rFonts w:ascii="Calibri" w:hAnsi="Calibri" w:eastAsia="PingFang SC"/>
-          <w:sz w:val="17"/>
+          <w:sz w:val="16"/>
         </w:rPr>
         <w:t xml:space="preserve">[29] Todisco et al. </w:t>
       </w:r>
@@ -19157,14 +19227,14 @@
         <w:rPr>
           <w:rFonts w:ascii="Calibri" w:hAnsi="Calibri" w:eastAsia="PingFang SC"/>
           <w:i/>
-          <w:sz w:val="17"/>
+          <w:sz w:val="16"/>
         </w:rPr>
         <w:t>TARS: A Theory-of-Mind Agent for Personalized In-IDE Code Comprehension</w:t>
       </w:r>
       <w:r>
         <w:rPr>
           <w:rFonts w:ascii="Calibri" w:hAnsi="Calibri" w:eastAsia="PingFang SC"/>
-          <w:sz w:val="17"/>
+          <w:sz w:val="16"/>
         </w:rPr>
         <w:t xml:space="preserve">. arXiv:2607.15948, 2026. </w:t>
       </w:r>
@@ -19183,13 +19253,13 @@
     </w:p>
     <w:p>
       <w:pPr>
-        <w:spacing w:after="0" w:line="228" w:lineRule="auto"/>
+        <w:spacing w:after="0" w:line="221" w:lineRule="auto"/>
         <w:ind w:left="360" w:hanging="360"/>
       </w:pPr>
       <w:r>
         <w:rPr>
           <w:rFonts w:ascii="Calibri" w:hAnsi="Calibri" w:eastAsia="PingFang SC"/>
-          <w:sz w:val="17"/>
+          <w:sz w:val="16"/>
         </w:rPr>
         <w:t xml:space="preserve">[30] Yang. </w:t>
       </w:r>
@@ -19197,14 +19267,14 @@
         <w:rPr>
           <w:rFonts w:ascii="Calibri" w:hAnsi="Calibri" w:eastAsia="PingFang SC"/>
           <w:i/>
-          <w:sz w:val="17"/>
+          <w:sz w:val="16"/>
         </w:rPr>
         <w:t>Self-Aware Recursively Self-Improving Agents for Personal Singularity</w:t>
       </w:r>
       <w:r>
         <w:rPr>
           <w:rFonts w:ascii="Calibri" w:hAnsi="Calibri" w:eastAsia="PingFang SC"/>
-          <w:sz w:val="17"/>
+          <w:sz w:val="16"/>
         </w:rPr>
         <w:t xml:space="preserve">. arXiv:2607.12254, 2026. </w:t>
       </w:r>
@@ -19223,13 +19293,13 @@
     </w:p>
     <w:p>
       <w:pPr>
-        <w:spacing w:after="0" w:line="228" w:lineRule="auto"/>
+        <w:spacing w:after="0" w:line="221" w:lineRule="auto"/>
         <w:ind w:left="360" w:hanging="360"/>
       </w:pPr>
       <w:r>
         <w:rPr>
           <w:rFonts w:ascii="Calibri" w:hAnsi="Calibri" w:eastAsia="PingFang SC"/>
-          <w:sz w:val="17"/>
+          <w:sz w:val="16"/>
         </w:rPr>
         <w:t xml:space="preserve">[31] Mao et al. </w:t>
       </w:r>
@@ -19237,14 +19307,14 @@
         <w:rPr>
           <w:rFonts w:ascii="Calibri" w:hAnsi="Calibri" w:eastAsia="PingFang SC"/>
           <w:i/>
-          <w:sz w:val="17"/>
+          <w:sz w:val="16"/>
         </w:rPr>
         <w:t>Agents Don't Just Agree, They Remember: Benchmarking Persistent Sycophancy in Stateful Personal Agents</w:t>
       </w:r>
       <w:r>
         <w:rPr>
           <w:rFonts w:ascii="Calibri" w:hAnsi="Calibri" w:eastAsia="PingFang SC"/>
-          <w:sz w:val="17"/>
+          <w:sz w:val="16"/>
         </w:rPr>
         <w:t xml:space="preserve">. arXiv:2607.10526, 2026. </w:t>
       </w:r>
@@ -19263,13 +19333,13 @@
     </w:p>
     <w:p>
       <w:pPr>
-        <w:spacing w:after="0" w:line="228" w:lineRule="auto"/>
+        <w:spacing w:after="0" w:line="221" w:lineRule="auto"/>
         <w:ind w:left="360" w:hanging="360"/>
       </w:pPr>
       <w:r>
         <w:rPr>
           <w:rFonts w:ascii="Calibri" w:hAnsi="Calibri" w:eastAsia="PingFang SC"/>
-          <w:sz w:val="17"/>
+          <w:sz w:val="16"/>
         </w:rPr>
         <w:t xml:space="preserve">[32] Yang et al. </w:t>
       </w:r>
@@ -19277,14 +19347,14 @@
         <w:rPr>
           <w:rFonts w:ascii="Calibri" w:hAnsi="Calibri" w:eastAsia="PingFang SC"/>
           <w:i/>
-          <w:sz w:val="17"/>
+          <w:sz w:val="16"/>
         </w:rPr>
         <w:t>APeB: Benchmarking Personalization Ability of Large Language Model Agents</w:t>
       </w:r>
       <w:r>
         <w:rPr>
           <w:rFonts w:ascii="Calibri" w:hAnsi="Calibri" w:eastAsia="PingFang SC"/>
-          <w:sz w:val="17"/>
+          <w:sz w:val="16"/>
         </w:rPr>
         <w:t xml:space="preserve">. arXiv:2607.03162, 2026. </w:t>
       </w:r>
@@ -19303,13 +19373,13 @@
     </w:p>
     <w:p>
       <w:pPr>
-        <w:spacing w:after="0" w:line="228" w:lineRule="auto"/>
+        <w:spacing w:after="0" w:line="221" w:lineRule="auto"/>
         <w:ind w:left="360" w:hanging="360"/>
       </w:pPr>
       <w:r>
         <w:rPr>
           <w:rFonts w:ascii="Calibri" w:hAnsi="Calibri" w:eastAsia="PingFang SC"/>
-          <w:sz w:val="17"/>
+          <w:sz w:val="16"/>
         </w:rPr>
         <w:t xml:space="preserve">[33] Salemi et al. </w:t>
       </w:r>
@@ -19317,14 +19387,14 @@
         <w:rPr>
           <w:rFonts w:ascii="Calibri" w:hAnsi="Calibri" w:eastAsia="PingFang SC"/>
           <w:i/>
-          <w:sz w:val="17"/>
+          <w:sz w:val="16"/>
         </w:rPr>
         <w:t>LaMP: When Large Language Models Meet Personalization</w:t>
       </w:r>
       <w:r>
         <w:rPr>
           <w:rFonts w:ascii="Calibri" w:hAnsi="Calibri" w:eastAsia="PingFang SC"/>
-          <w:sz w:val="17"/>
+          <w:sz w:val="16"/>
         </w:rPr>
         <w:t xml:space="preserve">. ACL, 2024. </w:t>
       </w:r>
@@ -19343,13 +19413,13 @@
     </w:p>
     <w:p>
       <w:pPr>
-        <w:spacing w:after="0" w:line="228" w:lineRule="auto"/>
+        <w:spacing w:after="0" w:line="221" w:lineRule="auto"/>
         <w:ind w:left="360" w:hanging="360"/>
       </w:pPr>
       <w:r>
         <w:rPr>
           <w:rFonts w:ascii="Calibri" w:hAnsi="Calibri" w:eastAsia="PingFang SC"/>
-          <w:sz w:val="17"/>
+          <w:sz w:val="16"/>
         </w:rPr>
         <w:t xml:space="preserve">[34] Singh et al. </w:t>
       </w:r>
@@ -19357,14 +19427,14 @@
         <w:rPr>
           <w:rFonts w:ascii="Calibri" w:hAnsi="Calibri" w:eastAsia="PingFang SC"/>
           <w:i/>
-          <w:sz w:val="17"/>
+          <w:sz w:val="16"/>
         </w:rPr>
         <w:t>Personal Large Language Model Agents: A Case Study on Tailored Travel Planning</w:t>
       </w:r>
       <w:r>
         <w:rPr>
           <w:rFonts w:ascii="Calibri" w:hAnsi="Calibri" w:eastAsia="PingFang SC"/>
-          <w:sz w:val="17"/>
+          <w:sz w:val="16"/>
         </w:rPr>
         <w:t xml:space="preserve">. EMNLP Industry Track, 2024. </w:t>
       </w:r>
@@ -19383,13 +19453,13 @@
     </w:p>
     <w:p>
       <w:pPr>
-        <w:spacing w:after="0" w:line="228" w:lineRule="auto"/>
+        <w:spacing w:after="0" w:line="221" w:lineRule="auto"/>
         <w:ind w:left="360" w:hanging="360"/>
       </w:pPr>
       <w:r>
         <w:rPr>
           <w:rFonts w:ascii="Calibri" w:hAnsi="Calibri" w:eastAsia="PingFang SC"/>
-          <w:sz w:val="17"/>
+          <w:sz w:val="16"/>
         </w:rPr>
         <w:t xml:space="preserve">[35] Zhao et al. </w:t>
       </w:r>
@@ -19397,14 +19467,14 @@
         <w:rPr>
           <w:rFonts w:ascii="Calibri" w:hAnsi="Calibri" w:eastAsia="PingFang SC"/>
           <w:i/>
-          <w:sz w:val="17"/>
+          <w:sz w:val="16"/>
         </w:rPr>
         <w:t>PersonaLens: A Benchmark for Personalization Evaluation in Conversational AI Assistants</w:t>
       </w:r>
       <w:r>
         <w:rPr>
           <w:rFonts w:ascii="Calibri" w:hAnsi="Calibri" w:eastAsia="PingFang SC"/>
-          <w:sz w:val="17"/>
+          <w:sz w:val="16"/>
         </w:rPr>
         <w:t xml:space="preserve">. Findings of ACL, 2025. </w:t>
       </w:r>
@@ -19423,13 +19493,13 @@
     </w:p>
     <w:p>
       <w:pPr>
-        <w:spacing w:after="0" w:line="228" w:lineRule="auto"/>
+        <w:spacing w:after="0" w:line="221" w:lineRule="auto"/>
         <w:ind w:left="360" w:hanging="360"/>
       </w:pPr>
       <w:r>
         <w:rPr>
           <w:rFonts w:ascii="Calibri" w:hAnsi="Calibri" w:eastAsia="PingFang SC"/>
-          <w:sz w:val="17"/>
+          <w:sz w:val="16"/>
         </w:rPr>
         <w:t xml:space="preserve">[36] Jiang et al. </w:t>
       </w:r>
@@ -19437,14 +19507,14 @@
         <w:rPr>
           <w:rFonts w:ascii="Calibri" w:hAnsi="Calibri" w:eastAsia="PingFang SC"/>
           <w:i/>
-          <w:sz w:val="17"/>
+          <w:sz w:val="16"/>
         </w:rPr>
         <w:t>Know Me, Respond to Me: Benchmarking LLMs for Dynamic User Profiling and Personalized Responses at Scale</w:t>
       </w:r>
       <w:r>
         <w:rPr>
           <w:rFonts w:ascii="Calibri" w:hAnsi="Calibri" w:eastAsia="PingFang SC"/>
-          <w:sz w:val="17"/>
+          <w:sz w:val="16"/>
         </w:rPr>
         <w:t xml:space="preserve">. arXiv:2504.14225, 2025. </w:t>
       </w:r>
@@ -19463,13 +19533,13 @@
     </w:p>
     <w:p>
       <w:pPr>
-        <w:spacing w:after="0" w:line="228" w:lineRule="auto"/>
+        <w:spacing w:after="0" w:line="221" w:lineRule="auto"/>
         <w:ind w:left="360" w:hanging="360"/>
       </w:pPr>
       <w:r>
         <w:rPr>
           <w:rFonts w:ascii="Calibri" w:hAnsi="Calibri" w:eastAsia="PingFang SC"/>
-          <w:sz w:val="17"/>
+          <w:sz w:val="16"/>
         </w:rPr>
         <w:t xml:space="preserve">[37] Hao et al. </w:t>
       </w:r>
@@ -19477,14 +19547,14 @@
         <w:rPr>
           <w:rFonts w:ascii="Calibri" w:hAnsi="Calibri" w:eastAsia="PingFang SC"/>
           <w:i/>
-          <w:sz w:val="17"/>
+          <w:sz w:val="16"/>
         </w:rPr>
         <w:t>Evaluating Personalized Tool-Augmented LLMs from the Perspectives of Personalization and Proactivity</w:t>
       </w:r>
       <w:r>
         <w:rPr>
           <w:rFonts w:ascii="Calibri" w:hAnsi="Calibri" w:eastAsia="PingFang SC"/>
-          <w:sz w:val="17"/>
+          <w:sz w:val="16"/>
         </w:rPr>
         <w:t xml:space="preserve">. ACL, 2025. </w:t>
       </w:r>
@@ -19503,13 +19573,13 @@
     </w:p>
     <w:p>
       <w:pPr>
-        <w:spacing w:after="0" w:line="228" w:lineRule="auto"/>
+        <w:spacing w:after="0" w:line="221" w:lineRule="auto"/>
         <w:ind w:left="360" w:hanging="360"/>
       </w:pPr>
       <w:r>
         <w:rPr>
           <w:rFonts w:ascii="Calibri" w:hAnsi="Calibri" w:eastAsia="PingFang SC"/>
-          <w:sz w:val="17"/>
+          <w:sz w:val="16"/>
         </w:rPr>
         <w:t xml:space="preserve">[38] Cheng et al. </w:t>
       </w:r>
@@ -19517,14 +19587,14 @@
         <w:rPr>
           <w:rFonts w:ascii="Calibri" w:hAnsi="Calibri" w:eastAsia="PingFang SC"/>
           <w:i/>
-          <w:sz w:val="17"/>
+          <w:sz w:val="16"/>
         </w:rPr>
         <w:t>ToolSpectrum: Towards Personalized Tool Utilization for Large Language Models</w:t>
       </w:r>
       <w:r>
         <w:rPr>
           <w:rFonts w:ascii="Calibri" w:hAnsi="Calibri" w:eastAsia="PingFang SC"/>
-          <w:sz w:val="17"/>
+          <w:sz w:val="16"/>
         </w:rPr>
         <w:t xml:space="preserve">. arXiv:2505.13176, 2025. </w:t>
       </w:r>
@@ -19543,13 +19613,13 @@
     </w:p>
     <w:p>
       <w:pPr>
-        <w:spacing w:after="0" w:line="228" w:lineRule="auto"/>
+        <w:spacing w:after="0" w:line="221" w:lineRule="auto"/>
         <w:ind w:left="360" w:hanging="360"/>
       </w:pPr>
       <w:r>
         <w:rPr>
           <w:rFonts w:ascii="Calibri" w:hAnsi="Calibri" w:eastAsia="PingFang SC"/>
-          <w:sz w:val="17"/>
+          <w:sz w:val="16"/>
         </w:rPr>
         <w:t xml:space="preserve">[39] Zhang et al. </w:t>
       </w:r>
@@ -19557,14 +19627,14 @@
         <w:rPr>
           <w:rFonts w:ascii="Calibri" w:hAnsi="Calibri" w:eastAsia="PingFang SC"/>
           <w:i/>
-          <w:sz w:val="17"/>
+          <w:sz w:val="16"/>
         </w:rPr>
         <w:t>PRIME: Large Language Model Personalization with Cognitive Dual-Memory and Personalized Thought Process</w:t>
       </w:r>
       <w:r>
         <w:rPr>
           <w:rFonts w:ascii="Calibri" w:hAnsi="Calibri" w:eastAsia="PingFang SC"/>
-          <w:sz w:val="17"/>
+          <w:sz w:val="16"/>
         </w:rPr>
         <w:t xml:space="preserve">. EMNLP, 2025. </w:t>
       </w:r>
@@ -19583,13 +19653,13 @@
     </w:p>
     <w:p>
       <w:pPr>
-        <w:spacing w:after="0" w:line="228" w:lineRule="auto"/>
+        <w:spacing w:after="0" w:line="221" w:lineRule="auto"/>
         <w:ind w:left="360" w:hanging="360"/>
       </w:pPr>
       <w:r>
         <w:rPr>
           <w:rFonts w:ascii="Calibri" w:hAnsi="Calibri" w:eastAsia="PingFang SC"/>
-          <w:sz w:val="17"/>
+          <w:sz w:val="16"/>
         </w:rPr>
         <w:t xml:space="preserve">[40] Li et al. </w:t>
       </w:r>
@@ -19597,14 +19667,14 @@
         <w:rPr>
           <w:rFonts w:ascii="Calibri" w:hAnsi="Calibri" w:eastAsia="PingFang SC"/>
           <w:i/>
-          <w:sz w:val="17"/>
+          <w:sz w:val="16"/>
         </w:rPr>
         <w:t>Personalized Deep Research: A User-Centric Framework, Dataset, and Hybrid Evaluation for Knowledge Discovery</w:t>
       </w:r>
       <w:r>
         <w:rPr>
           <w:rFonts w:ascii="Calibri" w:hAnsi="Calibri" w:eastAsia="PingFang SC"/>
-          <w:sz w:val="17"/>
+          <w:sz w:val="16"/>
         </w:rPr>
         <w:t xml:space="preserve">. arXiv:2605.10530, 2026. </w:t>
       </w:r>
@@ -19623,13 +19693,13 @@
     </w:p>
     <w:p>
       <w:pPr>
-        <w:spacing w:after="0" w:line="228" w:lineRule="auto"/>
+        <w:spacing w:after="0" w:line="221" w:lineRule="auto"/>
         <w:ind w:left="360" w:hanging="360"/>
       </w:pPr>
       <w:r>
         <w:rPr>
           <w:rFonts w:ascii="Calibri" w:hAnsi="Calibri" w:eastAsia="PingFang SC"/>
-          <w:sz w:val="17"/>
+          <w:sz w:val="16"/>
         </w:rPr>
         <w:t xml:space="preserve">[41] Balepur et al. </w:t>
       </w:r>
@@ -19637,14 +19707,14 @@
         <w:rPr>
           <w:rFonts w:ascii="Calibri" w:hAnsi="Calibri" w:eastAsia="PingFang SC"/>
           <w:i/>
-          <w:sz w:val="17"/>
+          <w:sz w:val="16"/>
         </w:rPr>
         <w:t>Language Models Don't Know What You Want: Evaluating Personalization in Deep Research Needs Real Users</w:t>
       </w:r>
       <w:r>
         <w:rPr>
           <w:rFonts w:ascii="Calibri" w:hAnsi="Calibri" w:eastAsia="PingFang SC"/>
-          <w:sz w:val="17"/>
+          <w:sz w:val="16"/>
         </w:rPr>
         <w:t xml:space="preserve">. ACL, 2026. </w:t>
       </w:r>
@@ -19663,13 +19733,13 @@
     </w:p>
     <w:p>
       <w:pPr>
-        <w:spacing w:after="0" w:line="228" w:lineRule="auto"/>
+        <w:spacing w:after="0" w:line="221" w:lineRule="auto"/>
         <w:ind w:left="360" w:hanging="360"/>
       </w:pPr>
       <w:r>
         <w:rPr>
           <w:rFonts w:ascii="Calibri" w:hAnsi="Calibri" w:eastAsia="PingFang SC"/>
-          <w:sz w:val="17"/>
+          <w:sz w:val="16"/>
         </w:rPr>
         <w:t xml:space="preserve">[42] Garbacea et al. </w:t>
       </w:r>
@@ -19677,14 +19747,14 @@
         <w:rPr>
           <w:rFonts w:ascii="Calibri" w:hAnsi="Calibri" w:eastAsia="PingFang SC"/>
           <w:i/>
-          <w:sz w:val="17"/>
+          <w:sz w:val="16"/>
         </w:rPr>
         <w:t>Personalized Benchmarking: Evaluating LLMs by Individual Preferences</w:t>
       </w:r>
       <w:r>
         <w:rPr>
           <w:rFonts w:ascii="Calibri" w:hAnsi="Calibri" w:eastAsia="PingFang SC"/>
-          <w:sz w:val="17"/>
+          <w:sz w:val="16"/>
         </w:rPr>
         <w:t xml:space="preserve">. Findings of ACL, 2026. </w:t>
       </w:r>
@@ -19703,13 +19773,13 @@
     </w:p>
     <w:p>
       <w:pPr>
-        <w:spacing w:after="0" w:line="228" w:lineRule="auto"/>
+        <w:spacing w:after="0" w:line="221" w:lineRule="auto"/>
         <w:ind w:left="360" w:hanging="360"/>
       </w:pPr>
       <w:r>
         <w:rPr>
           <w:rFonts w:ascii="Calibri" w:hAnsi="Calibri" w:eastAsia="PingFang SC"/>
-          <w:sz w:val="17"/>
+          <w:sz w:val="16"/>
         </w:rPr>
         <w:t xml:space="preserve">[43] Feng et al. </w:t>
       </w:r>
@@ -19717,14 +19787,14 @@
         <w:rPr>
           <w:rFonts w:ascii="Calibri" w:hAnsi="Calibri" w:eastAsia="PingFang SC"/>
           <w:i/>
-          <w:sz w:val="17"/>
+          <w:sz w:val="16"/>
         </w:rPr>
         <w:t>How Does Personalized Memory Shape LLM Behavior? Benchmarking Rational Preference Utilization in Personalized Assistants</w:t>
       </w:r>
       <w:r>
         <w:rPr>
           <w:rFonts w:ascii="Calibri" w:hAnsi="Calibri" w:eastAsia="PingFang SC"/>
-          <w:sz w:val="17"/>
+          <w:sz w:val="16"/>
         </w:rPr>
         <w:t xml:space="preserve">. arXiv:2601.16621, 2026. </w:t>
       </w:r>
@@ -19743,13 +19813,13 @@
     </w:p>
     <w:p>
       <w:pPr>
-        <w:spacing w:after="0" w:line="228" w:lineRule="auto"/>
+        <w:spacing w:after="0" w:line="221" w:lineRule="auto"/>
         <w:ind w:left="360" w:hanging="360"/>
       </w:pPr>
       <w:r>
         <w:rPr>
           <w:rFonts w:ascii="Calibri" w:hAnsi="Calibri" w:eastAsia="PingFang SC"/>
-          <w:sz w:val="17"/>
+          <w:sz w:val="16"/>
         </w:rPr>
         <w:t xml:space="preserve">[44] Liang et al. </w:t>
       </w:r>
@@ -19757,14 +19827,14 @@
         <w:rPr>
           <w:rFonts w:ascii="Calibri" w:hAnsi="Calibri" w:eastAsia="PingFang SC"/>
           <w:i/>
-          <w:sz w:val="17"/>
+          <w:sz w:val="16"/>
         </w:rPr>
         <w:t>Learning Personalized Agents from Human Feedback</w:t>
       </w:r>
       <w:r>
         <w:rPr>
           <w:rFonts w:ascii="Calibri" w:hAnsi="Calibri" w:eastAsia="PingFang SC"/>
-          <w:sz w:val="17"/>
+          <w:sz w:val="16"/>
         </w:rPr>
         <w:t xml:space="preserve">. arXiv:2602.16173, 2026. </w:t>
       </w:r>
@@ -19783,13 +19853,13 @@
     </w:p>
     <w:p>
       <w:pPr>
-        <w:spacing w:after="0" w:line="228" w:lineRule="auto"/>
+        <w:spacing w:after="0" w:line="221" w:lineRule="auto"/>
         <w:ind w:left="360" w:hanging="360"/>
       </w:pPr>
       <w:r>
         <w:rPr>
           <w:rFonts w:ascii="Calibri" w:hAnsi="Calibri" w:eastAsia="PingFang SC"/>
-          <w:sz w:val="17"/>
+          <w:sz w:val="16"/>
         </w:rPr>
         <w:t xml:space="preserve">[45] In et al. </w:t>
       </w:r>
@@ -19797,14 +19867,14 @@
         <w:rPr>
           <w:rFonts w:ascii="Calibri" w:hAnsi="Calibri" w:eastAsia="PingFang SC"/>
           <w:i/>
-          <w:sz w:val="17"/>
+          <w:sz w:val="16"/>
         </w:rPr>
         <w:t>Personalize-then-Store: Benchmarking and Learning Personalized Memory for Long-horizon Agents</w:t>
       </w:r>
       <w:r>
         <w:rPr>
           <w:rFonts w:ascii="Calibri" w:hAnsi="Calibri" w:eastAsia="PingFang SC"/>
-          <w:sz w:val="17"/>
+          <w:sz w:val="16"/>
         </w:rPr>
         <w:t xml:space="preserve">. arXiv:2605.25535, 2026. </w:t>
       </w:r>
@@ -19823,13 +19893,13 @@
     </w:p>
     <w:p>
       <w:pPr>
-        <w:spacing w:after="0" w:line="228" w:lineRule="auto"/>
+        <w:spacing w:after="0" w:line="221" w:lineRule="auto"/>
         <w:ind w:left="360" w:hanging="360"/>
       </w:pPr>
       <w:r>
         <w:rPr>
           <w:rFonts w:ascii="Calibri" w:hAnsi="Calibri" w:eastAsia="PingFang SC"/>
-          <w:sz w:val="17"/>
+          <w:sz w:val="16"/>
         </w:rPr>
         <w:t xml:space="preserve">[46] Uddin et al. </w:t>
       </w:r>
@@ -19837,14 +19907,14 @@
         <w:rPr>
           <w:rFonts w:ascii="Calibri" w:hAnsi="Calibri" w:eastAsia="PingFang SC"/>
           <w:i/>
-          <w:sz w:val="17"/>
+          <w:sz w:val="16"/>
         </w:rPr>
         <w:t>From Recall to Forgetting: Benchmarking Long-Term Memory for Personalized Agents</w:t>
       </w:r>
       <w:r>
         <w:rPr>
           <w:rFonts w:ascii="Calibri" w:hAnsi="Calibri" w:eastAsia="PingFang SC"/>
-          <w:sz w:val="17"/>
+          <w:sz w:val="16"/>
         </w:rPr>
         <w:t xml:space="preserve">. Findings of ACL, 2026. </w:t>
       </w:r>
@@ -19863,13 +19933,13 @@
     </w:p>
     <w:p>
       <w:pPr>
-        <w:spacing w:after="0" w:line="228" w:lineRule="auto"/>
+        <w:spacing w:after="0" w:line="221" w:lineRule="auto"/>
         <w:ind w:left="360" w:hanging="360"/>
       </w:pPr>
       <w:r>
         <w:rPr>
           <w:rFonts w:ascii="Calibri" w:hAnsi="Calibri" w:eastAsia="PingFang SC"/>
-          <w:sz w:val="17"/>
+          <w:sz w:val="16"/>
         </w:rPr>
         <w:t xml:space="preserve">[47] Hu et al. </w:t>
       </w:r>
@@ -19877,14 +19947,14 @@
         <w:rPr>
           <w:rFonts w:ascii="Calibri" w:hAnsi="Calibri" w:eastAsia="PingFang SC"/>
           <w:i/>
-          <w:sz w:val="17"/>
+          <w:sz w:val="16"/>
         </w:rPr>
         <w:t>CloneMem: Benchmarking Long-Term Memory for AI Clones</w:t>
       </w:r>
       <w:r>
         <w:rPr>
           <w:rFonts w:ascii="Calibri" w:hAnsi="Calibri" w:eastAsia="PingFang SC"/>
-          <w:sz w:val="17"/>
+          <w:sz w:val="16"/>
         </w:rPr>
         <w:t xml:space="preserve">. ACL, 2026. </w:t>
       </w:r>
@@ -19903,13 +19973,13 @@
     </w:p>
     <w:p>
       <w:pPr>
-        <w:spacing w:after="0" w:line="228" w:lineRule="auto"/>
+        <w:spacing w:after="0" w:line="221" w:lineRule="auto"/>
         <w:ind w:left="360" w:hanging="360"/>
       </w:pPr>
       <w:r>
         <w:rPr>
           <w:rFonts w:ascii="Calibri" w:hAnsi="Calibri" w:eastAsia="PingFang SC"/>
-          <w:sz w:val="17"/>
+          <w:sz w:val="16"/>
         </w:rPr>
         <w:t xml:space="preserve">[48] Shen et al. </w:t>
       </w:r>
@@ -19917,14 +19987,14 @@
         <w:rPr>
           <w:rFonts w:ascii="Calibri" w:hAnsi="Calibri" w:eastAsia="PingFang SC"/>
           <w:i/>
-          <w:sz w:val="17"/>
+          <w:sz w:val="16"/>
         </w:rPr>
         <w:t>Mem2ActBench: A Benchmark for Evaluating Long-Term Memory Utilization in Task-Oriented Autonomous Agents</w:t>
       </w:r>
       <w:r>
         <w:rPr>
           <w:rFonts w:ascii="Calibri" w:hAnsi="Calibri" w:eastAsia="PingFang SC"/>
-          <w:sz w:val="17"/>
+          <w:sz w:val="16"/>
         </w:rPr>
         <w:t xml:space="preserve">. ACL, 2026. </w:t>
       </w:r>
@@ -19943,13 +20013,13 @@
     </w:p>
     <w:p>
       <w:pPr>
-        <w:spacing w:after="0" w:line="228" w:lineRule="auto"/>
+        <w:spacing w:after="0" w:line="221" w:lineRule="auto"/>
         <w:ind w:left="360" w:hanging="360"/>
       </w:pPr>
       <w:r>
         <w:rPr>
           <w:rFonts w:ascii="Calibri" w:hAnsi="Calibri" w:eastAsia="PingFang SC"/>
-          <w:sz w:val="17"/>
+          <w:sz w:val="16"/>
         </w:rPr>
         <w:t xml:space="preserve">[49] Chen et al. </w:t>
       </w:r>
@@ -19957,14 +20027,14 @@
         <w:rPr>
           <w:rFonts w:ascii="Calibri" w:hAnsi="Calibri" w:eastAsia="PingFang SC"/>
           <w:i/>
-          <w:sz w:val="17"/>
+          <w:sz w:val="16"/>
         </w:rPr>
         <w:t>Towards Preference Following in Tool Calling Language Agents</w:t>
       </w:r>
       <w:r>
         <w:rPr>
           <w:rFonts w:ascii="Calibri" w:hAnsi="Calibri" w:eastAsia="PingFang SC"/>
-          <w:sz w:val="17"/>
+          <w:sz w:val="16"/>
         </w:rPr>
         <w:t xml:space="preserve">. Findings of ACL, 2026. </w:t>
       </w:r>
@@ -19983,13 +20053,13 @@
     </w:p>
     <w:p>
       <w:pPr>
-        <w:spacing w:after="0" w:line="228" w:lineRule="auto"/>
+        <w:spacing w:after="0" w:line="221" w:lineRule="auto"/>
         <w:ind w:left="360" w:hanging="360"/>
       </w:pPr>
       <w:r>
         <w:rPr>
           <w:rFonts w:ascii="Calibri" w:hAnsi="Calibri" w:eastAsia="PingFang SC"/>
-          <w:sz w:val="17"/>
+          <w:sz w:val="16"/>
         </w:rPr>
         <w:t xml:space="preserve">[50] Lyu et al. </w:t>
       </w:r>
@@ -19997,14 +20067,14 @@
         <w:rPr>
           <w:rFonts w:ascii="Calibri" w:hAnsi="Calibri" w:eastAsia="PingFang SC"/>
           <w:i/>
-          <w:sz w:val="17"/>
+          <w:sz w:val="16"/>
         </w:rPr>
         <w:t>PersonalAlign: Hierarchical Implicit Intent Alignment for Personalized GUI Agent with Long-Term User-Centric Records</w:t>
       </w:r>
       <w:r>
         <w:rPr>
           <w:rFonts w:ascii="Calibri" w:hAnsi="Calibri" w:eastAsia="PingFang SC"/>
-          <w:sz w:val="17"/>
+          <w:sz w:val="16"/>
         </w:rPr>
         <w:t xml:space="preserve">. ACL, 2026. </w:t>
       </w:r>
@@ -20023,13 +20093,13 @@
     </w:p>
     <w:p>
       <w:pPr>
-        <w:spacing w:after="0" w:line="228" w:lineRule="auto"/>
+        <w:spacing w:after="0" w:line="221" w:lineRule="auto"/>
         <w:ind w:left="360" w:hanging="360"/>
       </w:pPr>
       <w:r>
         <w:rPr>
           <w:rFonts w:ascii="Calibri" w:hAnsi="Calibri" w:eastAsia="PingFang SC"/>
-          <w:sz w:val="17"/>
+          <w:sz w:val="16"/>
         </w:rPr>
         <w:t xml:space="preserve">[51] Wang et al. </w:t>
       </w:r>
@@ -20037,14 +20107,14 @@
         <w:rPr>
           <w:rFonts w:ascii="Calibri" w:hAnsi="Calibri" w:eastAsia="PingFang SC"/>
           <w:i/>
-          <w:sz w:val="17"/>
+          <w:sz w:val="16"/>
         </w:rPr>
         <w:t>OPeRA: A Dataset of Observation, Persona, Rationale, and Action for Evaluating LLMs on Human Online Shopping Behavior Simulation</w:t>
       </w:r>
       <w:r>
         <w:rPr>
           <w:rFonts w:ascii="Calibri" w:hAnsi="Calibri" w:eastAsia="PingFang SC"/>
-          <w:sz w:val="17"/>
+          <w:sz w:val="16"/>
         </w:rPr>
         <w:t xml:space="preserve">. ACL, 2026. </w:t>
       </w:r>
@@ -20063,13 +20133,13 @@
     </w:p>
     <w:p>
       <w:pPr>
-        <w:spacing w:after="0" w:line="228" w:lineRule="auto"/>
+        <w:spacing w:after="0" w:line="221" w:lineRule="auto"/>
         <w:ind w:left="360" w:hanging="360"/>
       </w:pPr>
       <w:r>
         <w:rPr>
           <w:rFonts w:ascii="Calibri" w:hAnsi="Calibri" w:eastAsia="PingFang SC"/>
-          <w:sz w:val="17"/>
+          <w:sz w:val="16"/>
         </w:rPr>
         <w:t xml:space="preserve">[52] Guo et al. </w:t>
       </w:r>
@@ -20077,14 +20147,14 @@
         <w:rPr>
           <w:rFonts w:ascii="Calibri" w:hAnsi="Calibri" w:eastAsia="PingFang SC"/>
           <w:i/>
-          <w:sz w:val="17"/>
+          <w:sz w:val="16"/>
         </w:rPr>
         <w:t>When Personalization Legitimizes Risks: Uncovering Safety Vulnerabilities in Personalized Dialogue Agents</w:t>
       </w:r>
       <w:r>
         <w:rPr>
           <w:rFonts w:ascii="Calibri" w:hAnsi="Calibri" w:eastAsia="PingFang SC"/>
-          <w:sz w:val="17"/>
+          <w:sz w:val="16"/>
         </w:rPr>
         <w:t xml:space="preserve">. ACL, 2026. </w:t>
       </w:r>
@@ -20103,13 +20173,13 @@
     </w:p>
     <w:p>
       <w:pPr>
-        <w:spacing w:after="0" w:line="228" w:lineRule="auto"/>
+        <w:spacing w:after="0" w:line="221" w:lineRule="auto"/>
         <w:ind w:left="360" w:hanging="360"/>
       </w:pPr>
       <w:r>
         <w:rPr>
           <w:rFonts w:ascii="Calibri" w:hAnsi="Calibri" w:eastAsia="PingFang SC"/>
-          <w:sz w:val="17"/>
+          <w:sz w:val="16"/>
         </w:rPr>
         <w:t xml:space="preserve">[53] Weeber et al. </w:t>
       </w:r>
@@ -20117,14 +20187,14 @@
         <w:rPr>
           <w:rFonts w:ascii="Calibri" w:hAnsi="Calibri" w:eastAsia="PingFang SC"/>
           <w:i/>
-          <w:sz w:val="17"/>
+          <w:sz w:val="16"/>
         </w:rPr>
         <w:t>One Persona, Many Cues, Different Results: How Sociodemographic Cues Impact LLM Personalization</w:t>
       </w:r>
       <w:r>
         <w:rPr>
           <w:rFonts w:ascii="Calibri" w:hAnsi="Calibri" w:eastAsia="PingFang SC"/>
-          <w:sz w:val="17"/>
+          <w:sz w:val="16"/>
         </w:rPr>
         <w:t xml:space="preserve">. ACL, 2026. </w:t>
       </w:r>
@@ -20143,13 +20213,13 @@
     </w:p>
     <w:p>
       <w:pPr>
-        <w:spacing w:after="0" w:line="228" w:lineRule="auto"/>
+        <w:spacing w:after="0" w:line="221" w:lineRule="auto"/>
         <w:ind w:left="360" w:hanging="360"/>
       </w:pPr>
       <w:r>
         <w:rPr>
           <w:rFonts w:ascii="Calibri" w:hAnsi="Calibri" w:eastAsia="PingFang SC"/>
-          <w:sz w:val="17"/>
+          <w:sz w:val="16"/>
         </w:rPr>
         <w:t xml:space="preserve">[54] Qiu et al. </w:t>
       </w:r>
@@ -20157,14 +20227,14 @@
         <w:rPr>
           <w:rFonts w:ascii="Calibri" w:hAnsi="Calibri" w:eastAsia="PingFang SC"/>
           <w:i/>
-          <w:sz w:val="17"/>
+          <w:sz w:val="16"/>
         </w:rPr>
         <w:t>Preference-Aware Rubric Learning for Personalized Evaluation</w:t>
       </w:r>
       <w:r>
         <w:rPr>
           <w:rFonts w:ascii="Calibri" w:hAnsi="Calibri" w:eastAsia="PingFang SC"/>
-          <w:sz w:val="17"/>
+          <w:sz w:val="16"/>
         </w:rPr>
         <w:t xml:space="preserve">. arXiv:2605.31545, 2026. </w:t>
       </w:r>

</xml_diff>

<commit_message>
proposal v0.27: calibrate result plots to sample support
</commit_message>
<xml_diff>
--- a/deliverables/DeepAlign-Bench_正式研究Proposal.docx
+++ b/deliverables/DeepAlign-Bench_正式研究Proposal.docx
@@ -131,7 +131,7 @@
                 <w:color w:val="5B6B7A"/>
                 <w:sz w:val="21"/>
               </w:rPr>
-              <w:t>v0.26 · 组内讨论稿</w:t>
+              <w:t>v0.27 · 组内讨论稿</w:t>
             </w:r>
           </w:p>
         </w:tc>
@@ -13179,7 +13179,49 @@
         <w:rPr>
           <w:rFonts w:ascii="Calibri" w:hAnsi="Calibri" w:eastAsia="PingFang SC"/>
         </w:rPr>
-        <w:t>对同一潜在 user-state 的语义等价 signal views，不把稳定性压成一个可被平均掩盖的总分，而同时报告：</w:t>
+        <w:t xml:space="preserve">令 </w:t>
+      </w:r>
+      <w:r>
+        <w:rPr>
+          <w:rFonts w:ascii="Courier New" w:hAnsi="Courier New" w:eastAsia="PingFang SC"/>
+          <w:color w:val="6A3E00"/>
+          <w:sz w:val="20"/>
+        </w:rPr>
+        <w:t>V_eq</w:t>
+      </w:r>
+      <w:r>
+        <w:rPr>
+          <w:rFonts w:ascii="Calibri" w:hAnsi="Calibri" w:eastAsia="PingFang SC"/>
+        </w:rPr>
+        <w:t xml:space="preserve"> 表示通过 equivalence audit、表达同一 task-relevant user-state 的直接提供视图。首版只把 structured persona 与 natural history 放入 </w:t>
+      </w:r>
+      <w:r>
+        <w:rPr>
+          <w:rFonts w:ascii="Courier New" w:hAnsi="Courier New" w:eastAsia="PingFang SC"/>
+          <w:color w:val="6A3E00"/>
+          <w:sz w:val="20"/>
+        </w:rPr>
+        <w:t>V_eq</w:t>
+      </w:r>
+      <w:r>
+        <w:rPr>
+          <w:rFonts w:ascii="Calibri" w:hAnsi="Calibri" w:eastAsia="PingFang SC"/>
+        </w:rPr>
+        <w:t xml:space="preserve">；clarification-allowed 和 workspace/history 是不同的信息获取条件，不进入 cue-equivalence 计算。对 </w:t>
+      </w:r>
+      <w:r>
+        <w:rPr>
+          <w:rFonts w:ascii="Courier New" w:hAnsi="Courier New" w:eastAsia="PingFang SC"/>
+          <w:color w:val="6A3E00"/>
+          <w:sz w:val="20"/>
+        </w:rPr>
+        <w:t>V_eq</w:t>
+      </w:r>
+      <w:r>
+        <w:rPr>
+          <w:rFonts w:ascii="Calibri" w:hAnsi="Calibri" w:eastAsia="PingFang SC"/>
+        </w:rPr>
+        <w:t xml:space="preserve"> 同时报告：</w:t>
       </w:r>
     </w:p>
     <w:p>
@@ -13197,7 +13239,21 @@
         <w:rPr>
           <w:rFonts w:ascii="Calibri" w:hAnsi="Calibri" w:eastAsia="PingFang SC"/>
         </w:rPr>
-        <w:t>：所有 signal views 中 CFA 的最小值，防止只挑最容易的显式 persona 形式；</w:t>
+        <w:t>：</w:t>
+      </w:r>
+      <w:r>
+        <w:rPr>
+          <w:rFonts w:ascii="Courier New" w:hAnsi="Courier New" w:eastAsia="PingFang SC"/>
+          <w:color w:val="6A3E00"/>
+          <w:sz w:val="20"/>
+        </w:rPr>
+        <w:t>V_eq</w:t>
+      </w:r>
+      <w:r>
+        <w:rPr>
+          <w:rFonts w:ascii="Calibri" w:hAnsi="Calibri" w:eastAsia="PingFang SC"/>
+        </w:rPr>
+        <w:t xml:space="preserve"> 中 CFA 的最小值，防止只挑最容易的显式 persona 形式；</w:t>
       </w:r>
     </w:p>
     <w:p>
@@ -13215,7 +13271,21 @@
         <w:rPr>
           <w:rFonts w:ascii="Calibri" w:hAnsi="Calibri" w:eastAsia="PingFang SC"/>
         </w:rPr>
-        <w:t>：最高 CFA 与最低 CFA 之差，衡量结论对表达渠道/措辞的敏感度；</w:t>
+        <w:t>：</w:t>
+      </w:r>
+      <w:r>
+        <w:rPr>
+          <w:rFonts w:ascii="Courier New" w:hAnsi="Courier New" w:eastAsia="PingFang SC"/>
+          <w:color w:val="6A3E00"/>
+          <w:sz w:val="20"/>
+        </w:rPr>
+        <w:t>V_eq</w:t>
+      </w:r>
+      <w:r>
+        <w:rPr>
+          <w:rFonts w:ascii="Calibri" w:hAnsi="Calibri" w:eastAsia="PingFang SC"/>
+        </w:rPr>
+        <w:t xml:space="preserve"> 中最高 CFA 与最低 CFA 之差，衡量同义表达渠道带来的敏感度；</w:t>
       </w:r>
     </w:p>
     <w:p>
@@ -13295,7 +13365,7 @@
         <w:rPr>
           <w:rFonts w:ascii="Calibri" w:hAnsi="Calibri" w:eastAsia="PingFang SC"/>
         </w:rPr>
-        <w:t>：语义等价的结构化 persona 与自然对话历史之间的表现差；与 Cue Gap 分开报告，以区分渠道可用性和表面改写敏感性；</w:t>
+        <w:t>：结构化 persona 与自然历史之间的有符号表现差；Cue Gap 报绝对范围，Semantic Channel Gap 保留变化方向；</w:t>
       </w:r>
     </w:p>
     <w:p>
@@ -15014,7 +15084,7 @@
         <w:rPr>
           <w:rFonts w:ascii="Calibri" w:hAnsi="Calibri" w:eastAsia="PingFang SC"/>
         </w:rPr>
-        <w:t>：按 structured persona、natural history、clarification、workspace/history 报 Worst-view CFA、Cue Gap 和 Clarification Value；回答系统需要多显式的用户信息。</w:t>
+        <w:t>：分别报告 structured persona、natural history、clarification 和 workspace/history 的 CFA；Worst-view CFA 与 Cue Gap 只在 equivalence-audited provided views 上计算，并另报 Clarification Value。</w:t>
       </w:r>
     </w:p>
     <w:p>
@@ -17832,7 +17902,7 @@
         <w:rPr>
           <w:rFonts w:ascii="Calibri" w:hAnsi="Calibri" w:eastAsia="PingFang SC"/>
         </w:rPr>
-        <w:t xml:space="preserve">，45° 对角线表示没有跨用户优势；离对角线越远且位于上方，说明 matched 版本相对 swapped 版本的用户特异价值越强。点的实心/空心只表示是否通过 TQ/FR gate，不用颜色重复编码质量。B 用 forest/dot plot 报各 agent 的 CFA 与 95% CI，并按 E1/E2/E3 execution regime 分块；C 用统一色标的 </w:t>
+        <w:t xml:space="preserve">，45° 对角线表示没有跨用户优势；离对角线越远且位于上方，说明 matched 版本相对 swapped 版本的用户特异价值越强。点的实心/空心只表示是否通过 TQ/FR gate，不用颜色重复编码质量。B 用 forest/dot plot 报各 agent 的 CFA 与 95% CI，并按 E1/E2/E3 execution regime 分块；C 使用两个共享色标的边际 heatmap，分别报告 </w:t>
       </w:r>
       <w:r>
         <w:rPr>
@@ -17840,28 +17910,13 @@
           <w:color w:val="6A3E00"/>
           <w:sz w:val="20"/>
         </w:rPr>
-        <w:t>agent × (3 task strata × 6 research intents)</w:t>
-      </w:r>
-      <w:r>
-        <w:rPr>
-          <w:rFonts w:ascii="Calibri" w:hAnsi="Calibri" w:eastAsia="PingFang SC"/>
-        </w:rPr>
-        <w:t xml:space="preserve"> 嵌套 heatmap 报 CFA，缺测单元使用斜线并在底部报告样本量；D 只在可比 regime 内画 cost–CFA Pareto frontier。A 解释 estimand，B 给出不确定性，C 显示能力拓扑，D 报告效率；不能用雷达图或单一冠军分数替代这四类信息。</w:t>
-      </w:r>
-    </w:p>
-    <w:p>
-      <w:r>
-        <w:rPr>
-          <w:rFonts w:ascii="Calibri" w:hAnsi="Calibri" w:eastAsia="PingFang SC"/>
-          <w:b/>
-        </w:rPr>
-        <w:t>Figure 4 · 信号渠道、压力和最终失败。</w:t>
-      </w:r>
-      <w:r>
-        <w:rPr>
-          <w:rFonts w:ascii="Calibri" w:hAnsi="Calibri" w:eastAsia="PingFang SC"/>
-        </w:rPr>
-        <w:t xml:space="preserve"> 四个 panel：A 用 </w:t>
+        <w:t>agent × 3 task strata</w:t>
+      </w:r>
+      <w:r>
+        <w:rPr>
+          <w:rFonts w:ascii="Calibri" w:hAnsi="Calibri" w:eastAsia="PingFang SC"/>
+        </w:rPr>
+        <w:t xml:space="preserve"> 和 </w:t>
       </w:r>
       <w:r>
         <w:rPr>
@@ -17869,13 +17924,13 @@
           <w:color w:val="6A3E00"/>
           <w:sz w:val="20"/>
         </w:rPr>
-        <w:t>agent × signal view</w:t>
-      </w:r>
-      <w:r>
-        <w:rPr>
-          <w:rFonts w:ascii="Calibri" w:hAnsi="Calibri" w:eastAsia="PingFang SC"/>
-        </w:rPr>
-        <w:t xml:space="preserve"> heatmap 报 structured persona、natural history、clarification、workspace/history 等条件下的 CFA，并在最右两列报告 Worst-view CFA 与 Cue Gap；B 按 S0–S3 绘制各 agent 的 CFA retention curve，主文只画跨 anchor 汇总及置信区间，逐 anchor 曲线进入附录；C 按 agent 画 outcome-level failure 的堆叠横条，横条总长度是全部 episode 中的绝对失败率，而不是“已失败样本内部占比”；D 用 </w:t>
+        <w:t>agent × 6 research intents</w:t>
+      </w:r>
+      <w:r>
+        <w:rPr>
+          <w:rFonts w:ascii="Calibri" w:hAnsi="Calibri" w:eastAsia="PingFang SC"/>
+        </w:rPr>
+        <w:t xml:space="preserve"> 的 CFA，并给出 family 数。当前 18 个基础 family 基本是一格一个 family，因此主文不能把 </w:t>
       </w:r>
       <w:r>
         <w:rPr>
@@ -17883,13 +17938,28 @@
           <w:color w:val="6A3E00"/>
           <w:sz w:val="20"/>
         </w:rPr>
-        <w:t>anchor family × observed outcome failure</w:t>
-      </w:r>
-      <w:r>
-        <w:rPr>
-          <w:rFonts w:ascii="Calibri" w:hAnsi="Calibri" w:eastAsia="PingFang SC"/>
-        </w:rPr>
-        <w:t xml:space="preserve"> heatmap 显示哪类压力更容易触发用户盲、错误用户绑定、过度个性化、共同核心破坏、冲突/过期误用、隐私/权限和澄清失败，并单列 </w:t>
+        <w:t>3 × 6</w:t>
+      </w:r>
+      <w:r>
+        <w:rPr>
+          <w:rFonts w:ascii="Calibri" w:hAnsi="Calibri" w:eastAsia="PingFang SC"/>
+        </w:rPr>
+        <w:t xml:space="preserve"> 交叉格当成稳定的 cell-level 排名；完整 18 格只在附录作描述性展示。D 只在可比 regime 内画 cost–CFA Pareto frontier。A–D 分别对应 estimand、不确定性、能力拓扑和效率，不合成单一总分。</w:t>
+      </w:r>
+    </w:p>
+    <w:p>
+      <w:r>
+        <w:rPr>
+          <w:rFonts w:ascii="Calibri" w:hAnsi="Calibri" w:eastAsia="PingFang SC"/>
+          <w:b/>
+        </w:rPr>
+        <w:t>Figure 4 · 信号渠道、压力和最终失败。</w:t>
+      </w:r>
+      <w:r>
+        <w:rPr>
+          <w:rFonts w:ascii="Calibri" w:hAnsi="Calibri" w:eastAsia="PingFang SC"/>
+        </w:rPr>
+        <w:t xml:space="preserve"> 四个 panel：A 用 </w:t>
       </w:r>
       <w:r>
         <w:rPr>
@@ -17897,66 +17967,13 @@
           <w:color w:val="6A3E00"/>
           <w:sz w:val="20"/>
         </w:rPr>
-        <w:t>other/emergent</w:t>
-      </w:r>
-      <w:r>
-        <w:rPr>
-          <w:rFonts w:ascii="Calibri" w:hAnsi="Calibri" w:eastAsia="PingFang SC"/>
-        </w:rPr>
-        <w:t>。主文不从最终交付物反推内部机制；只有具备可比 trace 的系统，才可在附录报告 acquisition、preservation、use 或 update 的过程证据。</w:t>
-      </w:r>
-    </w:p>
-    <w:p>
-      <w:r>
-        <w:rPr>
-          <w:rFonts w:ascii="Calibri" w:hAnsi="Calibri" w:eastAsia="PingFang SC"/>
-          <w:b/>
-        </w:rPr>
-        <w:t>Figure 5 · 自动评价是否可信：JudgeBench 与人类校准。</w:t>
-      </w:r>
-      <w:r>
-        <w:rPr>
-          <w:rFonts w:ascii="Calibri" w:hAnsi="Calibri" w:eastAsia="PingFang SC"/>
-        </w:rPr>
-        <w:t xml:space="preserve"> 四个 panel：A 按 rubric module 报 judge–human pairwise accuracy/α；B 画预测置信度与实际正确率的 calibration/reliability curve；C 报 A/B 顺序、长度、格式、persona 关键词和隐私诱饵造成的准确率变化；D 画“自动覆盖率—人工成本—错误率”级联曲线，并标出预注册主榜门槛。Judge 未过门槛时，本图应直接支持降级为人评，而不是隐藏失败。</w:t>
-      </w:r>
-    </w:p>
-    <w:p>
-      <w:pPr>
-        <w:pStyle w:val="Heading2"/>
-      </w:pPr>
-      <w:r>
-        <w:t>16.2 主文四张表</w:t>
-      </w:r>
-    </w:p>
-    <w:p>
-      <w:r>
-        <w:rPr>
-          <w:rFonts w:ascii="Calibri" w:hAnsi="Calibri" w:eastAsia="PingFang SC"/>
-          <w:b/>
-        </w:rPr>
-        <w:t>Table 1 · 与最近邻 benchmark 的定位比较。</w:t>
-      </w:r>
-      <w:r>
-        <w:rPr>
-          <w:rFonts w:ascii="Calibri" w:hAnsi="Calibri" w:eastAsia="PingFang SC"/>
-        </w:rPr>
-        <w:t xml:space="preserve"> 行为 PDR-Bench、ResearchRubrics、DeepResearch Bench、PersonaTrail/APeB、PASB 和 DeepAlign；列只保留与主张有关的 task-persona absolute fit、cross-user counterfactual、must-change/hold/not、multi-cue、longitudinal stress、multi-deliverable、human validity 和 judge calibration。避免用“大而全”的勾选表代替文字论证。</w:t>
-      </w:r>
-    </w:p>
-    <w:p>
-      <w:r>
-        <w:rPr>
-          <w:rFonts w:ascii="Calibri" w:hAnsi="Calibri" w:eastAsia="PingFang SC"/>
-          <w:b/>
-        </w:rPr>
-        <w:t>Table 2 · Benchmark composition 与 empirical coverage。</w:t>
-      </w:r>
-      <w:r>
-        <w:rPr>
-          <w:rFonts w:ascii="Calibri" w:hAnsi="Calibri" w:eastAsia="PingFang SC"/>
-        </w:rPr>
-        <w:t xml:space="preserve"> 按 task stratum、research intent、deliverable、signal channel、environment、agent mode、anchor 和 stakes 报 family/episode 数、用户对数和 </w:t>
+        <w:t>agent × user-signal condition</w:t>
+      </w:r>
+      <w:r>
+        <w:rPr>
+          <w:rFonts w:ascii="Calibri" w:hAnsi="Calibri" w:eastAsia="PingFang SC"/>
+        </w:rPr>
+        <w:t xml:space="preserve"> heatmap 报 structured persona、natural history、clarification-allowed 和 workspace/history 条件下的 CFA。列标题要区分“直接提供的等价视图”“交互获取”和“环境私有状态”；Cue Gap 与 Worst-view CFA 都只在经过 equivalence audit 的 structured persona 与 natural history 上计算。B 按 S0–S3 绘制各 agent 的 CFA stress response；只有 </w:t>
       </w:r>
       <w:r>
         <w:rPr>
@@ -17964,28 +17981,13 @@
           <w:color w:val="6A3E00"/>
           <w:sz w:val="20"/>
         </w:rPr>
-        <w:t>tested</w:t>
-      </w:r>
-      <w:r>
-        <w:rPr>
-          <w:rFonts w:ascii="Calibri" w:hAnsi="Calibri" w:eastAsia="PingFang SC"/>
-        </w:rPr>
-        <w:t xml:space="preserve"> 覆盖率；另列 defined-only、structurally-inapplicable 和 deferred 数量。它证明实际测了什么，不用 ontology 的理论分支数冒充样本量。</w:t>
-      </w:r>
-    </w:p>
-    <w:p>
-      <w:r>
-        <w:rPr>
-          <w:rFonts w:ascii="Calibri" w:hAnsi="Calibri" w:eastAsia="PingFang SC"/>
-          <w:b/>
-        </w:rPr>
-        <w:t>Table 3 · 主 leaderboard 数值表。</w:t>
-      </w:r>
-      <w:r>
-        <w:rPr>
-          <w:rFonts w:ascii="Calibri" w:hAnsi="Calibri" w:eastAsia="PingFang SC"/>
-        </w:rPr>
-        <w:t xml:space="preserve"> 每行是一个可比的 </w:t>
+        <w:t>CFA_S0 ≥ ε</w:t>
+      </w:r>
+      <w:r>
+        <w:rPr>
+          <w:rFonts w:ascii="Calibri" w:hAnsi="Calibri" w:eastAsia="PingFang SC"/>
+        </w:rPr>
+        <w:t xml:space="preserve"> 时才报告比例型 retention，否则改报 </w:t>
       </w:r>
       <w:r>
         <w:rPr>
@@ -17993,13 +17995,13 @@
           <w:color w:val="6A3E00"/>
           <w:sz w:val="20"/>
         </w:rPr>
-        <w:t>agent × execution regime</w:t>
-      </w:r>
-      <w:r>
-        <w:rPr>
-          <w:rFonts w:ascii="Calibri" w:hAnsi="Calibri" w:eastAsia="PingFang SC"/>
-        </w:rPr>
-        <w:t>，列为 TQ、FR、</w:t>
+        <w:t>CFA_Sk − CFA_S0</w:t>
+      </w:r>
+      <w:r>
+        <w:rPr>
+          <w:rFonts w:ascii="Calibri" w:hAnsi="Calibri" w:eastAsia="PingFang SC"/>
+        </w:rPr>
+        <w:t xml:space="preserve"> 和原始 CFA，避免接近零的分母放大噪声。主文只画跨 anchor 汇总及置信区间，逐 anchor 曲线进入附录。C 对每个 outcome failure 独立报告 eligible episode 发生率和 95% CI；failure 是多标签，不能强行堆叠成互斥的 100% 横条。D 用 </w:t>
       </w:r>
       <w:r>
         <w:rPr>
@@ -18007,13 +18009,13 @@
           <w:color w:val="6A3E00"/>
           <w:sz w:val="20"/>
         </w:rPr>
-        <w:t>PF_matched</w:t>
-      </w:r>
-      <w:r>
-        <w:rPr>
-          <w:rFonts w:ascii="Calibri" w:hAnsi="Calibri" w:eastAsia="PingFang SC"/>
-        </w:rPr>
-        <w:t>、</w:t>
+        <w:t>anchor family × observed outcome failure</w:t>
+      </w:r>
+      <w:r>
+        <w:rPr>
+          <w:rFonts w:ascii="Calibri" w:hAnsi="Calibri" w:eastAsia="PingFang SC"/>
+        </w:rPr>
+        <w:t xml:space="preserve"> heatmap 显示哪类压力更容易触发用户盲、错误用户绑定、过度个性化、共同核心破坏、冲突/过期误用、隐私/权限和澄清失败，并单列 </w:t>
       </w:r>
       <w:r>
         <w:rPr>
@@ -18021,13 +18023,13 @@
           <w:color w:val="6A3E00"/>
           <w:sz w:val="20"/>
         </w:rPr>
-        <w:t>PF_swapped</w:t>
-      </w:r>
-      <w:r>
-        <w:rPr>
-          <w:rFonts w:ascii="Calibri" w:hAnsi="Calibri" w:eastAsia="PingFang SC"/>
-        </w:rPr>
-        <w:t>、MP、CFA、Worst-view CFA、Neutral Invariance、cost 和 eligibility。E1/E2/E3 分块，商业产品榜与受控 harness 榜不混排；报告置信区间或标准误，而不是只报点估计。</w:t>
+        <w:t>other/emergent</w:t>
+      </w:r>
+      <w:r>
+        <w:rPr>
+          <w:rFonts w:ascii="Calibri" w:hAnsi="Calibri" w:eastAsia="PingFang SC"/>
+        </w:rPr>
+        <w:t>。主文不从最终交付物反推内部机制；只有具备可比 trace 的系统，才可在附录报告 acquisition、preservation、use 或 update 的过程证据。</w:t>
       </w:r>
     </w:p>
     <w:p>
@@ -18036,13 +18038,13 @@
           <w:rFonts w:ascii="Calibri" w:hAnsi="Calibri" w:eastAsia="PingFang SC"/>
           <w:b/>
         </w:rPr>
-        <w:t>Table 4 · 关键对照、消融与替代解释。</w:t>
-      </w:r>
-      <w:r>
-        <w:rPr>
-          <w:rFonts w:ascii="Calibri" w:hAnsi="Calibri" w:eastAsia="PingFang SC"/>
-        </w:rPr>
-        <w:t xml:space="preserve"> 行包括 task-only、matched persona、semantic-equivalent history、clarification、irrelevant cue、wrong-user swap、去掉 must-hold/must-not、只按长度/风格匹配和去掉 TQ gate；列为 ΔCFA、Specificity Precision/Recall、Neutral Invariance、TQ/FR、judge coverage 与主要解释。它用于证明结果不是“多给了上下文”“写得更长”或“复述 persona 关键词”。</w:t>
+        <w:t>Figure 5 · 自动评价是否可信：JudgeBench 与人类校准。</w:t>
+      </w:r>
+      <w:r>
+        <w:rPr>
+          <w:rFonts w:ascii="Calibri" w:hAnsi="Calibri" w:eastAsia="PingFang SC"/>
+        </w:rPr>
+        <w:t xml:space="preserve"> 四个 panel：A 按 rubric module 报 judge–human pairwise accuracy/α；B 画预测置信度与实际正确率的 calibration/reliability curve；C 报 A/B 顺序、长度、格式、persona 关键词和隐私诱饵造成的准确率变化；D 画“自动覆盖率—人工成本—错误率”级联曲线，并标出预注册主榜门槛。Judge 未过门槛时，本图应直接支持降级为人评，而不是隐藏失败。</w:t>
       </w:r>
     </w:p>
     <w:p>
@@ -18050,15 +18052,37 @@
         <w:pStyle w:val="Heading2"/>
       </w:pPr>
       <w:r>
-        <w:t>16.3 附录图表与版面规则</w:t>
-      </w:r>
-    </w:p>
-    <w:p>
-      <w:r>
-        <w:rPr>
-          <w:rFonts w:ascii="Calibri" w:hAnsi="Calibri" w:eastAsia="PingFang SC"/>
-        </w:rPr>
-        <w:t xml:space="preserve">附录建议保留：逐 family CFA forest plot、完整 </w:t>
+        <w:t>16.2 主文四张表</w:t>
+      </w:r>
+    </w:p>
+    <w:p>
+      <w:r>
+        <w:rPr>
+          <w:rFonts w:ascii="Calibri" w:hAnsi="Calibri" w:eastAsia="PingFang SC"/>
+          <w:b/>
+        </w:rPr>
+        <w:t>Table 1 · 与最近邻 benchmark 的定位比较。</w:t>
+      </w:r>
+      <w:r>
+        <w:rPr>
+          <w:rFonts w:ascii="Calibri" w:hAnsi="Calibri" w:eastAsia="PingFang SC"/>
+        </w:rPr>
+        <w:t xml:space="preserve"> 行为 PDR-Bench、ResearchRubrics、DeepResearch Bench、PersonaTrail/APeB、PASB 和 DeepAlign；列只保留与主张有关的 task-persona absolute fit、cross-user counterfactual、must-change/hold/not、multi-cue、longitudinal stress、multi-deliverable、human validity 和 judge calibration。避免用“大而全”的勾选表代替文字论证。</w:t>
+      </w:r>
+    </w:p>
+    <w:p>
+      <w:r>
+        <w:rPr>
+          <w:rFonts w:ascii="Calibri" w:hAnsi="Calibri" w:eastAsia="PingFang SC"/>
+          <w:b/>
+        </w:rPr>
+        <w:t>Table 2 · Benchmark composition 与 empirical coverage。</w:t>
+      </w:r>
+      <w:r>
+        <w:rPr>
+          <w:rFonts w:ascii="Calibri" w:hAnsi="Calibri" w:eastAsia="PingFang SC"/>
+        </w:rPr>
+        <w:t xml:space="preserve"> 按 task stratum、research intent、deliverable、signal channel、environment、agent mode、anchor 和 stakes 报 family/episode 数、用户对数和 </w:t>
       </w:r>
       <w:r>
         <w:rPr>
@@ -18066,13 +18090,115 @@
           <w:color w:val="6A3E00"/>
           <w:sz w:val="20"/>
         </w:rPr>
-        <w:t>3 strata × 6 intents × deliverable</w:t>
-      </w:r>
-      <w:r>
-        <w:rPr>
-          <w:rFonts w:ascii="Calibri" w:hAnsi="Calibri" w:eastAsia="PingFang SC"/>
-        </w:rPr>
-        <w:t xml:space="preserve"> coverage heatmap、八个 anchor 的独立 S0–S3 曲线、clarification value/turn、retention/update 曲线、各语言/用户群切片，以及 judge confusion matrix。附录表应给出 24 个 family、48 个 user-task、persona compatibility gate、rubric leaf bank、agent/version/tool metadata、完整结果、成本、失败案例和人工标注一致性。</w:t>
+        <w:t>tested</w:t>
+      </w:r>
+      <w:r>
+        <w:rPr>
+          <w:rFonts w:ascii="Calibri" w:hAnsi="Calibri" w:eastAsia="PingFang SC"/>
+        </w:rPr>
+        <w:t xml:space="preserve"> 覆盖率；另列 defined-only、structurally-inapplicable 和 deferred 数量。它证明实际测了什么，不用 ontology 的理论分支数冒充样本量。</w:t>
+      </w:r>
+    </w:p>
+    <w:p>
+      <w:r>
+        <w:rPr>
+          <w:rFonts w:ascii="Calibri" w:hAnsi="Calibri" w:eastAsia="PingFang SC"/>
+          <w:b/>
+        </w:rPr>
+        <w:t>Table 3 · 主 leaderboard 数值表。</w:t>
+      </w:r>
+      <w:r>
+        <w:rPr>
+          <w:rFonts w:ascii="Calibri" w:hAnsi="Calibri" w:eastAsia="PingFang SC"/>
+        </w:rPr>
+        <w:t xml:space="preserve"> 每行是一个可比的 </w:t>
+      </w:r>
+      <w:r>
+        <w:rPr>
+          <w:rFonts w:ascii="Courier New" w:hAnsi="Courier New" w:eastAsia="PingFang SC"/>
+          <w:color w:val="6A3E00"/>
+          <w:sz w:val="20"/>
+        </w:rPr>
+        <w:t>agent × execution regime</w:t>
+      </w:r>
+      <w:r>
+        <w:rPr>
+          <w:rFonts w:ascii="Calibri" w:hAnsi="Calibri" w:eastAsia="PingFang SC"/>
+        </w:rPr>
+        <w:t>，列为 TQ、FR、</w:t>
+      </w:r>
+      <w:r>
+        <w:rPr>
+          <w:rFonts w:ascii="Courier New" w:hAnsi="Courier New" w:eastAsia="PingFang SC"/>
+          <w:color w:val="6A3E00"/>
+          <w:sz w:val="20"/>
+        </w:rPr>
+        <w:t>PF_matched</w:t>
+      </w:r>
+      <w:r>
+        <w:rPr>
+          <w:rFonts w:ascii="Calibri" w:hAnsi="Calibri" w:eastAsia="PingFang SC"/>
+        </w:rPr>
+        <w:t>、</w:t>
+      </w:r>
+      <w:r>
+        <w:rPr>
+          <w:rFonts w:ascii="Courier New" w:hAnsi="Courier New" w:eastAsia="PingFang SC"/>
+          <w:color w:val="6A3E00"/>
+          <w:sz w:val="20"/>
+        </w:rPr>
+        <w:t>PF_swapped</w:t>
+      </w:r>
+      <w:r>
+        <w:rPr>
+          <w:rFonts w:ascii="Calibri" w:hAnsi="Calibri" w:eastAsia="PingFang SC"/>
+        </w:rPr>
+        <w:t>、MP、CFA、Worst-view CFA、Neutral Invariance、cost 和 eligibility。E1/E2/E3 分块，商业产品榜与受控 harness 榜不混排；报告置信区间或标准误，而不是只报点估计。</w:t>
+      </w:r>
+    </w:p>
+    <w:p>
+      <w:r>
+        <w:rPr>
+          <w:rFonts w:ascii="Calibri" w:hAnsi="Calibri" w:eastAsia="PingFang SC"/>
+          <w:b/>
+        </w:rPr>
+        <w:t>Table 4 · 关键对照、消融与替代解释。</w:t>
+      </w:r>
+      <w:r>
+        <w:rPr>
+          <w:rFonts w:ascii="Calibri" w:hAnsi="Calibri" w:eastAsia="PingFang SC"/>
+        </w:rPr>
+        <w:t xml:space="preserve"> 行包括 task-only、matched persona、semantic-equivalent history、clarification、irrelevant cue、wrong-user swap、去掉 must-hold/must-not、只按长度/风格匹配和去掉 TQ gate；列为 ΔCFA、Specificity Precision/Recall、Neutral Invariance、TQ/FR、judge coverage 与主要解释。它用于证明结果不是“多给了上下文”“写得更长”或“复述 persona 关键词”。</w:t>
+      </w:r>
+    </w:p>
+    <w:p>
+      <w:pPr>
+        <w:pStyle w:val="Heading2"/>
+      </w:pPr>
+      <w:r>
+        <w:t>16.3 附录图表与版面规则</w:t>
+      </w:r>
+    </w:p>
+    <w:p>
+      <w:r>
+        <w:rPr>
+          <w:rFonts w:ascii="Calibri" w:hAnsi="Calibri" w:eastAsia="PingFang SC"/>
+        </w:rPr>
+        <w:t xml:space="preserve">附录建议保留：逐 family CFA forest plot、描述性的完整 </w:t>
+      </w:r>
+      <w:r>
+        <w:rPr>
+          <w:rFonts w:ascii="Courier New" w:hAnsi="Courier New" w:eastAsia="PingFang SC"/>
+          <w:color w:val="6A3E00"/>
+          <w:sz w:val="20"/>
+        </w:rPr>
+        <w:t>3 strata × 6 intents</w:t>
+      </w:r>
+      <w:r>
+        <w:rPr>
+          <w:rFonts w:ascii="Calibri" w:hAnsi="Calibri" w:eastAsia="PingFang SC"/>
+        </w:rPr>
+        <w:t xml:space="preserve"> 交叉格、deliverable coverage heatmap、八个 anchor 的独立 S0–S3 曲线、clarification value/turn、retention/update 曲线、多标签 failure co-occurrence UpSet plot、各语言/用户群切片，以及 judge confusion matrix。附录表应给出 24 个 family、48 个 user-task、persona compatibility gate、rubric leaf bank、agent/version/tool metadata、完整结果、成本、失败案例和人工标注一致性。</w:t>
       </w:r>
     </w:p>
     <w:p>
@@ -18093,7 +18219,7 @@
     </w:p>
     <w:p>
       <w:pPr>
-        <w:spacing w:after="0" w:line="221" w:lineRule="auto"/>
+        <w:spacing w:after="0" w:line="216" w:lineRule="auto"/>
         <w:ind w:left="360" w:hanging="360"/>
       </w:pPr>
       <w:r>
@@ -18124,8 +18250,8 @@
             <w:rFonts w:ascii="Calibri" w:hAnsi="Calibri" w:eastAsia="PingFang SC"/>
             <w:color w:val="2E74B5"/>
             <w:u w:val="single"/>
-            <w:sz w:val="17"/>
-            <w:szCs w:val="17"/>
+            <w:sz w:val="16"/>
+            <w:szCs w:val="16"/>
           </w:rPr>
           <w:t>https://arxiv.org/abs/2605.19276</w:t>
         </w:r>
@@ -18133,7 +18259,7 @@
     </w:p>
     <w:p>
       <w:pPr>
-        <w:spacing w:after="0" w:line="221" w:lineRule="auto"/>
+        <w:spacing w:after="0" w:line="216" w:lineRule="auto"/>
         <w:ind w:left="360" w:hanging="360"/>
       </w:pPr>
       <w:r>
@@ -18164,8 +18290,8 @@
             <w:rFonts w:ascii="Calibri" w:hAnsi="Calibri" w:eastAsia="PingFang SC"/>
             <w:color w:val="2E74B5"/>
             <w:u w:val="single"/>
-            <w:sz w:val="17"/>
-            <w:szCs w:val="17"/>
+            <w:sz w:val="16"/>
+            <w:szCs w:val="16"/>
           </w:rPr>
           <w:t>https://evalscope.readthedocs.io/en/refact_readme/get_started/introduction.html</w:t>
         </w:r>
@@ -18173,7 +18299,7 @@
     </w:p>
     <w:p>
       <w:pPr>
-        <w:spacing w:after="0" w:line="221" w:lineRule="auto"/>
+        <w:spacing w:after="0" w:line="216" w:lineRule="auto"/>
         <w:ind w:left="360" w:hanging="360"/>
       </w:pPr>
       <w:r>
@@ -18204,8 +18330,8 @@
             <w:rFonts w:ascii="Calibri" w:hAnsi="Calibri" w:eastAsia="PingFang SC"/>
             <w:color w:val="2E74B5"/>
             <w:u w:val="single"/>
-            <w:sz w:val="17"/>
-            <w:szCs w:val="17"/>
+            <w:sz w:val="16"/>
+            <w:szCs w:val="16"/>
           </w:rPr>
           <w:t>https://arxiv.org/abs/2412.14470</w:t>
         </w:r>
@@ -18213,7 +18339,7 @@
     </w:p>
     <w:p>
       <w:pPr>
-        <w:spacing w:after="0" w:line="221" w:lineRule="auto"/>
+        <w:spacing w:after="0" w:line="216" w:lineRule="auto"/>
         <w:ind w:left="360" w:hanging="360"/>
       </w:pPr>
       <w:r>
@@ -18244,8 +18370,8 @@
             <w:rFonts w:ascii="Calibri" w:hAnsi="Calibri" w:eastAsia="PingFang SC"/>
             <w:color w:val="2E74B5"/>
             <w:u w:val="single"/>
-            <w:sz w:val="17"/>
-            <w:szCs w:val="17"/>
+            <w:sz w:val="16"/>
+            <w:szCs w:val="16"/>
           </w:rPr>
           <w:t>https://arxiv.org/abs/2509.25106</w:t>
         </w:r>
@@ -18253,7 +18379,7 @@
     </w:p>
     <w:p>
       <w:pPr>
-        <w:spacing w:after="0" w:line="221" w:lineRule="auto"/>
+        <w:spacing w:after="0" w:line="216" w:lineRule="auto"/>
         <w:ind w:left="360" w:hanging="360"/>
       </w:pPr>
       <w:r>
@@ -18284,8 +18410,8 @@
             <w:rFonts w:ascii="Calibri" w:hAnsi="Calibri" w:eastAsia="PingFang SC"/>
             <w:color w:val="2E74B5"/>
             <w:u w:val="single"/>
-            <w:sz w:val="17"/>
-            <w:szCs w:val="17"/>
+            <w:sz w:val="16"/>
+            <w:szCs w:val="16"/>
           </w:rPr>
           <w:t>https://macaron.im/mindlab/research/macaron-v1-preview</w:t>
         </w:r>
@@ -18293,7 +18419,7 @@
     </w:p>
     <w:p>
       <w:pPr>
-        <w:spacing w:after="0" w:line="221" w:lineRule="auto"/>
+        <w:spacing w:after="0" w:line="216" w:lineRule="auto"/>
         <w:ind w:left="360" w:hanging="360"/>
       </w:pPr>
       <w:r>
@@ -18324,8 +18450,8 @@
             <w:rFonts w:ascii="Calibri" w:hAnsi="Calibri" w:eastAsia="PingFang SC"/>
             <w:color w:val="2E74B5"/>
             <w:u w:val="single"/>
-            <w:sz w:val="17"/>
-            <w:szCs w:val="17"/>
+            <w:sz w:val="16"/>
+            <w:szCs w:val="16"/>
           </w:rPr>
           <w:t>https://arxiv.org/abs/2506.11763</w:t>
         </w:r>
@@ -18333,7 +18459,7 @@
     </w:p>
     <w:p>
       <w:pPr>
-        <w:spacing w:after="0" w:line="221" w:lineRule="auto"/>
+        <w:spacing w:after="0" w:line="216" w:lineRule="auto"/>
         <w:ind w:left="360" w:hanging="360"/>
       </w:pPr>
       <w:r>
@@ -18364,8 +18490,8 @@
             <w:rFonts w:ascii="Calibri" w:hAnsi="Calibri" w:eastAsia="PingFang SC"/>
             <w:color w:val="2E74B5"/>
             <w:u w:val="single"/>
-            <w:sz w:val="17"/>
-            <w:szCs w:val="17"/>
+            <w:sz w:val="16"/>
+            <w:szCs w:val="16"/>
           </w:rPr>
           <w:t>https://arxiv.org/abs/2506.21506</w:t>
         </w:r>
@@ -18373,7 +18499,7 @@
     </w:p>
     <w:p>
       <w:pPr>
-        <w:spacing w:after="0" w:line="221" w:lineRule="auto"/>
+        <w:spacing w:after="0" w:line="216" w:lineRule="auto"/>
         <w:ind w:left="360" w:hanging="360"/>
       </w:pPr>
       <w:r>
@@ -18404,8 +18530,8 @@
             <w:rFonts w:ascii="Calibri" w:hAnsi="Calibri" w:eastAsia="PingFang SC"/>
             <w:color w:val="2E74B5"/>
             <w:u w:val="single"/>
-            <w:sz w:val="17"/>
-            <w:szCs w:val="17"/>
+            <w:sz w:val="16"/>
+            <w:szCs w:val="16"/>
           </w:rPr>
           <w:t>https://arxiv.org/abs/2508.06600</w:t>
         </w:r>
@@ -18413,7 +18539,7 @@
     </w:p>
     <w:p>
       <w:pPr>
-        <w:spacing w:after="0" w:line="221" w:lineRule="auto"/>
+        <w:spacing w:after="0" w:line="216" w:lineRule="auto"/>
         <w:ind w:left="360" w:hanging="360"/>
       </w:pPr>
       <w:r>
@@ -18444,8 +18570,8 @@
             <w:rFonts w:ascii="Calibri" w:hAnsi="Calibri" w:eastAsia="PingFang SC"/>
             <w:color w:val="2E74B5"/>
             <w:u w:val="single"/>
-            <w:sz w:val="17"/>
-            <w:szCs w:val="17"/>
+            <w:sz w:val="16"/>
+            <w:szCs w:val="16"/>
           </w:rPr>
           <w:t>https://openai.com/index/paperbench/</w:t>
         </w:r>
@@ -18453,7 +18579,7 @@
     </w:p>
     <w:p>
       <w:pPr>
-        <w:spacing w:after="0" w:line="221" w:lineRule="auto"/>
+        <w:spacing w:after="0" w:line="216" w:lineRule="auto"/>
         <w:ind w:left="360" w:hanging="360"/>
       </w:pPr>
       <w:r>
@@ -18484,8 +18610,8 @@
             <w:rFonts w:ascii="Calibri" w:hAnsi="Calibri" w:eastAsia="PingFang SC"/>
             <w:color w:val="2E74B5"/>
             <w:u w:val="single"/>
-            <w:sz w:val="17"/>
-            <w:szCs w:val="17"/>
+            <w:sz w:val="16"/>
+            <w:szCs w:val="16"/>
           </w:rPr>
           <w:t>https://livedeepresearch.github.io/</w:t>
         </w:r>
@@ -18493,7 +18619,7 @@
     </w:p>
     <w:p>
       <w:pPr>
-        <w:spacing w:after="0" w:line="221" w:lineRule="auto"/>
+        <w:spacing w:after="0" w:line="216" w:lineRule="auto"/>
         <w:ind w:left="360" w:hanging="360"/>
       </w:pPr>
       <w:r>
@@ -18524,8 +18650,8 @@
             <w:rFonts w:ascii="Calibri" w:hAnsi="Calibri" w:eastAsia="PingFang SC"/>
             <w:color w:val="2E74B5"/>
             <w:u w:val="single"/>
-            <w:sz w:val="17"/>
-            <w:szCs w:val="17"/>
+            <w:sz w:val="16"/>
+            <w:szCs w:val="16"/>
           </w:rPr>
           <w:t>https://arxiv.org/abs/2505.19253</w:t>
         </w:r>
@@ -18533,7 +18659,7 @@
     </w:p>
     <w:p>
       <w:pPr>
-        <w:spacing w:after="0" w:line="221" w:lineRule="auto"/>
+        <w:spacing w:after="0" w:line="216" w:lineRule="auto"/>
         <w:ind w:left="360" w:hanging="360"/>
       </w:pPr>
       <w:r>
@@ -18564,8 +18690,8 @@
             <w:rFonts w:ascii="Calibri" w:hAnsi="Calibri" w:eastAsia="PingFang SC"/>
             <w:color w:val="2E74B5"/>
             <w:u w:val="single"/>
-            <w:sz w:val="17"/>
-            <w:szCs w:val="17"/>
+            <w:sz w:val="16"/>
+            <w:szCs w:val="16"/>
           </w:rPr>
           <w:t>https://arxiv.org/abs/2510.00172</w:t>
         </w:r>
@@ -18573,7 +18699,7 @@
     </w:p>
     <w:p>
       <w:pPr>
-        <w:spacing w:after="0" w:line="221" w:lineRule="auto"/>
+        <w:spacing w:after="0" w:line="216" w:lineRule="auto"/>
         <w:ind w:left="360" w:hanging="360"/>
       </w:pPr>
       <w:r>
@@ -18604,8 +18730,8 @@
             <w:rFonts w:ascii="Calibri" w:hAnsi="Calibri" w:eastAsia="PingFang SC"/>
             <w:color w:val="2E74B5"/>
             <w:u w:val="single"/>
-            <w:sz w:val="17"/>
-            <w:szCs w:val="17"/>
+            <w:sz w:val="16"/>
+            <w:szCs w:val="16"/>
           </w:rPr>
           <w:t>https://livebench.ai/</w:t>
         </w:r>
@@ -18613,7 +18739,7 @@
     </w:p>
     <w:p>
       <w:pPr>
-        <w:spacing w:after="0" w:line="221" w:lineRule="auto"/>
+        <w:spacing w:after="0" w:line="216" w:lineRule="auto"/>
         <w:ind w:left="360" w:hanging="360"/>
       </w:pPr>
       <w:r>
@@ -18644,8 +18770,8 @@
             <w:rFonts w:ascii="Calibri" w:hAnsi="Calibri" w:eastAsia="PingFang SC"/>
             <w:color w:val="2E74B5"/>
             <w:u w:val="single"/>
-            <w:sz w:val="17"/>
-            <w:szCs w:val="17"/>
+            <w:sz w:val="16"/>
+            <w:szCs w:val="16"/>
           </w:rPr>
           <w:t>https://arxiv.org/abs/2310.17631</w:t>
         </w:r>
@@ -18653,7 +18779,7 @@
     </w:p>
     <w:p>
       <w:pPr>
-        <w:spacing w:after="0" w:line="221" w:lineRule="auto"/>
+        <w:spacing w:after="0" w:line="216" w:lineRule="auto"/>
         <w:ind w:left="360" w:hanging="360"/>
       </w:pPr>
       <w:r>
@@ -18684,8 +18810,8 @@
             <w:rFonts w:ascii="Calibri" w:hAnsi="Calibri" w:eastAsia="PingFang SC"/>
             <w:color w:val="2E74B5"/>
             <w:u w:val="single"/>
-            <w:sz w:val="17"/>
-            <w:szCs w:val="17"/>
+            <w:sz w:val="16"/>
+            <w:szCs w:val="16"/>
           </w:rPr>
           <w:t>https://arxiv.org/abs/2405.01535</w:t>
         </w:r>
@@ -18693,7 +18819,7 @@
     </w:p>
     <w:p>
       <w:pPr>
-        <w:spacing w:after="0" w:line="221" w:lineRule="auto"/>
+        <w:spacing w:after="0" w:line="216" w:lineRule="auto"/>
         <w:ind w:left="360" w:hanging="360"/>
       </w:pPr>
       <w:r>
@@ -18724,8 +18850,8 @@
             <w:rFonts w:ascii="Calibri" w:hAnsi="Calibri" w:eastAsia="PingFang SC"/>
             <w:color w:val="2E74B5"/>
             <w:u w:val="single"/>
-            <w:sz w:val="17"/>
-            <w:szCs w:val="17"/>
+            <w:sz w:val="16"/>
+            <w:szCs w:val="16"/>
           </w:rPr>
           <w:t>https://arxiv.org/abs/2403.02839</w:t>
         </w:r>
@@ -18733,7 +18859,7 @@
     </w:p>
     <w:p>
       <w:pPr>
-        <w:spacing w:after="0" w:line="221" w:lineRule="auto"/>
+        <w:spacing w:after="0" w:line="216" w:lineRule="auto"/>
         <w:ind w:left="360" w:hanging="360"/>
       </w:pPr>
       <w:r>
@@ -18764,8 +18890,8 @@
             <w:rFonts w:ascii="Calibri" w:hAnsi="Calibri" w:eastAsia="PingFang SC"/>
             <w:color w:val="2E74B5"/>
             <w:u w:val="single"/>
-            <w:sz w:val="17"/>
-            <w:szCs w:val="17"/>
+            <w:sz w:val="16"/>
+            <w:szCs w:val="16"/>
           </w:rPr>
           <w:t>https://arxiv.org/abs/2508.04183</w:t>
         </w:r>
@@ -18773,7 +18899,7 @@
     </w:p>
     <w:p>
       <w:pPr>
-        <w:spacing w:after="0" w:line="221" w:lineRule="auto"/>
+        <w:spacing w:after="0" w:line="216" w:lineRule="auto"/>
         <w:ind w:left="360" w:hanging="360"/>
       </w:pPr>
       <w:r>
@@ -18804,8 +18930,8 @@
             <w:rFonts w:ascii="Calibri" w:hAnsi="Calibri" w:eastAsia="PingFang SC"/>
             <w:color w:val="2E74B5"/>
             <w:u w:val="single"/>
-            <w:sz w:val="17"/>
-            <w:szCs w:val="17"/>
+            <w:sz w:val="16"/>
+            <w:szCs w:val="16"/>
           </w:rPr>
           <w:t>https://arxiv.org/abs/2511.07685</w:t>
         </w:r>
@@ -18813,7 +18939,7 @@
     </w:p>
     <w:p>
       <w:pPr>
-        <w:spacing w:after="0" w:line="221" w:lineRule="auto"/>
+        <w:spacing w:after="0" w:line="216" w:lineRule="auto"/>
         <w:ind w:left="360" w:hanging="360"/>
       </w:pPr>
       <w:r>
@@ -18844,8 +18970,8 @@
             <w:rFonts w:ascii="Calibri" w:hAnsi="Calibri" w:eastAsia="PingFang SC"/>
             <w:color w:val="2E74B5"/>
             <w:u w:val="single"/>
-            <w:sz w:val="17"/>
-            <w:szCs w:val="17"/>
+            <w:sz w:val="16"/>
+            <w:szCs w:val="16"/>
           </w:rPr>
           <w:t>https://arxiv.org/abs/2407.15711</w:t>
         </w:r>
@@ -18853,7 +18979,7 @@
     </w:p>
     <w:p>
       <w:pPr>
-        <w:spacing w:after="0" w:line="221" w:lineRule="auto"/>
+        <w:spacing w:after="0" w:line="216" w:lineRule="auto"/>
         <w:ind w:left="360" w:hanging="360"/>
       </w:pPr>
       <w:r>
@@ -18884,8 +19010,8 @@
             <w:rFonts w:ascii="Calibri" w:hAnsi="Calibri" w:eastAsia="PingFang SC"/>
             <w:color w:val="2E74B5"/>
             <w:u w:val="single"/>
-            <w:sz w:val="17"/>
-            <w:szCs w:val="17"/>
+            <w:sz w:val="16"/>
+            <w:szCs w:val="16"/>
           </w:rPr>
           <w:t>https://arxiv.org/abs/2402.17896</w:t>
         </w:r>
@@ -18893,7 +19019,7 @@
     </w:p>
     <w:p>
       <w:pPr>
-        <w:spacing w:after="0" w:line="221" w:lineRule="auto"/>
+        <w:spacing w:after="0" w:line="216" w:lineRule="auto"/>
         <w:ind w:left="360" w:hanging="360"/>
       </w:pPr>
       <w:r>
@@ -18924,8 +19050,8 @@
             <w:rFonts w:ascii="Calibri" w:hAnsi="Calibri" w:eastAsia="PingFang SC"/>
             <w:color w:val="2E74B5"/>
             <w:u w:val="single"/>
-            <w:sz w:val="17"/>
-            <w:szCs w:val="17"/>
+            <w:sz w:val="16"/>
+            <w:szCs w:val="16"/>
           </w:rPr>
           <w:t>https://arxiv.org/abs/2507.16280</w:t>
         </w:r>
@@ -18933,7 +19059,7 @@
     </w:p>
     <w:p>
       <w:pPr>
-        <w:spacing w:after="0" w:line="221" w:lineRule="auto"/>
+        <w:spacing w:after="0" w:line="216" w:lineRule="auto"/>
         <w:ind w:left="360" w:hanging="360"/>
       </w:pPr>
       <w:r>
@@ -18964,8 +19090,8 @@
             <w:rFonts w:ascii="Calibri" w:hAnsi="Calibri" w:eastAsia="PingFang SC"/>
             <w:color w:val="2E74B5"/>
             <w:u w:val="single"/>
-            <w:sz w:val="17"/>
-            <w:szCs w:val="17"/>
+            <w:sz w:val="16"/>
+            <w:szCs w:val="16"/>
           </w:rPr>
           <w:t>https://arxiv.org/abs/2211.09110</w:t>
         </w:r>
@@ -18973,7 +19099,7 @@
     </w:p>
     <w:p>
       <w:pPr>
-        <w:spacing w:after="0" w:line="221" w:lineRule="auto"/>
+        <w:spacing w:after="0" w:line="216" w:lineRule="auto"/>
         <w:ind w:left="360" w:hanging="360"/>
       </w:pPr>
       <w:r>
@@ -19004,8 +19130,8 @@
             <w:rFonts w:ascii="Calibri" w:hAnsi="Calibri" w:eastAsia="PingFang SC"/>
             <w:color w:val="2E74B5"/>
             <w:u w:val="single"/>
-            <w:sz w:val="17"/>
-            <w:szCs w:val="17"/>
+            <w:sz w:val="16"/>
+            <w:szCs w:val="16"/>
           </w:rPr>
           <w:t>https://aclanthology.org/2020.acl-main.442/</w:t>
         </w:r>
@@ -19013,7 +19139,7 @@
     </w:p>
     <w:p>
       <w:pPr>
-        <w:spacing w:after="0" w:line="221" w:lineRule="auto"/>
+        <w:spacing w:after="0" w:line="216" w:lineRule="auto"/>
         <w:ind w:left="360" w:hanging="360"/>
       </w:pPr>
       <w:r>
@@ -19044,8 +19170,8 @@
             <w:rFonts w:ascii="Calibri" w:hAnsi="Calibri" w:eastAsia="PingFang SC"/>
             <w:color w:val="2E74B5"/>
             <w:u w:val="single"/>
-            <w:sz w:val="17"/>
-            <w:szCs w:val="17"/>
+            <w:sz w:val="16"/>
+            <w:szCs w:val="16"/>
           </w:rPr>
           <w:t>https://arxiv.org/abs/2411.12990</w:t>
         </w:r>
@@ -19053,7 +19179,7 @@
     </w:p>
     <w:p>
       <w:pPr>
-        <w:spacing w:after="0" w:line="221" w:lineRule="auto"/>
+        <w:spacing w:after="0" w:line="216" w:lineRule="auto"/>
         <w:ind w:left="360" w:hanging="360"/>
       </w:pPr>
       <w:r>
@@ -19084,8 +19210,8 @@
             <w:rFonts w:ascii="Calibri" w:hAnsi="Calibri" w:eastAsia="PingFang SC"/>
             <w:color w:val="2E74B5"/>
             <w:u w:val="single"/>
-            <w:sz w:val="17"/>
-            <w:szCs w:val="17"/>
+            <w:sz w:val="16"/>
+            <w:szCs w:val="16"/>
           </w:rPr>
           <w:t>https://papers.neurips.cc/paper_files/paper/2025/hash/76175f4355e2f67cf91be468c8860070-Abstract-Datasets_and_Benchmarks_Track.html</w:t>
         </w:r>
@@ -19093,7 +19219,7 @@
     </w:p>
     <w:p>
       <w:pPr>
-        <w:spacing w:after="0" w:line="221" w:lineRule="auto"/>
+        <w:spacing w:after="0" w:line="216" w:lineRule="auto"/>
         <w:ind w:left="360" w:hanging="360"/>
       </w:pPr>
       <w:r>
@@ -19124,8 +19250,8 @@
             <w:rFonts w:ascii="Calibri" w:hAnsi="Calibri" w:eastAsia="PingFang SC"/>
             <w:color w:val="2E74B5"/>
             <w:u w:val="single"/>
-            <w:sz w:val="17"/>
-            <w:szCs w:val="17"/>
+            <w:sz w:val="16"/>
+            <w:szCs w:val="16"/>
           </w:rPr>
           <w:t>https://arxiv.org/abs/2607.27056</w:t>
         </w:r>
@@ -19133,7 +19259,7 @@
     </w:p>
     <w:p>
       <w:pPr>
-        <w:spacing w:after="0" w:line="221" w:lineRule="auto"/>
+        <w:spacing w:after="0" w:line="216" w:lineRule="auto"/>
         <w:ind w:left="360" w:hanging="360"/>
       </w:pPr>
       <w:r>
@@ -19164,8 +19290,8 @@
             <w:rFonts w:ascii="Calibri" w:hAnsi="Calibri" w:eastAsia="PingFang SC"/>
             <w:color w:val="2E74B5"/>
             <w:u w:val="single"/>
-            <w:sz w:val="17"/>
-            <w:szCs w:val="17"/>
+            <w:sz w:val="16"/>
+            <w:szCs w:val="16"/>
           </w:rPr>
           <w:t>https://arxiv.org/abs/2607.21635</w:t>
         </w:r>
@@ -19173,7 +19299,7 @@
     </w:p>
     <w:p>
       <w:pPr>
-        <w:spacing w:after="0" w:line="221" w:lineRule="auto"/>
+        <w:spacing w:after="0" w:line="216" w:lineRule="auto"/>
         <w:ind w:left="360" w:hanging="360"/>
       </w:pPr>
       <w:r>
@@ -19204,8 +19330,8 @@
             <w:rFonts w:ascii="Calibri" w:hAnsi="Calibri" w:eastAsia="PingFang SC"/>
             <w:color w:val="2E74B5"/>
             <w:u w:val="single"/>
-            <w:sz w:val="17"/>
-            <w:szCs w:val="17"/>
+            <w:sz w:val="16"/>
+            <w:szCs w:val="16"/>
           </w:rPr>
           <w:t>https://arxiv.org/abs/2607.20482</w:t>
         </w:r>
@@ -19213,7 +19339,7 @@
     </w:p>
     <w:p>
       <w:pPr>
-        <w:spacing w:after="0" w:line="221" w:lineRule="auto"/>
+        <w:spacing w:after="0" w:line="216" w:lineRule="auto"/>
         <w:ind w:left="360" w:hanging="360"/>
       </w:pPr>
       <w:r>
@@ -19244,8 +19370,8 @@
             <w:rFonts w:ascii="Calibri" w:hAnsi="Calibri" w:eastAsia="PingFang SC"/>
             <w:color w:val="2E74B5"/>
             <w:u w:val="single"/>
-            <w:sz w:val="17"/>
-            <w:szCs w:val="17"/>
+            <w:sz w:val="16"/>
+            <w:szCs w:val="16"/>
           </w:rPr>
           <w:t>https://arxiv.org/abs/2607.15948</w:t>
         </w:r>
@@ -19253,7 +19379,7 @@
     </w:p>
     <w:p>
       <w:pPr>
-        <w:spacing w:after="0" w:line="221" w:lineRule="auto"/>
+        <w:spacing w:after="0" w:line="216" w:lineRule="auto"/>
         <w:ind w:left="360" w:hanging="360"/>
       </w:pPr>
       <w:r>
@@ -19284,8 +19410,8 @@
             <w:rFonts w:ascii="Calibri" w:hAnsi="Calibri" w:eastAsia="PingFang SC"/>
             <w:color w:val="2E74B5"/>
             <w:u w:val="single"/>
-            <w:sz w:val="17"/>
-            <w:szCs w:val="17"/>
+            <w:sz w:val="16"/>
+            <w:szCs w:val="16"/>
           </w:rPr>
           <w:t>https://arxiv.org/abs/2607.12254</w:t>
         </w:r>
@@ -19293,7 +19419,7 @@
     </w:p>
     <w:p>
       <w:pPr>
-        <w:spacing w:after="0" w:line="221" w:lineRule="auto"/>
+        <w:spacing w:after="0" w:line="216" w:lineRule="auto"/>
         <w:ind w:left="360" w:hanging="360"/>
       </w:pPr>
       <w:r>
@@ -19324,8 +19450,8 @@
             <w:rFonts w:ascii="Calibri" w:hAnsi="Calibri" w:eastAsia="PingFang SC"/>
             <w:color w:val="2E74B5"/>
             <w:u w:val="single"/>
-            <w:sz w:val="17"/>
-            <w:szCs w:val="17"/>
+            <w:sz w:val="16"/>
+            <w:szCs w:val="16"/>
           </w:rPr>
           <w:t>https://arxiv.org/abs/2607.10526</w:t>
         </w:r>
@@ -19333,7 +19459,7 @@
     </w:p>
     <w:p>
       <w:pPr>
-        <w:spacing w:after="0" w:line="221" w:lineRule="auto"/>
+        <w:spacing w:after="0" w:line="216" w:lineRule="auto"/>
         <w:ind w:left="360" w:hanging="360"/>
       </w:pPr>
       <w:r>
@@ -19364,8 +19490,8 @@
             <w:rFonts w:ascii="Calibri" w:hAnsi="Calibri" w:eastAsia="PingFang SC"/>
             <w:color w:val="2E74B5"/>
             <w:u w:val="single"/>
-            <w:sz w:val="17"/>
-            <w:szCs w:val="17"/>
+            <w:sz w:val="16"/>
+            <w:szCs w:val="16"/>
           </w:rPr>
           <w:t>https://arxiv.org/abs/2607.03162</w:t>
         </w:r>
@@ -19373,7 +19499,7 @@
     </w:p>
     <w:p>
       <w:pPr>
-        <w:spacing w:after="0" w:line="221" w:lineRule="auto"/>
+        <w:spacing w:after="0" w:line="216" w:lineRule="auto"/>
         <w:ind w:left="360" w:hanging="360"/>
       </w:pPr>
       <w:r>
@@ -19404,8 +19530,8 @@
             <w:rFonts w:ascii="Calibri" w:hAnsi="Calibri" w:eastAsia="PingFang SC"/>
             <w:color w:val="2E74B5"/>
             <w:u w:val="single"/>
-            <w:sz w:val="17"/>
-            <w:szCs w:val="17"/>
+            <w:sz w:val="16"/>
+            <w:szCs w:val="16"/>
           </w:rPr>
           <w:t>https://aclanthology.org/2024.acl-long.399/</w:t>
         </w:r>
@@ -19413,7 +19539,7 @@
     </w:p>
     <w:p>
       <w:pPr>
-        <w:spacing w:after="0" w:line="221" w:lineRule="auto"/>
+        <w:spacing w:after="0" w:line="216" w:lineRule="auto"/>
         <w:ind w:left="360" w:hanging="360"/>
       </w:pPr>
       <w:r>
@@ -19444,8 +19570,8 @@
             <w:rFonts w:ascii="Calibri" w:hAnsi="Calibri" w:eastAsia="PingFang SC"/>
             <w:color w:val="2E74B5"/>
             <w:u w:val="single"/>
-            <w:sz w:val="17"/>
-            <w:szCs w:val="17"/>
+            <w:sz w:val="16"/>
+            <w:szCs w:val="16"/>
           </w:rPr>
           <w:t>https://aclanthology.org/2024.emnlp-industry.37/</w:t>
         </w:r>
@@ -19453,7 +19579,7 @@
     </w:p>
     <w:p>
       <w:pPr>
-        <w:spacing w:after="0" w:line="221" w:lineRule="auto"/>
+        <w:spacing w:after="0" w:line="216" w:lineRule="auto"/>
         <w:ind w:left="360" w:hanging="360"/>
       </w:pPr>
       <w:r>
@@ -19484,8 +19610,8 @@
             <w:rFonts w:ascii="Calibri" w:hAnsi="Calibri" w:eastAsia="PingFang SC"/>
             <w:color w:val="2E74B5"/>
             <w:u w:val="single"/>
-            <w:sz w:val="17"/>
-            <w:szCs w:val="17"/>
+            <w:sz w:val="16"/>
+            <w:szCs w:val="16"/>
           </w:rPr>
           <w:t>https://aclanthology.org/2025.findings-acl.927/</w:t>
         </w:r>
@@ -19493,7 +19619,7 @@
     </w:p>
     <w:p>
       <w:pPr>
-        <w:spacing w:after="0" w:line="221" w:lineRule="auto"/>
+        <w:spacing w:after="0" w:line="216" w:lineRule="auto"/>
         <w:ind w:left="360" w:hanging="360"/>
       </w:pPr>
       <w:r>
@@ -19524,8 +19650,8 @@
             <w:rFonts w:ascii="Calibri" w:hAnsi="Calibri" w:eastAsia="PingFang SC"/>
             <w:color w:val="2E74B5"/>
             <w:u w:val="single"/>
-            <w:sz w:val="17"/>
-            <w:szCs w:val="17"/>
+            <w:sz w:val="16"/>
+            <w:szCs w:val="16"/>
           </w:rPr>
           <w:t>https://arxiv.org/abs/2504.14225</w:t>
         </w:r>
@@ -19533,7 +19659,7 @@
     </w:p>
     <w:p>
       <w:pPr>
-        <w:spacing w:after="0" w:line="221" w:lineRule="auto"/>
+        <w:spacing w:after="0" w:line="216" w:lineRule="auto"/>
         <w:ind w:left="360" w:hanging="360"/>
       </w:pPr>
       <w:r>
@@ -19564,8 +19690,8 @@
             <w:rFonts w:ascii="Calibri" w:hAnsi="Calibri" w:eastAsia="PingFang SC"/>
             <w:color w:val="2E74B5"/>
             <w:u w:val="single"/>
-            <w:sz w:val="17"/>
-            <w:szCs w:val="17"/>
+            <w:sz w:val="16"/>
+            <w:szCs w:val="16"/>
           </w:rPr>
           <w:t>https://aclanthology.org/2025.acl-long.1064/</w:t>
         </w:r>
@@ -19573,7 +19699,7 @@
     </w:p>
     <w:p>
       <w:pPr>
-        <w:spacing w:after="0" w:line="221" w:lineRule="auto"/>
+        <w:spacing w:after="0" w:line="216" w:lineRule="auto"/>
         <w:ind w:left="360" w:hanging="360"/>
       </w:pPr>
       <w:r>
@@ -19604,8 +19730,8 @@
             <w:rFonts w:ascii="Calibri" w:hAnsi="Calibri" w:eastAsia="PingFang SC"/>
             <w:color w:val="2E74B5"/>
             <w:u w:val="single"/>
-            <w:sz w:val="17"/>
-            <w:szCs w:val="17"/>
+            <w:sz w:val="16"/>
+            <w:szCs w:val="16"/>
           </w:rPr>
           <w:t>https://arxiv.org/abs/2505.13176</w:t>
         </w:r>
@@ -19613,7 +19739,7 @@
     </w:p>
     <w:p>
       <w:pPr>
-        <w:spacing w:after="0" w:line="221" w:lineRule="auto"/>
+        <w:spacing w:after="0" w:line="216" w:lineRule="auto"/>
         <w:ind w:left="360" w:hanging="360"/>
       </w:pPr>
       <w:r>
@@ -19644,8 +19770,8 @@
             <w:rFonts w:ascii="Calibri" w:hAnsi="Calibri" w:eastAsia="PingFang SC"/>
             <w:color w:val="2E74B5"/>
             <w:u w:val="single"/>
-            <w:sz w:val="17"/>
-            <w:szCs w:val="17"/>
+            <w:sz w:val="16"/>
+            <w:szCs w:val="16"/>
           </w:rPr>
           <w:t>https://aclanthology.org/2025.emnlp-main.1711/</w:t>
         </w:r>
@@ -19653,7 +19779,7 @@
     </w:p>
     <w:p>
       <w:pPr>
-        <w:spacing w:after="0" w:line="221" w:lineRule="auto"/>
+        <w:spacing w:after="0" w:line="216" w:lineRule="auto"/>
         <w:ind w:left="360" w:hanging="360"/>
       </w:pPr>
       <w:r>
@@ -19684,8 +19810,8 @@
             <w:rFonts w:ascii="Calibri" w:hAnsi="Calibri" w:eastAsia="PingFang SC"/>
             <w:color w:val="2E74B5"/>
             <w:u w:val="single"/>
-            <w:sz w:val="17"/>
-            <w:szCs w:val="17"/>
+            <w:sz w:val="16"/>
+            <w:szCs w:val="16"/>
           </w:rPr>
           <w:t>https://arxiv.org/abs/2605.10530</w:t>
         </w:r>
@@ -19693,7 +19819,7 @@
     </w:p>
     <w:p>
       <w:pPr>
-        <w:spacing w:after="0" w:line="221" w:lineRule="auto"/>
+        <w:spacing w:after="0" w:line="216" w:lineRule="auto"/>
         <w:ind w:left="360" w:hanging="360"/>
       </w:pPr>
       <w:r>
@@ -19724,8 +19850,8 @@
             <w:rFonts w:ascii="Calibri" w:hAnsi="Calibri" w:eastAsia="PingFang SC"/>
             <w:color w:val="2E74B5"/>
             <w:u w:val="single"/>
-            <w:sz w:val="17"/>
-            <w:szCs w:val="17"/>
+            <w:sz w:val="16"/>
+            <w:szCs w:val="16"/>
           </w:rPr>
           <w:t>https://aclanthology.org/2026.acl-long.723/</w:t>
         </w:r>
@@ -19733,7 +19859,7 @@
     </w:p>
     <w:p>
       <w:pPr>
-        <w:spacing w:after="0" w:line="221" w:lineRule="auto"/>
+        <w:spacing w:after="0" w:line="216" w:lineRule="auto"/>
         <w:ind w:left="360" w:hanging="360"/>
       </w:pPr>
       <w:r>
@@ -19764,8 +19890,8 @@
             <w:rFonts w:ascii="Calibri" w:hAnsi="Calibri" w:eastAsia="PingFang SC"/>
             <w:color w:val="2E74B5"/>
             <w:u w:val="single"/>
-            <w:sz w:val="17"/>
-            <w:szCs w:val="17"/>
+            <w:sz w:val="16"/>
+            <w:szCs w:val="16"/>
           </w:rPr>
           <w:t>https://aclanthology.org/2026.findings-acl.31/</w:t>
         </w:r>
@@ -19773,7 +19899,7 @@
     </w:p>
     <w:p>
       <w:pPr>
-        <w:spacing w:after="0" w:line="221" w:lineRule="auto"/>
+        <w:spacing w:after="0" w:line="216" w:lineRule="auto"/>
         <w:ind w:left="360" w:hanging="360"/>
       </w:pPr>
       <w:r>
@@ -19804,8 +19930,8 @@
             <w:rFonts w:ascii="Calibri" w:hAnsi="Calibri" w:eastAsia="PingFang SC"/>
             <w:color w:val="2E74B5"/>
             <w:u w:val="single"/>
-            <w:sz w:val="17"/>
-            <w:szCs w:val="17"/>
+            <w:sz w:val="16"/>
+            <w:szCs w:val="16"/>
           </w:rPr>
           <w:t>https://arxiv.org/abs/2601.16621</w:t>
         </w:r>
@@ -19813,7 +19939,7 @@
     </w:p>
     <w:p>
       <w:pPr>
-        <w:spacing w:after="0" w:line="221" w:lineRule="auto"/>
+        <w:spacing w:after="0" w:line="216" w:lineRule="auto"/>
         <w:ind w:left="360" w:hanging="360"/>
       </w:pPr>
       <w:r>
@@ -19844,8 +19970,8 @@
             <w:rFonts w:ascii="Calibri" w:hAnsi="Calibri" w:eastAsia="PingFang SC"/>
             <w:color w:val="2E74B5"/>
             <w:u w:val="single"/>
-            <w:sz w:val="17"/>
-            <w:szCs w:val="17"/>
+            <w:sz w:val="16"/>
+            <w:szCs w:val="16"/>
           </w:rPr>
           <w:t>https://arxiv.org/abs/2602.16173</w:t>
         </w:r>
@@ -19853,7 +19979,7 @@
     </w:p>
     <w:p>
       <w:pPr>
-        <w:spacing w:after="0" w:line="221" w:lineRule="auto"/>
+        <w:spacing w:after="0" w:line="216" w:lineRule="auto"/>
         <w:ind w:left="360" w:hanging="360"/>
       </w:pPr>
       <w:r>
@@ -19884,8 +20010,8 @@
             <w:rFonts w:ascii="Calibri" w:hAnsi="Calibri" w:eastAsia="PingFang SC"/>
             <w:color w:val="2E74B5"/>
             <w:u w:val="single"/>
-            <w:sz w:val="17"/>
-            <w:szCs w:val="17"/>
+            <w:sz w:val="16"/>
+            <w:szCs w:val="16"/>
           </w:rPr>
           <w:t>https://arxiv.org/abs/2605.25535</w:t>
         </w:r>
@@ -19893,7 +20019,7 @@
     </w:p>
     <w:p>
       <w:pPr>
-        <w:spacing w:after="0" w:line="221" w:lineRule="auto"/>
+        <w:spacing w:after="0" w:line="216" w:lineRule="auto"/>
         <w:ind w:left="360" w:hanging="360"/>
       </w:pPr>
       <w:r>
@@ -19924,8 +20050,8 @@
             <w:rFonts w:ascii="Calibri" w:hAnsi="Calibri" w:eastAsia="PingFang SC"/>
             <w:color w:val="2E74B5"/>
             <w:u w:val="single"/>
-            <w:sz w:val="17"/>
-            <w:szCs w:val="17"/>
+            <w:sz w:val="16"/>
+            <w:szCs w:val="16"/>
           </w:rPr>
           <w:t>https://aclanthology.org/2026.findings-acl.1337/</w:t>
         </w:r>
@@ -19933,7 +20059,7 @@
     </w:p>
     <w:p>
       <w:pPr>
-        <w:spacing w:after="0" w:line="221" w:lineRule="auto"/>
+        <w:spacing w:after="0" w:line="216" w:lineRule="auto"/>
         <w:ind w:left="360" w:hanging="360"/>
       </w:pPr>
       <w:r>
@@ -19964,8 +20090,8 @@
             <w:rFonts w:ascii="Calibri" w:hAnsi="Calibri" w:eastAsia="PingFang SC"/>
             <w:color w:val="2E74B5"/>
             <w:u w:val="single"/>
-            <w:sz w:val="17"/>
-            <w:szCs w:val="17"/>
+            <w:sz w:val="16"/>
+            <w:szCs w:val="16"/>
           </w:rPr>
           <w:t>https://aclanthology.org/2026.acl-long.1549/</w:t>
         </w:r>
@@ -19973,7 +20099,7 @@
     </w:p>
     <w:p>
       <w:pPr>
-        <w:spacing w:after="0" w:line="221" w:lineRule="auto"/>
+        <w:spacing w:after="0" w:line="216" w:lineRule="auto"/>
         <w:ind w:left="360" w:hanging="360"/>
       </w:pPr>
       <w:r>
@@ -20004,8 +20130,8 @@
             <w:rFonts w:ascii="Calibri" w:hAnsi="Calibri" w:eastAsia="PingFang SC"/>
             <w:color w:val="2E74B5"/>
             <w:u w:val="single"/>
-            <w:sz w:val="17"/>
-            <w:szCs w:val="17"/>
+            <w:sz w:val="16"/>
+            <w:szCs w:val="16"/>
           </w:rPr>
           <w:t>https://aclanthology.org/2026.acl-long.370/</w:t>
         </w:r>
@@ -20013,7 +20139,7 @@
     </w:p>
     <w:p>
       <w:pPr>
-        <w:spacing w:after="0" w:line="221" w:lineRule="auto"/>
+        <w:spacing w:after="0" w:line="216" w:lineRule="auto"/>
         <w:ind w:left="360" w:hanging="360"/>
       </w:pPr>
       <w:r>
@@ -20044,8 +20170,8 @@
             <w:rFonts w:ascii="Calibri" w:hAnsi="Calibri" w:eastAsia="PingFang SC"/>
             <w:color w:val="2E74B5"/>
             <w:u w:val="single"/>
-            <w:sz w:val="17"/>
-            <w:szCs w:val="17"/>
+            <w:sz w:val="16"/>
+            <w:szCs w:val="16"/>
           </w:rPr>
           <w:t>https://aclanthology.org/2026.findings-acl.1676/</w:t>
         </w:r>
@@ -20053,7 +20179,7 @@
     </w:p>
     <w:p>
       <w:pPr>
-        <w:spacing w:after="0" w:line="221" w:lineRule="auto"/>
+        <w:spacing w:after="0" w:line="216" w:lineRule="auto"/>
         <w:ind w:left="360" w:hanging="360"/>
       </w:pPr>
       <w:r>
@@ -20084,8 +20210,8 @@
             <w:rFonts w:ascii="Calibri" w:hAnsi="Calibri" w:eastAsia="PingFang SC"/>
             <w:color w:val="2E74B5"/>
             <w:u w:val="single"/>
-            <w:sz w:val="17"/>
-            <w:szCs w:val="17"/>
+            <w:sz w:val="16"/>
+            <w:szCs w:val="16"/>
           </w:rPr>
           <w:t>https://aclanthology.org/2026.acl-long.1669/</w:t>
         </w:r>
@@ -20093,7 +20219,7 @@
     </w:p>
     <w:p>
       <w:pPr>
-        <w:spacing w:after="0" w:line="221" w:lineRule="auto"/>
+        <w:spacing w:after="0" w:line="216" w:lineRule="auto"/>
         <w:ind w:left="360" w:hanging="360"/>
       </w:pPr>
       <w:r>
@@ -20124,8 +20250,8 @@
             <w:rFonts w:ascii="Calibri" w:hAnsi="Calibri" w:eastAsia="PingFang SC"/>
             <w:color w:val="2E74B5"/>
             <w:u w:val="single"/>
-            <w:sz w:val="17"/>
-            <w:szCs w:val="17"/>
+            <w:sz w:val="16"/>
+            <w:szCs w:val="16"/>
           </w:rPr>
           <w:t>https://aclanthology.org/2026.acl-long.2033/</w:t>
         </w:r>
@@ -20133,7 +20259,7 @@
     </w:p>
     <w:p>
       <w:pPr>
-        <w:spacing w:after="0" w:line="221" w:lineRule="auto"/>
+        <w:spacing w:after="0" w:line="216" w:lineRule="auto"/>
         <w:ind w:left="360" w:hanging="360"/>
       </w:pPr>
       <w:r>
@@ -20164,8 +20290,8 @@
             <w:rFonts w:ascii="Calibri" w:hAnsi="Calibri" w:eastAsia="PingFang SC"/>
             <w:color w:val="2E74B5"/>
             <w:u w:val="single"/>
-            <w:sz w:val="17"/>
-            <w:szCs w:val="17"/>
+            <w:sz w:val="16"/>
+            <w:szCs w:val="16"/>
           </w:rPr>
           <w:t>https://aclanthology.org/2026.acl-long.1260/</w:t>
         </w:r>
@@ -20173,7 +20299,7 @@
     </w:p>
     <w:p>
       <w:pPr>
-        <w:spacing w:after="0" w:line="221" w:lineRule="auto"/>
+        <w:spacing w:after="0" w:line="216" w:lineRule="auto"/>
         <w:ind w:left="360" w:hanging="360"/>
       </w:pPr>
       <w:r>
@@ -20204,8 +20330,8 @@
             <w:rFonts w:ascii="Calibri" w:hAnsi="Calibri" w:eastAsia="PingFang SC"/>
             <w:color w:val="2E74B5"/>
             <w:u w:val="single"/>
-            <w:sz w:val="17"/>
-            <w:szCs w:val="17"/>
+            <w:sz w:val="16"/>
+            <w:szCs w:val="16"/>
           </w:rPr>
           <w:t>https://aclanthology.org/2026.acl-long.2079/</w:t>
         </w:r>
@@ -20213,7 +20339,7 @@
     </w:p>
     <w:p>
       <w:pPr>
-        <w:spacing w:after="0" w:line="221" w:lineRule="auto"/>
+        <w:spacing w:after="0" w:line="216" w:lineRule="auto"/>
         <w:ind w:left="360" w:hanging="360"/>
       </w:pPr>
       <w:r>
@@ -20244,8 +20370,8 @@
             <w:rFonts w:ascii="Calibri" w:hAnsi="Calibri" w:eastAsia="PingFang SC"/>
             <w:color w:val="2E74B5"/>
             <w:u w:val="single"/>
-            <w:sz w:val="17"/>
-            <w:szCs w:val="17"/>
+            <w:sz w:val="16"/>
+            <w:szCs w:val="16"/>
           </w:rPr>
           <w:t>https://arxiv.org/abs/2605.31545</w:t>
         </w:r>

</xml_diff>